<commit_message>
Retirar pregunta A5 y conservar identificación reservada
</commit_message>
<xml_diff>
--- a/documentos/Encuesta_Kimbiri_visual.docx
+++ b/documentos/Encuesta_Kimbiri_visual.docx
@@ -405,112 +405,6 @@
               </w:rPr>
               <w:t>☐ No aplica</w:t>
             </w:r>
-          </w:p>
-        </w:tc>
-      </w:tr>
-    </w:tbl>
-    <w:p>
-      <w:pPr>
-        <w:keepNext/>
-        <w:spacing w:after="60" w:before="0" w:line="240" w:lineRule="auto"/>
-      </w:pPr>
-      <w:r>
-        <w:rPr>
-          <w:b/>
-          <w:sz w:val="17"/>
-        </w:rPr>
-        <w:t>A5. CONTROL PREVIO: ¿Ya respondió esta encuesta final?</w:t>
-      </w:r>
-    </w:p>
-    <w:tbl>
-      <w:tblPr>
-        <w:tblStyle w:val="LightShading-Accent1"/>
-        <w:tblW w:type="auto" w:w="0"/>
-        <w:tblLook w:firstColumn="1" w:firstRow="1" w:lastColumn="0" w:lastRow="0" w:noHBand="0" w:noVBand="1" w:val="04A0"/>
-      </w:tblPr>
-      <w:tblGrid>
-        <w:gridCol w:w="5256"/>
-        <w:gridCol w:w="5256"/>
-      </w:tblGrid>
-      <w:tr>
-        <w:tc>
-          <w:tcPr>
-            <w:tcW w:type="dxa" w:w="5256"/>
-            <w:shd w:fill="F0F6F8"/>
-            <w:tcMar>
-              <w:top w:w="25" w:type="dxa"/>
-              <w:bottom w:w="25" w:type="dxa"/>
-            </w:tcMar>
-          </w:tcPr>
-          <w:p>
-            <w:pPr>
-              <w:spacing w:after="0" w:before="0" w:line="240" w:lineRule="auto"/>
-            </w:pPr>
-            <w:r>
-              <w:rPr>
-                <w:sz w:val="16"/>
-              </w:rPr>
-              <w:t>☐ No: continuar</w:t>
-            </w:r>
-          </w:p>
-        </w:tc>
-        <w:tc>
-          <w:tcPr>
-            <w:tcW w:type="dxa" w:w="5256"/>
-            <w:shd w:fill="F0F6F8"/>
-            <w:tcMar>
-              <w:top w:w="25" w:type="dxa"/>
-              <w:bottom w:w="25" w:type="dxa"/>
-            </w:tcMar>
-          </w:tcPr>
-          <w:p>
-            <w:pPr>
-              <w:spacing w:after="0" w:before="0" w:line="240" w:lineRule="auto"/>
-            </w:pPr>
-            <w:r>
-              <w:rPr>
-                <w:sz w:val="16"/>
-              </w:rPr>
-              <w:t>☐ Sí: FINALIZAR; no contar otra encuesta</w:t>
-            </w:r>
-          </w:p>
-        </w:tc>
-      </w:tr>
-      <w:tr>
-        <w:tc>
-          <w:tcPr>
-            <w:tcW w:type="dxa" w:w="5256"/>
-            <w:shd w:fill="F0F6F8"/>
-            <w:tcMar>
-              <w:top w:w="25" w:type="dxa"/>
-              <w:bottom w:w="25" w:type="dxa"/>
-            </w:tcMar>
-          </w:tcPr>
-          <w:p>
-            <w:pPr>
-              <w:spacing w:after="0" w:before="0" w:line="240" w:lineRule="auto"/>
-            </w:pPr>
-            <w:r>
-              <w:rPr>
-                <w:sz w:val="16"/>
-              </w:rPr>
-              <w:t>☐ No recuerda → verificar si ya fue encuestado antes de continuar.</w:t>
-            </w:r>
-          </w:p>
-        </w:tc>
-        <w:tc>
-          <w:tcPr>
-            <w:tcW w:type="dxa" w:w="5256"/>
-            <w:shd w:fill="F0F6F8"/>
-            <w:tcMar>
-              <w:top w:w="25" w:type="dxa"/>
-              <w:bottom w:w="25" w:type="dxa"/>
-            </w:tcMar>
-          </w:tcPr>
-          <w:p>
-            <w:pPr>
-              <w:spacing w:after="0" w:before="0" w:line="240" w:lineRule="auto"/>
-            </w:pPr>
           </w:p>
         </w:tc>
       </w:tr>

</xml_diff>

<commit_message>
Reducir preguntas y agrupar identificación y lenguas
</commit_message>
<xml_diff>
--- a/documentos/Encuesta_Kimbiri_visual.docx
+++ b/documentos/Encuesta_Kimbiri_visual.docx
@@ -259,77 +259,9 @@
       </w:pPr>
       <w:r>
         <w:rPr>
-          <w:b/>
           <w:sz w:val="17"/>
         </w:rPr>
-        <w:t>A3. La persona responde sobre…</w:t>
-      </w:r>
-    </w:p>
-    <w:tbl>
-      <w:tblPr>
-        <w:tblStyle w:val="LightShading-Accent1"/>
-        <w:tblW w:type="auto" w:w="0"/>
-        <w:tblLook w:firstColumn="1" w:firstRow="1" w:lastColumn="0" w:lastRow="0" w:noHBand="0" w:noVBand="1" w:val="04A0"/>
-      </w:tblPr>
-      <w:tblGrid>
-        <w:gridCol w:w="5256"/>
-        <w:gridCol w:w="5256"/>
-      </w:tblGrid>
-      <w:tr>
-        <w:tc>
-          <w:tcPr>
-            <w:tcW w:type="dxa" w:w="5256"/>
-            <w:shd w:fill="F0F6F8"/>
-            <w:tcMar>
-              <w:top w:w="25" w:type="dxa"/>
-              <w:bottom w:w="25" w:type="dxa"/>
-            </w:tcMar>
-          </w:tcPr>
-          <w:p>
-            <w:pPr>
-              <w:spacing w:after="0" w:before="0" w:line="240" w:lineRule="auto"/>
-            </w:pPr>
-            <w:r>
-              <w:rPr>
-                <w:sz w:val="16"/>
-              </w:rPr>
-              <w:t>☐ Su propia atención o necesidad</w:t>
-            </w:r>
-          </w:p>
-        </w:tc>
-        <w:tc>
-          <w:tcPr>
-            <w:tcW w:type="dxa" w:w="5256"/>
-            <w:shd w:fill="F0F6F8"/>
-            <w:tcMar>
-              <w:top w:w="25" w:type="dxa"/>
-              <w:bottom w:w="25" w:type="dxa"/>
-            </w:tcMar>
-          </w:tcPr>
-          <w:p>
-            <w:pPr>
-              <w:spacing w:after="0" w:before="0" w:line="240" w:lineRule="auto"/>
-            </w:pPr>
-            <w:r>
-              <w:rPr>
-                <w:sz w:val="16"/>
-              </w:rPr>
-              <w:t>☐ La atención o necesidad de una persona a su cargo</w:t>
-            </w:r>
-          </w:p>
-        </w:tc>
-      </w:tr>
-    </w:tbl>
-    <w:p>
-      <w:pPr>
-        <w:keepNext/>
-        <w:spacing w:after="60" w:before="0" w:line="240" w:lineRule="auto"/>
-      </w:pPr>
-      <w:r>
-        <w:rPr>
-          <w:sz w:val="17"/>
-        </w:rPr>
-        <w:t>A4. Solo si responde por otra persona: ¿la persona a su cargo es menor o adulta? Si responde por sí mismo/a, marque «No aplica» y continúe.</w:t>
+        <w:t>A3. La persona entrevistada responde sobre…</w:t>
       </w:r>
     </w:p>
     <w:tbl>
@@ -361,7 +293,7 @@
               <w:rPr>
                 <w:sz w:val="16"/>
               </w:rPr>
-              <w:t>☐ Menor de 18 años</w:t>
+              <w:t>☐ Su propia atención o necesidad</w:t>
             </w:r>
           </w:p>
         </w:tc>
@@ -382,7 +314,7 @@
               <w:rPr>
                 <w:sz w:val="16"/>
               </w:rPr>
-              <w:t>☐ Persona adulta</w:t>
+              <w:t>☐ Como responsable de un menor de 18 años</w:t>
             </w:r>
           </w:p>
         </w:tc>
@@ -403,7 +335,7 @@
               <w:rPr>
                 <w:sz w:val="16"/>
               </w:rPr>
-              <w:t>☐ No aplica</w:t>
+              <w:t>☐ Como responsable de una persona adulta</w:t>
             </w:r>
           </w:p>
         </w:tc>
@@ -1108,10 +1040,9 @@
       </w:pPr>
       <w:r>
         <w:rPr>
-          <w:b/>
           <w:sz w:val="17"/>
         </w:rPr>
-        <w:t>B5. ¿Cuál es su lengua materna?</w:t>
+        <w:t>B5/B6. Lenguas: marque UNA casilla en cada columna.</w:t>
       </w:r>
     </w:p>
     <w:tbl>
@@ -1143,7 +1074,7 @@
               <w:rPr>
                 <w:sz w:val="16"/>
               </w:rPr>
-              <w:t>☐ Castellano</w:t>
+              <w:t>Lengua</w:t>
             </w:r>
           </w:p>
         </w:tc>
@@ -1164,7 +1095,7 @@
               <w:rPr>
                 <w:sz w:val="16"/>
               </w:rPr>
-              <w:t>☐ Quechua</w:t>
+              <w:t>Lengua materna</w:t>
             </w:r>
           </w:p>
         </w:tc>
@@ -1185,7 +1116,7 @@
               <w:rPr>
                 <w:sz w:val="16"/>
               </w:rPr>
-              <w:t>☐ Asháninka</w:t>
+              <w:t>Prefiere la entrevista en…</w:t>
             </w:r>
           </w:p>
         </w:tc>
@@ -1208,7 +1139,7 @@
               <w:rPr>
                 <w:sz w:val="16"/>
               </w:rPr>
-              <w:t>☐ Matsigenka / machiguenga</w:t>
+              <w:t>Castellano</w:t>
             </w:r>
           </w:p>
         </w:tc>
@@ -1229,7 +1160,7 @@
               <w:rPr>
                 <w:sz w:val="16"/>
               </w:rPr>
-              <w:t>☐ Otra</w:t>
+              <w:t>☐</w:t>
             </w:r>
           </w:p>
         </w:tc>
@@ -1250,36 +1181,11 @@
               <w:rPr>
                 <w:sz w:val="16"/>
               </w:rPr>
-              <w:t>☐ Prefiere no responder</w:t>
+              <w:t>☐</w:t>
             </w:r>
           </w:p>
         </w:tc>
       </w:tr>
-    </w:tbl>
-    <w:p>
-      <w:pPr>
-        <w:keepNext/>
-        <w:spacing w:after="60" w:before="0" w:line="240" w:lineRule="auto"/>
-      </w:pPr>
-      <w:r>
-        <w:rPr>
-          <w:b/>
-          <w:sz w:val="17"/>
-        </w:rPr>
-        <w:t>B6. ¿En qué lengua prefiere responder?</w:t>
-      </w:r>
-    </w:p>
-    <w:tbl>
-      <w:tblPr>
-        <w:tblStyle w:val="LightShading-Accent1"/>
-        <w:tblW w:type="auto" w:w="0"/>
-        <w:tblLook w:firstColumn="1" w:firstRow="1" w:lastColumn="0" w:lastRow="0" w:noHBand="0" w:noVBand="1" w:val="04A0"/>
-      </w:tblPr>
-      <w:tblGrid>
-        <w:gridCol w:w="3504"/>
-        <w:gridCol w:w="3504"/>
-        <w:gridCol w:w="3504"/>
-      </w:tblGrid>
       <w:tr>
         <w:tc>
           <w:tcPr>
@@ -1298,7 +1204,7 @@
               <w:rPr>
                 <w:sz w:val="16"/>
               </w:rPr>
-              <w:t>☐ Castellano</w:t>
+              <w:t>Quechua</w:t>
             </w:r>
           </w:p>
         </w:tc>
@@ -1319,7 +1225,7 @@
               <w:rPr>
                 <w:sz w:val="16"/>
               </w:rPr>
-              <w:t>☐ Quechua</w:t>
+              <w:t>☐</w:t>
             </w:r>
           </w:p>
         </w:tc>
@@ -1340,7 +1246,7 @@
               <w:rPr>
                 <w:sz w:val="16"/>
               </w:rPr>
-              <w:t>☐ Asháninka</w:t>
+              <w:t>☐</w:t>
             </w:r>
           </w:p>
         </w:tc>
@@ -1363,7 +1269,7 @@
               <w:rPr>
                 <w:sz w:val="16"/>
               </w:rPr>
-              <w:t>☐ Matsigenka / machiguenga</w:t>
+              <w:t>Asháninka</w:t>
             </w:r>
           </w:p>
         </w:tc>
@@ -1384,7 +1290,7 @@
               <w:rPr>
                 <w:sz w:val="16"/>
               </w:rPr>
-              <w:t>☐ Otra: __________</w:t>
+              <w:t>☐</w:t>
             </w:r>
           </w:p>
         </w:tc>
@@ -1401,6 +1307,207 @@
             <w:pPr>
               <w:spacing w:after="0" w:before="0" w:line="240" w:lineRule="auto"/>
             </w:pPr>
+            <w:r>
+              <w:rPr>
+                <w:sz w:val="16"/>
+              </w:rPr>
+              <w:t>☐</w:t>
+            </w:r>
+          </w:p>
+        </w:tc>
+      </w:tr>
+      <w:tr>
+        <w:tc>
+          <w:tcPr>
+            <w:tcW w:type="dxa" w:w="3504"/>
+            <w:shd w:fill="F0F6F8"/>
+            <w:tcMar>
+              <w:top w:w="25" w:type="dxa"/>
+              <w:bottom w:w="25" w:type="dxa"/>
+            </w:tcMar>
+          </w:tcPr>
+          <w:p>
+            <w:pPr>
+              <w:spacing w:after="0" w:before="0" w:line="240" w:lineRule="auto"/>
+            </w:pPr>
+            <w:r>
+              <w:rPr>
+                <w:sz w:val="16"/>
+              </w:rPr>
+              <w:t>Matsigenka / machiguenga</w:t>
+            </w:r>
+          </w:p>
+        </w:tc>
+        <w:tc>
+          <w:tcPr>
+            <w:tcW w:type="dxa" w:w="3504"/>
+            <w:shd w:fill="F0F6F8"/>
+            <w:tcMar>
+              <w:top w:w="25" w:type="dxa"/>
+              <w:bottom w:w="25" w:type="dxa"/>
+            </w:tcMar>
+          </w:tcPr>
+          <w:p>
+            <w:pPr>
+              <w:spacing w:after="0" w:before="0" w:line="240" w:lineRule="auto"/>
+            </w:pPr>
+            <w:r>
+              <w:rPr>
+                <w:sz w:val="16"/>
+              </w:rPr>
+              <w:t>☐</w:t>
+            </w:r>
+          </w:p>
+        </w:tc>
+        <w:tc>
+          <w:tcPr>
+            <w:tcW w:type="dxa" w:w="3504"/>
+            <w:shd w:fill="F0F6F8"/>
+            <w:tcMar>
+              <w:top w:w="25" w:type="dxa"/>
+              <w:bottom w:w="25" w:type="dxa"/>
+            </w:tcMar>
+          </w:tcPr>
+          <w:p>
+            <w:pPr>
+              <w:spacing w:after="0" w:before="0" w:line="240" w:lineRule="auto"/>
+            </w:pPr>
+            <w:r>
+              <w:rPr>
+                <w:sz w:val="16"/>
+              </w:rPr>
+              <w:t>☐</w:t>
+            </w:r>
+          </w:p>
+        </w:tc>
+      </w:tr>
+      <w:tr>
+        <w:tc>
+          <w:tcPr>
+            <w:tcW w:type="dxa" w:w="3504"/>
+            <w:shd w:fill="F0F6F8"/>
+            <w:tcMar>
+              <w:top w:w="25" w:type="dxa"/>
+              <w:bottom w:w="25" w:type="dxa"/>
+            </w:tcMar>
+          </w:tcPr>
+          <w:p>
+            <w:pPr>
+              <w:spacing w:after="0" w:before="0" w:line="240" w:lineRule="auto"/>
+            </w:pPr>
+            <w:r>
+              <w:rPr>
+                <w:sz w:val="16"/>
+              </w:rPr>
+              <w:t>Otra: __________________</w:t>
+            </w:r>
+          </w:p>
+        </w:tc>
+        <w:tc>
+          <w:tcPr>
+            <w:tcW w:type="dxa" w:w="3504"/>
+            <w:shd w:fill="F0F6F8"/>
+            <w:tcMar>
+              <w:top w:w="25" w:type="dxa"/>
+              <w:bottom w:w="25" w:type="dxa"/>
+            </w:tcMar>
+          </w:tcPr>
+          <w:p>
+            <w:pPr>
+              <w:spacing w:after="0" w:before="0" w:line="240" w:lineRule="auto"/>
+            </w:pPr>
+            <w:r>
+              <w:rPr>
+                <w:sz w:val="16"/>
+              </w:rPr>
+              <w:t>☐</w:t>
+            </w:r>
+          </w:p>
+        </w:tc>
+        <w:tc>
+          <w:tcPr>
+            <w:tcW w:type="dxa" w:w="3504"/>
+            <w:shd w:fill="F0F6F8"/>
+            <w:tcMar>
+              <w:top w:w="25" w:type="dxa"/>
+              <w:bottom w:w="25" w:type="dxa"/>
+            </w:tcMar>
+          </w:tcPr>
+          <w:p>
+            <w:pPr>
+              <w:spacing w:after="0" w:before="0" w:line="240" w:lineRule="auto"/>
+            </w:pPr>
+            <w:r>
+              <w:rPr>
+                <w:sz w:val="16"/>
+              </w:rPr>
+              <w:t>☐</w:t>
+            </w:r>
+          </w:p>
+        </w:tc>
+      </w:tr>
+      <w:tr>
+        <w:tc>
+          <w:tcPr>
+            <w:tcW w:type="dxa" w:w="3504"/>
+            <w:shd w:fill="F0F6F8"/>
+            <w:tcMar>
+              <w:top w:w="25" w:type="dxa"/>
+              <w:bottom w:w="25" w:type="dxa"/>
+            </w:tcMar>
+          </w:tcPr>
+          <w:p>
+            <w:pPr>
+              <w:spacing w:after="0" w:before="0" w:line="240" w:lineRule="auto"/>
+            </w:pPr>
+            <w:r>
+              <w:rPr>
+                <w:sz w:val="16"/>
+              </w:rPr>
+              <w:t>Prefiere no responder</w:t>
+            </w:r>
+          </w:p>
+        </w:tc>
+        <w:tc>
+          <w:tcPr>
+            <w:tcW w:type="dxa" w:w="3504"/>
+            <w:shd w:fill="F0F6F8"/>
+            <w:tcMar>
+              <w:top w:w="25" w:type="dxa"/>
+              <w:bottom w:w="25" w:type="dxa"/>
+            </w:tcMar>
+          </w:tcPr>
+          <w:p>
+            <w:pPr>
+              <w:spacing w:after="0" w:before="0" w:line="240" w:lineRule="auto"/>
+            </w:pPr>
+            <w:r>
+              <w:rPr>
+                <w:sz w:val="16"/>
+              </w:rPr>
+              <w:t>☐</w:t>
+            </w:r>
+          </w:p>
+        </w:tc>
+        <w:tc>
+          <w:tcPr>
+            <w:tcW w:type="dxa" w:w="3504"/>
+            <w:shd w:fill="F0F6F8"/>
+            <w:tcMar>
+              <w:top w:w="25" w:type="dxa"/>
+              <w:bottom w:w="25" w:type="dxa"/>
+            </w:tcMar>
+          </w:tcPr>
+          <w:p>
+            <w:pPr>
+              <w:spacing w:after="0" w:before="0" w:line="240" w:lineRule="auto"/>
+            </w:pPr>
+            <w:r>
+              <w:rPr>
+                <w:sz w:val="16"/>
+              </w:rPr>
+              <w:t>☐</w:t>
+            </w:r>
           </w:p>
         </w:tc>
       </w:tr>
@@ -3784,149 +3891,6 @@
           <w:b/>
           <w:sz w:val="17"/>
         </w:rPr>
-        <w:t>E1. ¿Cuándo fue la última atención?</w:t>
-      </w:r>
-    </w:p>
-    <w:tbl>
-      <w:tblPr>
-        <w:tblStyle w:val="LightShading-Accent1"/>
-        <w:tblW w:type="auto" w:w="0"/>
-        <w:tblLook w:firstColumn="1" w:firstRow="1" w:lastColumn="0" w:lastRow="0" w:noHBand="0" w:noVBand="1" w:val="04A0"/>
-      </w:tblPr>
-      <w:tblGrid>
-        <w:gridCol w:w="3504"/>
-        <w:gridCol w:w="3504"/>
-        <w:gridCol w:w="3504"/>
-      </w:tblGrid>
-      <w:tr>
-        <w:tc>
-          <w:tcPr>
-            <w:tcW w:type="dxa" w:w="3504"/>
-            <w:shd w:fill="F0F6F8"/>
-            <w:tcMar>
-              <w:top w:w="25" w:type="dxa"/>
-              <w:bottom w:w="25" w:type="dxa"/>
-            </w:tcMar>
-          </w:tcPr>
-          <w:p>
-            <w:pPr>
-              <w:spacing w:after="0" w:before="0" w:line="240" w:lineRule="auto"/>
-            </w:pPr>
-            <w:r>
-              <w:rPr>
-                <w:sz w:val="16"/>
-              </w:rPr>
-              <w:t>☐ Hace menos de 1 mes</w:t>
-            </w:r>
-          </w:p>
-        </w:tc>
-        <w:tc>
-          <w:tcPr>
-            <w:tcW w:type="dxa" w:w="3504"/>
-            <w:shd w:fill="F0F6F8"/>
-            <w:tcMar>
-              <w:top w:w="25" w:type="dxa"/>
-              <w:bottom w:w="25" w:type="dxa"/>
-            </w:tcMar>
-          </w:tcPr>
-          <w:p>
-            <w:pPr>
-              <w:spacing w:after="0" w:before="0" w:line="240" w:lineRule="auto"/>
-            </w:pPr>
-            <w:r>
-              <w:rPr>
-                <w:sz w:val="16"/>
-              </w:rPr>
-              <w:t>☐ De 1 a menos de 3 meses</w:t>
-            </w:r>
-          </w:p>
-        </w:tc>
-        <w:tc>
-          <w:tcPr>
-            <w:tcW w:type="dxa" w:w="3504"/>
-            <w:shd w:fill="F0F6F8"/>
-            <w:tcMar>
-              <w:top w:w="25" w:type="dxa"/>
-              <w:bottom w:w="25" w:type="dxa"/>
-            </w:tcMar>
-          </w:tcPr>
-          <w:p>
-            <w:pPr>
-              <w:spacing w:after="0" w:before="0" w:line="240" w:lineRule="auto"/>
-            </w:pPr>
-            <w:r>
-              <w:rPr>
-                <w:sz w:val="16"/>
-              </w:rPr>
-              <w:t>☐ De 3 a 6 meses</w:t>
-            </w:r>
-          </w:p>
-        </w:tc>
-      </w:tr>
-      <w:tr>
-        <w:tc>
-          <w:tcPr>
-            <w:tcW w:type="dxa" w:w="3504"/>
-            <w:shd w:fill="F0F6F8"/>
-            <w:tcMar>
-              <w:top w:w="25" w:type="dxa"/>
-              <w:bottom w:w="25" w:type="dxa"/>
-            </w:tcMar>
-          </w:tcPr>
-          <w:p>
-            <w:pPr>
-              <w:spacing w:after="0" w:before="0" w:line="240" w:lineRule="auto"/>
-            </w:pPr>
-            <w:r>
-              <w:rPr>
-                <w:sz w:val="16"/>
-              </w:rPr>
-              <w:t>☐ No recuerda</w:t>
-            </w:r>
-          </w:p>
-        </w:tc>
-        <w:tc>
-          <w:tcPr>
-            <w:tcW w:type="dxa" w:w="3504"/>
-            <w:shd w:fill="F0F6F8"/>
-            <w:tcMar>
-              <w:top w:w="25" w:type="dxa"/>
-              <w:bottom w:w="25" w:type="dxa"/>
-            </w:tcMar>
-          </w:tcPr>
-          <w:p>
-            <w:pPr>
-              <w:spacing w:after="0" w:before="0" w:line="240" w:lineRule="auto"/>
-            </w:pPr>
-          </w:p>
-        </w:tc>
-        <w:tc>
-          <w:tcPr>
-            <w:tcW w:type="dxa" w:w="3504"/>
-            <w:shd w:fill="F0F6F8"/>
-            <w:tcMar>
-              <w:top w:w="25" w:type="dxa"/>
-              <w:bottom w:w="25" w:type="dxa"/>
-            </w:tcMar>
-          </w:tcPr>
-          <w:p>
-            <w:pPr>
-              <w:spacing w:after="0" w:before="0" w:line="240" w:lineRule="auto"/>
-            </w:pPr>
-          </w:p>
-        </w:tc>
-      </w:tr>
-    </w:tbl>
-    <w:p>
-      <w:pPr>
-        <w:keepNext/>
-        <w:spacing w:after="60" w:before="0" w:line="240" w:lineRule="auto"/>
-      </w:pPr>
-      <w:r>
-        <w:rPr>
-          <w:b/>
-          <w:sz w:val="17"/>
-        </w:rPr>
         <w:t>E2. ¿Cómo recibió esa última atención?</w:t>
       </w:r>
     </w:p>
@@ -7351,299 +7315,6 @@
         <w:tc>
           <w:tcPr>
             <w:tcW w:type="dxa" w:w="3504"/>
-            <w:shd w:fill="F0F6F8"/>
-            <w:tcMar>
-              <w:top w:w="25" w:type="dxa"/>
-              <w:bottom w:w="25" w:type="dxa"/>
-            </w:tcMar>
-          </w:tcPr>
-          <w:p>
-            <w:pPr>
-              <w:spacing w:after="0" w:before="0" w:line="240" w:lineRule="auto"/>
-            </w:pPr>
-          </w:p>
-        </w:tc>
-      </w:tr>
-    </w:tbl>
-    <w:p>
-      <w:pPr>
-        <w:keepNext/>
-        <w:spacing w:after="60" w:before="0" w:line="240" w:lineRule="auto"/>
-      </w:pPr>
-      <w:r>
-        <w:rPr>
-          <w:b/>
-          <w:sz w:val="17"/>
-        </w:rPr>
-        <w:t>E24. ¿Confía en los programas sociales?</w:t>
-      </w:r>
-    </w:p>
-    <w:tbl>
-      <w:tblPr>
-        <w:tblStyle w:val="LightShading-Accent1"/>
-        <w:tblW w:type="auto" w:w="0"/>
-        <w:tblLook w:firstColumn="1" w:firstRow="1" w:lastColumn="0" w:lastRow="0" w:noHBand="0" w:noVBand="1" w:val="04A0"/>
-      </w:tblPr>
-      <w:tblGrid>
-        <w:gridCol w:w="3504"/>
-        <w:gridCol w:w="3504"/>
-        <w:gridCol w:w="3504"/>
-      </w:tblGrid>
-      <w:tr>
-        <w:tc>
-          <w:tcPr>
-            <w:tcW w:type="dxa" w:w="3504"/>
-            <w:shd w:fill="F0F6F8"/>
-            <w:tcMar>
-              <w:top w:w="25" w:type="dxa"/>
-              <w:bottom w:w="25" w:type="dxa"/>
-            </w:tcMar>
-          </w:tcPr>
-          <w:p>
-            <w:pPr>
-              <w:spacing w:after="0" w:before="0" w:line="240" w:lineRule="auto"/>
-            </w:pPr>
-            <w:r>
-              <w:rPr>
-                <w:sz w:val="16"/>
-              </w:rPr>
-              <w:t>☐ Sí</w:t>
-            </w:r>
-          </w:p>
-        </w:tc>
-        <w:tc>
-          <w:tcPr>
-            <w:tcW w:type="dxa" w:w="3504"/>
-            <w:shd w:fill="F0F6F8"/>
-            <w:tcMar>
-              <w:top w:w="25" w:type="dxa"/>
-              <w:bottom w:w="25" w:type="dxa"/>
-            </w:tcMar>
-          </w:tcPr>
-          <w:p>
-            <w:pPr>
-              <w:spacing w:after="0" w:before="0" w:line="240" w:lineRule="auto"/>
-            </w:pPr>
-            <w:r>
-              <w:rPr>
-                <w:sz w:val="16"/>
-              </w:rPr>
-              <w:t>☐ No</w:t>
-            </w:r>
-          </w:p>
-        </w:tc>
-        <w:tc>
-          <w:tcPr>
-            <w:tcW w:type="dxa" w:w="3504"/>
-            <w:shd w:fill="F0F6F8"/>
-            <w:tcMar>
-              <w:top w:w="25" w:type="dxa"/>
-              <w:bottom w:w="25" w:type="dxa"/>
-            </w:tcMar>
-          </w:tcPr>
-          <w:p>
-            <w:pPr>
-              <w:spacing w:after="0" w:before="0" w:line="240" w:lineRule="auto"/>
-            </w:pPr>
-            <w:r>
-              <w:rPr>
-                <w:sz w:val="16"/>
-              </w:rPr>
-              <w:t>☐ No sabe</w:t>
-            </w:r>
-          </w:p>
-        </w:tc>
-      </w:tr>
-      <w:tr>
-        <w:tc>
-          <w:tcPr>
-            <w:tcW w:type="dxa" w:w="3504"/>
-            <w:shd w:fill="F0F6F8"/>
-            <w:tcMar>
-              <w:top w:w="25" w:type="dxa"/>
-              <w:bottom w:w="25" w:type="dxa"/>
-            </w:tcMar>
-          </w:tcPr>
-          <w:p>
-            <w:pPr>
-              <w:spacing w:after="0" w:before="0" w:line="240" w:lineRule="auto"/>
-            </w:pPr>
-            <w:r>
-              <w:rPr>
-                <w:sz w:val="16"/>
-              </w:rPr>
-              <w:t>☐ Prefiere no responder</w:t>
-            </w:r>
-          </w:p>
-        </w:tc>
-        <w:tc>
-          <w:tcPr>
-            <w:tcW w:type="dxa" w:w="3504"/>
-            <w:shd w:fill="F0F6F8"/>
-            <w:tcMar>
-              <w:top w:w="25" w:type="dxa"/>
-              <w:bottom w:w="25" w:type="dxa"/>
-            </w:tcMar>
-          </w:tcPr>
-          <w:p>
-            <w:pPr>
-              <w:spacing w:after="0" w:before="0" w:line="240" w:lineRule="auto"/>
-            </w:pPr>
-          </w:p>
-        </w:tc>
-        <w:tc>
-          <w:tcPr>
-            <w:tcW w:type="dxa" w:w="3504"/>
-            <w:shd w:fill="F0F6F8"/>
-            <w:tcMar>
-              <w:top w:w="25" w:type="dxa"/>
-              <w:bottom w:w="25" w:type="dxa"/>
-            </w:tcMar>
-          </w:tcPr>
-          <w:p>
-            <w:pPr>
-              <w:spacing w:after="0" w:before="0" w:line="240" w:lineRule="auto"/>
-            </w:pPr>
-          </w:p>
-        </w:tc>
-      </w:tr>
-    </w:tbl>
-    <w:p>
-      <w:pPr>
-        <w:keepNext/>
-        <w:spacing w:after="60" w:before="0" w:line="240" w:lineRule="auto"/>
-      </w:pPr>
-      <w:r>
-        <w:rPr>
-          <w:b/>
-          <w:sz w:val="17"/>
-        </w:rPr>
-        <w:t>E25. Comparando con hace aproximadamente 6 meses, la atención de este mismo servicio está…</w:t>
-      </w:r>
-    </w:p>
-    <w:tbl>
-      <w:tblPr>
-        <w:tblStyle w:val="LightShading-Accent1"/>
-        <w:tblW w:type="auto" w:w="0"/>
-        <w:tblLook w:firstColumn="1" w:firstRow="1" w:lastColumn="0" w:lastRow="0" w:noHBand="0" w:noVBand="1" w:val="04A0"/>
-      </w:tblPr>
-      <w:tblGrid>
-        <w:gridCol w:w="5256"/>
-        <w:gridCol w:w="5256"/>
-      </w:tblGrid>
-      <w:tr>
-        <w:tc>
-          <w:tcPr>
-            <w:tcW w:type="dxa" w:w="5256"/>
-            <w:shd w:fill="F0F6F8"/>
-            <w:tcMar>
-              <w:top w:w="25" w:type="dxa"/>
-              <w:bottom w:w="25" w:type="dxa"/>
-            </w:tcMar>
-          </w:tcPr>
-          <w:p>
-            <w:pPr>
-              <w:spacing w:after="0" w:before="0" w:line="240" w:lineRule="auto"/>
-            </w:pPr>
-            <w:r>
-              <w:rPr>
-                <w:sz w:val="16"/>
-              </w:rPr>
-              <w:t>☐ Mejor</w:t>
-            </w:r>
-          </w:p>
-        </w:tc>
-        <w:tc>
-          <w:tcPr>
-            <w:tcW w:type="dxa" w:w="5256"/>
-            <w:shd w:fill="F0F6F8"/>
-            <w:tcMar>
-              <w:top w:w="25" w:type="dxa"/>
-              <w:bottom w:w="25" w:type="dxa"/>
-            </w:tcMar>
-          </w:tcPr>
-          <w:p>
-            <w:pPr>
-              <w:spacing w:after="0" w:before="0" w:line="240" w:lineRule="auto"/>
-            </w:pPr>
-            <w:r>
-              <w:rPr>
-                <w:sz w:val="16"/>
-              </w:rPr>
-              <w:t>☐ Igual</w:t>
-            </w:r>
-          </w:p>
-        </w:tc>
-      </w:tr>
-      <w:tr>
-        <w:tc>
-          <w:tcPr>
-            <w:tcW w:type="dxa" w:w="5256"/>
-            <w:shd w:fill="F0F6F8"/>
-            <w:tcMar>
-              <w:top w:w="25" w:type="dxa"/>
-              <w:bottom w:w="25" w:type="dxa"/>
-            </w:tcMar>
-          </w:tcPr>
-          <w:p>
-            <w:pPr>
-              <w:spacing w:after="0" w:before="0" w:line="240" w:lineRule="auto"/>
-            </w:pPr>
-            <w:r>
-              <w:rPr>
-                <w:sz w:val="16"/>
-              </w:rPr>
-              <w:t>☐ Peor</w:t>
-            </w:r>
-          </w:p>
-        </w:tc>
-        <w:tc>
-          <w:tcPr>
-            <w:tcW w:type="dxa" w:w="5256"/>
-            <w:shd w:fill="F0F6F8"/>
-            <w:tcMar>
-              <w:top w:w="25" w:type="dxa"/>
-              <w:bottom w:w="25" w:type="dxa"/>
-            </w:tcMar>
-          </w:tcPr>
-          <w:p>
-            <w:pPr>
-              <w:spacing w:after="0" w:before="0" w:line="240" w:lineRule="auto"/>
-            </w:pPr>
-            <w:r>
-              <w:rPr>
-                <w:sz w:val="16"/>
-              </w:rPr>
-              <w:t>☐ No puede comparar / no recibió atención antes</w:t>
-            </w:r>
-          </w:p>
-        </w:tc>
-      </w:tr>
-      <w:tr>
-        <w:tc>
-          <w:tcPr>
-            <w:tcW w:type="dxa" w:w="5256"/>
-            <w:shd w:fill="F0F6F8"/>
-            <w:tcMar>
-              <w:top w:w="25" w:type="dxa"/>
-              <w:bottom w:w="25" w:type="dxa"/>
-            </w:tcMar>
-          </w:tcPr>
-          <w:p>
-            <w:pPr>
-              <w:spacing w:after="0" w:before="0" w:line="240" w:lineRule="auto"/>
-            </w:pPr>
-            <w:r>
-              <w:rPr>
-                <w:sz w:val="16"/>
-              </w:rPr>
-              <w:t>☐ No sabe / no responde</w:t>
-            </w:r>
-          </w:p>
-        </w:tc>
-        <w:tc>
-          <w:tcPr>
-            <w:tcW w:type="dxa" w:w="5256"/>
             <w:shd w:fill="F0F6F8"/>
             <w:tcMar>
               <w:top w:w="25" w:type="dxa"/>
@@ -9661,92 +9332,6 @@
                 <w:sz w:val="16"/>
               </w:rPr>
               <w:t>NUNCA</w:t>
-            </w:r>
-          </w:p>
-        </w:tc>
-      </w:tr>
-    </w:tbl>
-    <w:p>
-      <w:pPr>
-        <w:pStyle w:val="Heading2"/>
-        <w:spacing w:after="60" w:before="0" w:line="240" w:lineRule="auto"/>
-      </w:pPr>
-      <w:r>
-        <w:rPr>
-          <w:sz w:val="17"/>
-        </w:rPr>
-        <w:t>Cambio percibido</w:t>
-      </w:r>
-    </w:p>
-    <w:tbl>
-      <w:tblPr>
-        <w:tblStyle w:val="LightShading-Accent1"/>
-        <w:tblW w:type="auto" w:w="0"/>
-        <w:tblLook w:firstColumn="1" w:firstRow="1" w:lastColumn="0" w:lastRow="0" w:noHBand="0" w:noVBand="1" w:val="04A0"/>
-      </w:tblPr>
-      <w:tblGrid>
-        <w:gridCol w:w="3504"/>
-        <w:gridCol w:w="3504"/>
-        <w:gridCol w:w="3504"/>
-      </w:tblGrid>
-      <w:tr>
-        <w:tc>
-          <w:tcPr>
-            <w:tcW w:type="dxa" w:w="3504"/>
-            <w:tcMar>
-              <w:top w:w="25" w:type="dxa"/>
-              <w:bottom w:w="25" w:type="dxa"/>
-            </w:tcMar>
-          </w:tcPr>
-          <w:p>
-            <w:pPr>
-              <w:spacing w:after="0" w:before="0" w:line="240" w:lineRule="auto"/>
-            </w:pPr>
-            <w:r>
-              <w:rPr>
-                <w:sz w:val="16"/>
-              </w:rPr>
-              <w:t>MEJOR</w:t>
-            </w:r>
-          </w:p>
-        </w:tc>
-        <w:tc>
-          <w:tcPr>
-            <w:tcW w:type="dxa" w:w="3504"/>
-            <w:tcMar>
-              <w:top w:w="25" w:type="dxa"/>
-              <w:bottom w:w="25" w:type="dxa"/>
-            </w:tcMar>
-          </w:tcPr>
-          <w:p>
-            <w:pPr>
-              <w:spacing w:after="0" w:before="0" w:line="240" w:lineRule="auto"/>
-            </w:pPr>
-            <w:r>
-              <w:rPr>
-                <w:sz w:val="16"/>
-              </w:rPr>
-              <w:t>IGUAL</w:t>
-            </w:r>
-          </w:p>
-        </w:tc>
-        <w:tc>
-          <w:tcPr>
-            <w:tcW w:type="dxa" w:w="3504"/>
-            <w:tcMar>
-              <w:top w:w="25" w:type="dxa"/>
-              <w:bottom w:w="25" w:type="dxa"/>
-            </w:tcMar>
-          </w:tcPr>
-          <w:p>
-            <w:pPr>
-              <w:spacing w:after="0" w:before="0" w:line="240" w:lineRule="auto"/>
-            </w:pPr>
-            <w:r>
-              <w:rPr>
-                <w:sz w:val="16"/>
-              </w:rPr>
-              <w:t>PEOR</w:t>
             </w:r>
           </w:p>
         </w:tc>

</xml_diff>

<commit_message>
Añadir distintivo de especialista social en todas las hojas
</commit_message>
<xml_diff>
--- a/documentos/Encuesta_Kimbiri_visual.docx
+++ b/documentos/Encuesta_Kimbiri_visual.docx
@@ -9365,9 +9365,24 @@
   <w:p>
     <w:pPr>
       <w:pStyle w:val="Footer"/>
+      <w:spacing w:after="0" w:before="0" w:line="240" w:lineRule="auto"/>
+      <w:jc w:val="right"/>
     </w:pPr>
     <w:r>
-      <w:t>Encuesta urbana y rural · Uso reservado</w:t>
+      <w:rPr>
+        <w:b/>
+        <w:color w:val="087F8C"/>
+        <w:sz w:val="16"/>
+      </w:rPr>
+      <w:t>BC  |  BORDA CARDENAS, YANET</w:t>
+    </w:r>
+    <w:r>
+      <w:rPr>
+        <w:color w:val="173846"/>
+        <w:sz w:val="15"/>
+      </w:rPr>
+      <w:br/>
+      <w:t>Especialista Social</w:t>
     </w:r>
   </w:p>
 </w:ftr>

</xml_diff>

<commit_message>
Incorporar logo BC y frase como marca de agua
</commit_message>
<xml_diff>
--- a/documentos/Encuesta_Kimbiri_visual.docx
+++ b/documentos/Encuesta_Kimbiri_visual.docx
@@ -90,7 +90,6 @@
         <w:tc>
           <w:tcPr>
             <w:tcW w:type="dxa" w:w="3504"/>
-            <w:shd w:fill="F0F6F8"/>
             <w:tcMar>
               <w:top w:w="25" w:type="dxa"/>
               <w:bottom w:w="25" w:type="dxa"/>
@@ -111,7 +110,6 @@
         <w:tc>
           <w:tcPr>
             <w:tcW w:type="dxa" w:w="3504"/>
-            <w:shd w:fill="F0F6F8"/>
             <w:tcMar>
               <w:top w:w="25" w:type="dxa"/>
               <w:bottom w:w="25" w:type="dxa"/>
@@ -132,7 +130,6 @@
         <w:tc>
           <w:tcPr>
             <w:tcW w:type="dxa" w:w="3504"/>
-            <w:shd w:fill="F0F6F8"/>
             <w:tcMar>
               <w:top w:w="25" w:type="dxa"/>
               <w:bottom w:w="25" w:type="dxa"/>
@@ -174,7 +171,6 @@
         <w:tc>
           <w:tcPr>
             <w:tcW w:type="dxa" w:w="3504"/>
-            <w:shd w:fill="F0F6F8"/>
             <w:tcMar>
               <w:top w:w="25" w:type="dxa"/>
               <w:bottom w:w="25" w:type="dxa"/>
@@ -195,7 +191,6 @@
         <w:tc>
           <w:tcPr>
             <w:tcW w:type="dxa" w:w="3504"/>
-            <w:shd w:fill="F0F6F8"/>
             <w:tcMar>
               <w:top w:w="25" w:type="dxa"/>
               <w:bottom w:w="25" w:type="dxa"/>
@@ -216,7 +211,6 @@
         <w:tc>
           <w:tcPr>
             <w:tcW w:type="dxa" w:w="3504"/>
-            <w:shd w:fill="F0F6F8"/>
             <w:tcMar>
               <w:top w:w="25" w:type="dxa"/>
               <w:bottom w:w="25" w:type="dxa"/>
@@ -279,7 +273,6 @@
         <w:tc>
           <w:tcPr>
             <w:tcW w:type="dxa" w:w="3504"/>
-            <w:shd w:fill="F0F6F8"/>
             <w:tcMar>
               <w:top w:w="25" w:type="dxa"/>
               <w:bottom w:w="25" w:type="dxa"/>
@@ -300,7 +293,6 @@
         <w:tc>
           <w:tcPr>
             <w:tcW w:type="dxa" w:w="3504"/>
-            <w:shd w:fill="F0F6F8"/>
             <w:tcMar>
               <w:top w:w="25" w:type="dxa"/>
               <w:bottom w:w="25" w:type="dxa"/>
@@ -321,7 +313,6 @@
         <w:tc>
           <w:tcPr>
             <w:tcW w:type="dxa" w:w="3504"/>
-            <w:shd w:fill="F0F6F8"/>
             <w:tcMar>
               <w:top w:w="25" w:type="dxa"/>
               <w:bottom w:w="25" w:type="dxa"/>
@@ -449,7 +440,6 @@
         <w:tc>
           <w:tcPr>
             <w:tcW w:type="dxa" w:w="3504"/>
-            <w:shd w:fill="F0F6F8"/>
             <w:tcMar>
               <w:top w:w="25" w:type="dxa"/>
               <w:bottom w:w="25" w:type="dxa"/>
@@ -470,7 +460,6 @@
         <w:tc>
           <w:tcPr>
             <w:tcW w:type="dxa" w:w="3504"/>
-            <w:shd w:fill="F0F6F8"/>
             <w:tcMar>
               <w:top w:w="25" w:type="dxa"/>
               <w:bottom w:w="25" w:type="dxa"/>
@@ -491,7 +480,6 @@
         <w:tc>
           <w:tcPr>
             <w:tcW w:type="dxa" w:w="3504"/>
-            <w:shd w:fill="F0F6F8"/>
             <w:tcMar>
               <w:top w:w="25" w:type="dxa"/>
               <w:bottom w:w="25" w:type="dxa"/>
@@ -514,7 +502,6 @@
         <w:tc>
           <w:tcPr>
             <w:tcW w:type="dxa" w:w="3504"/>
-            <w:shd w:fill="F0F6F8"/>
             <w:tcMar>
               <w:top w:w="25" w:type="dxa"/>
               <w:bottom w:w="25" w:type="dxa"/>
@@ -535,7 +522,6 @@
         <w:tc>
           <w:tcPr>
             <w:tcW w:type="dxa" w:w="3504"/>
-            <w:shd w:fill="F0F6F8"/>
             <w:tcMar>
               <w:top w:w="25" w:type="dxa"/>
               <w:bottom w:w="25" w:type="dxa"/>
@@ -556,7 +542,6 @@
         <w:tc>
           <w:tcPr>
             <w:tcW w:type="dxa" w:w="3504"/>
-            <w:shd w:fill="F0F6F8"/>
             <w:tcMar>
               <w:top w:w="25" w:type="dxa"/>
               <w:bottom w:w="25" w:type="dxa"/>
@@ -579,7 +564,6 @@
         <w:tc>
           <w:tcPr>
             <w:tcW w:type="dxa" w:w="3504"/>
-            <w:shd w:fill="F0F6F8"/>
             <w:tcMar>
               <w:top w:w="25" w:type="dxa"/>
               <w:bottom w:w="25" w:type="dxa"/>
@@ -600,7 +584,6 @@
         <w:tc>
           <w:tcPr>
             <w:tcW w:type="dxa" w:w="3504"/>
-            <w:shd w:fill="F0F6F8"/>
             <w:tcMar>
               <w:top w:w="25" w:type="dxa"/>
               <w:bottom w:w="25" w:type="dxa"/>
@@ -615,7 +598,6 @@
         <w:tc>
           <w:tcPr>
             <w:tcW w:type="dxa" w:w="3504"/>
-            <w:shd w:fill="F0F6F8"/>
             <w:tcMar>
               <w:top w:w="25" w:type="dxa"/>
               <w:bottom w:w="25" w:type="dxa"/>
@@ -656,7 +638,6 @@
         <w:tc>
           <w:tcPr>
             <w:tcW w:type="dxa" w:w="5256"/>
-            <w:shd w:fill="F0F6F8"/>
             <w:tcMar>
               <w:top w:w="25" w:type="dxa"/>
               <w:bottom w:w="25" w:type="dxa"/>
@@ -677,7 +658,6 @@
         <w:tc>
           <w:tcPr>
             <w:tcW w:type="dxa" w:w="5256"/>
-            <w:shd w:fill="F0F6F8"/>
             <w:tcMar>
               <w:top w:w="25" w:type="dxa"/>
               <w:bottom w:w="25" w:type="dxa"/>
@@ -700,7 +680,6 @@
         <w:tc>
           <w:tcPr>
             <w:tcW w:type="dxa" w:w="5256"/>
-            <w:shd w:fill="F0F6F8"/>
             <w:tcMar>
               <w:top w:w="25" w:type="dxa"/>
               <w:bottom w:w="25" w:type="dxa"/>
@@ -721,7 +700,6 @@
         <w:tc>
           <w:tcPr>
             <w:tcW w:type="dxa" w:w="5256"/>
-            <w:shd w:fill="F0F6F8"/>
             <w:tcMar>
               <w:top w:w="25" w:type="dxa"/>
               <w:bottom w:w="25" w:type="dxa"/>
@@ -763,7 +741,6 @@
         <w:tc>
           <w:tcPr>
             <w:tcW w:type="dxa" w:w="3504"/>
-            <w:shd w:fill="F0F6F8"/>
             <w:tcMar>
               <w:top w:w="25" w:type="dxa"/>
               <w:bottom w:w="25" w:type="dxa"/>
@@ -784,7 +761,6 @@
         <w:tc>
           <w:tcPr>
             <w:tcW w:type="dxa" w:w="3504"/>
-            <w:shd w:fill="F0F6F8"/>
             <w:tcMar>
               <w:top w:w="25" w:type="dxa"/>
               <w:bottom w:w="25" w:type="dxa"/>
@@ -805,7 +781,6 @@
         <w:tc>
           <w:tcPr>
             <w:tcW w:type="dxa" w:w="3504"/>
-            <w:shd w:fill="F0F6F8"/>
             <w:tcMar>
               <w:top w:w="25" w:type="dxa"/>
               <w:bottom w:w="25" w:type="dxa"/>
@@ -828,7 +803,6 @@
         <w:tc>
           <w:tcPr>
             <w:tcW w:type="dxa" w:w="3504"/>
-            <w:shd w:fill="F0F6F8"/>
             <w:tcMar>
               <w:top w:w="25" w:type="dxa"/>
               <w:bottom w:w="25" w:type="dxa"/>
@@ -849,7 +823,6 @@
         <w:tc>
           <w:tcPr>
             <w:tcW w:type="dxa" w:w="3504"/>
-            <w:shd w:fill="F0F6F8"/>
             <w:tcMar>
               <w:top w:w="25" w:type="dxa"/>
               <w:bottom w:w="25" w:type="dxa"/>
@@ -870,7 +843,6 @@
         <w:tc>
           <w:tcPr>
             <w:tcW w:type="dxa" w:w="3504"/>
-            <w:shd w:fill="F0F6F8"/>
             <w:tcMar>
               <w:top w:w="25" w:type="dxa"/>
               <w:bottom w:w="25" w:type="dxa"/>
@@ -918,7 +890,6 @@
         <w:tc>
           <w:tcPr>
             <w:tcW w:type="dxa" w:w="3504"/>
-            <w:shd w:fill="F0F6F8"/>
             <w:tcMar>
               <w:top w:w="25" w:type="dxa"/>
               <w:bottom w:w="25" w:type="dxa"/>
@@ -939,7 +910,6 @@
         <w:tc>
           <w:tcPr>
             <w:tcW w:type="dxa" w:w="3504"/>
-            <w:shd w:fill="F0F6F8"/>
             <w:tcMar>
               <w:top w:w="25" w:type="dxa"/>
               <w:bottom w:w="25" w:type="dxa"/>
@@ -960,7 +930,6 @@
         <w:tc>
           <w:tcPr>
             <w:tcW w:type="dxa" w:w="3504"/>
-            <w:shd w:fill="F0F6F8"/>
             <w:tcMar>
               <w:top w:w="25" w:type="dxa"/>
               <w:bottom w:w="25" w:type="dxa"/>
@@ -983,7 +952,6 @@
         <w:tc>
           <w:tcPr>
             <w:tcW w:type="dxa" w:w="3504"/>
-            <w:shd w:fill="F0F6F8"/>
             <w:tcMar>
               <w:top w:w="25" w:type="dxa"/>
               <w:bottom w:w="25" w:type="dxa"/>
@@ -1004,7 +972,6 @@
         <w:tc>
           <w:tcPr>
             <w:tcW w:type="dxa" w:w="3504"/>
-            <w:shd w:fill="F0F6F8"/>
             <w:tcMar>
               <w:top w:w="25" w:type="dxa"/>
               <w:bottom w:w="25" w:type="dxa"/>
@@ -1019,7 +986,6 @@
         <w:tc>
           <w:tcPr>
             <w:tcW w:type="dxa" w:w="3504"/>
-            <w:shd w:fill="F0F6F8"/>
             <w:tcMar>
               <w:top w:w="25" w:type="dxa"/>
               <w:bottom w:w="25" w:type="dxa"/>
@@ -1060,7 +1026,6 @@
         <w:tc>
           <w:tcPr>
             <w:tcW w:type="dxa" w:w="3504"/>
-            <w:shd w:fill="F0F6F8"/>
             <w:tcMar>
               <w:top w:w="25" w:type="dxa"/>
               <w:bottom w:w="25" w:type="dxa"/>
@@ -1081,7 +1046,6 @@
         <w:tc>
           <w:tcPr>
             <w:tcW w:type="dxa" w:w="3504"/>
-            <w:shd w:fill="F0F6F8"/>
             <w:tcMar>
               <w:top w:w="25" w:type="dxa"/>
               <w:bottom w:w="25" w:type="dxa"/>
@@ -1102,7 +1066,6 @@
         <w:tc>
           <w:tcPr>
             <w:tcW w:type="dxa" w:w="3504"/>
-            <w:shd w:fill="F0F6F8"/>
             <w:tcMar>
               <w:top w:w="25" w:type="dxa"/>
               <w:bottom w:w="25" w:type="dxa"/>
@@ -1125,7 +1088,6 @@
         <w:tc>
           <w:tcPr>
             <w:tcW w:type="dxa" w:w="3504"/>
-            <w:shd w:fill="F0F6F8"/>
             <w:tcMar>
               <w:top w:w="25" w:type="dxa"/>
               <w:bottom w:w="25" w:type="dxa"/>
@@ -1146,7 +1108,6 @@
         <w:tc>
           <w:tcPr>
             <w:tcW w:type="dxa" w:w="3504"/>
-            <w:shd w:fill="F0F6F8"/>
             <w:tcMar>
               <w:top w:w="25" w:type="dxa"/>
               <w:bottom w:w="25" w:type="dxa"/>
@@ -1167,7 +1128,6 @@
         <w:tc>
           <w:tcPr>
             <w:tcW w:type="dxa" w:w="3504"/>
-            <w:shd w:fill="F0F6F8"/>
             <w:tcMar>
               <w:top w:w="25" w:type="dxa"/>
               <w:bottom w:w="25" w:type="dxa"/>
@@ -1190,7 +1150,6 @@
         <w:tc>
           <w:tcPr>
             <w:tcW w:type="dxa" w:w="3504"/>
-            <w:shd w:fill="F0F6F8"/>
             <w:tcMar>
               <w:top w:w="25" w:type="dxa"/>
               <w:bottom w:w="25" w:type="dxa"/>
@@ -1211,7 +1170,6 @@
         <w:tc>
           <w:tcPr>
             <w:tcW w:type="dxa" w:w="3504"/>
-            <w:shd w:fill="F0F6F8"/>
             <w:tcMar>
               <w:top w:w="25" w:type="dxa"/>
               <w:bottom w:w="25" w:type="dxa"/>
@@ -1232,7 +1190,6 @@
         <w:tc>
           <w:tcPr>
             <w:tcW w:type="dxa" w:w="3504"/>
-            <w:shd w:fill="F0F6F8"/>
             <w:tcMar>
               <w:top w:w="25" w:type="dxa"/>
               <w:bottom w:w="25" w:type="dxa"/>
@@ -1255,7 +1212,6 @@
         <w:tc>
           <w:tcPr>
             <w:tcW w:type="dxa" w:w="3504"/>
-            <w:shd w:fill="F0F6F8"/>
             <w:tcMar>
               <w:top w:w="25" w:type="dxa"/>
               <w:bottom w:w="25" w:type="dxa"/>
@@ -1276,7 +1232,6 @@
         <w:tc>
           <w:tcPr>
             <w:tcW w:type="dxa" w:w="3504"/>
-            <w:shd w:fill="F0F6F8"/>
             <w:tcMar>
               <w:top w:w="25" w:type="dxa"/>
               <w:bottom w:w="25" w:type="dxa"/>
@@ -1297,7 +1252,6 @@
         <w:tc>
           <w:tcPr>
             <w:tcW w:type="dxa" w:w="3504"/>
-            <w:shd w:fill="F0F6F8"/>
             <w:tcMar>
               <w:top w:w="25" w:type="dxa"/>
               <w:bottom w:w="25" w:type="dxa"/>
@@ -1320,7 +1274,6 @@
         <w:tc>
           <w:tcPr>
             <w:tcW w:type="dxa" w:w="3504"/>
-            <w:shd w:fill="F0F6F8"/>
             <w:tcMar>
               <w:top w:w="25" w:type="dxa"/>
               <w:bottom w:w="25" w:type="dxa"/>
@@ -1341,7 +1294,6 @@
         <w:tc>
           <w:tcPr>
             <w:tcW w:type="dxa" w:w="3504"/>
-            <w:shd w:fill="F0F6F8"/>
             <w:tcMar>
               <w:top w:w="25" w:type="dxa"/>
               <w:bottom w:w="25" w:type="dxa"/>
@@ -1362,7 +1314,6 @@
         <w:tc>
           <w:tcPr>
             <w:tcW w:type="dxa" w:w="3504"/>
-            <w:shd w:fill="F0F6F8"/>
             <w:tcMar>
               <w:top w:w="25" w:type="dxa"/>
               <w:bottom w:w="25" w:type="dxa"/>
@@ -1385,7 +1336,6 @@
         <w:tc>
           <w:tcPr>
             <w:tcW w:type="dxa" w:w="3504"/>
-            <w:shd w:fill="F0F6F8"/>
             <w:tcMar>
               <w:top w:w="25" w:type="dxa"/>
               <w:bottom w:w="25" w:type="dxa"/>
@@ -1406,7 +1356,6 @@
         <w:tc>
           <w:tcPr>
             <w:tcW w:type="dxa" w:w="3504"/>
-            <w:shd w:fill="F0F6F8"/>
             <w:tcMar>
               <w:top w:w="25" w:type="dxa"/>
               <w:bottom w:w="25" w:type="dxa"/>
@@ -1427,7 +1376,6 @@
         <w:tc>
           <w:tcPr>
             <w:tcW w:type="dxa" w:w="3504"/>
-            <w:shd w:fill="F0F6F8"/>
             <w:tcMar>
               <w:top w:w="25" w:type="dxa"/>
               <w:bottom w:w="25" w:type="dxa"/>
@@ -1450,7 +1398,6 @@
         <w:tc>
           <w:tcPr>
             <w:tcW w:type="dxa" w:w="3504"/>
-            <w:shd w:fill="F0F6F8"/>
             <w:tcMar>
               <w:top w:w="25" w:type="dxa"/>
               <w:bottom w:w="25" w:type="dxa"/>
@@ -1471,7 +1418,6 @@
         <w:tc>
           <w:tcPr>
             <w:tcW w:type="dxa" w:w="3504"/>
-            <w:shd w:fill="F0F6F8"/>
             <w:tcMar>
               <w:top w:w="25" w:type="dxa"/>
               <w:bottom w:w="25" w:type="dxa"/>
@@ -1492,7 +1438,6 @@
         <w:tc>
           <w:tcPr>
             <w:tcW w:type="dxa" w:w="3504"/>
-            <w:shd w:fill="F0F6F8"/>
             <w:tcMar>
               <w:top w:w="25" w:type="dxa"/>
               <w:bottom w:w="25" w:type="dxa"/>
@@ -1539,7 +1484,6 @@
         <w:tc>
           <w:tcPr>
             <w:tcW w:type="dxa" w:w="5256"/>
-            <w:shd w:fill="F0F6F8"/>
             <w:tcMar>
               <w:top w:w="25" w:type="dxa"/>
               <w:bottom w:w="25" w:type="dxa"/>
@@ -1560,7 +1504,6 @@
         <w:tc>
           <w:tcPr>
             <w:tcW w:type="dxa" w:w="5256"/>
-            <w:shd w:fill="F0F6F8"/>
             <w:tcMar>
               <w:top w:w="25" w:type="dxa"/>
               <w:bottom w:w="25" w:type="dxa"/>
@@ -1583,7 +1526,6 @@
         <w:tc>
           <w:tcPr>
             <w:tcW w:type="dxa" w:w="5256"/>
-            <w:shd w:fill="F0F6F8"/>
             <w:tcMar>
               <w:top w:w="25" w:type="dxa"/>
               <w:bottom w:w="25" w:type="dxa"/>
@@ -1604,7 +1546,6 @@
         <w:tc>
           <w:tcPr>
             <w:tcW w:type="dxa" w:w="5256"/>
-            <w:shd w:fill="F0F6F8"/>
             <w:tcMar>
               <w:top w:w="25" w:type="dxa"/>
               <w:bottom w:w="25" w:type="dxa"/>
@@ -1652,7 +1593,6 @@
         <w:tc>
           <w:tcPr>
             <w:tcW w:type="dxa" w:w="3504"/>
-            <w:shd w:fill="F0F6F8"/>
             <w:tcMar>
               <w:top w:w="25" w:type="dxa"/>
               <w:bottom w:w="25" w:type="dxa"/>
@@ -1673,7 +1613,6 @@
         <w:tc>
           <w:tcPr>
             <w:tcW w:type="dxa" w:w="3504"/>
-            <w:shd w:fill="F0F6F8"/>
             <w:tcMar>
               <w:top w:w="25" w:type="dxa"/>
               <w:bottom w:w="25" w:type="dxa"/>
@@ -1694,7 +1633,6 @@
         <w:tc>
           <w:tcPr>
             <w:tcW w:type="dxa" w:w="3504"/>
-            <w:shd w:fill="F0F6F8"/>
             <w:tcMar>
               <w:top w:w="25" w:type="dxa"/>
               <w:bottom w:w="25" w:type="dxa"/>
@@ -1717,7 +1655,6 @@
         <w:tc>
           <w:tcPr>
             <w:tcW w:type="dxa" w:w="3504"/>
-            <w:shd w:fill="F0F6F8"/>
             <w:tcMar>
               <w:top w:w="25" w:type="dxa"/>
               <w:bottom w:w="25" w:type="dxa"/>
@@ -1738,7 +1675,6 @@
         <w:tc>
           <w:tcPr>
             <w:tcW w:type="dxa" w:w="3504"/>
-            <w:shd w:fill="F0F6F8"/>
             <w:tcMar>
               <w:top w:w="25" w:type="dxa"/>
               <w:bottom w:w="25" w:type="dxa"/>
@@ -1759,7 +1695,6 @@
         <w:tc>
           <w:tcPr>
             <w:tcW w:type="dxa" w:w="3504"/>
-            <w:shd w:fill="F0F6F8"/>
             <w:tcMar>
               <w:top w:w="25" w:type="dxa"/>
               <w:bottom w:w="25" w:type="dxa"/>
@@ -1812,7 +1747,6 @@
         <w:tc>
           <w:tcPr>
             <w:tcW w:type="dxa" w:w="3504"/>
-            <w:shd w:fill="F0F6F8"/>
             <w:tcMar>
               <w:top w:w="25" w:type="dxa"/>
               <w:bottom w:w="25" w:type="dxa"/>
@@ -1833,7 +1767,6 @@
         <w:tc>
           <w:tcPr>
             <w:tcW w:type="dxa" w:w="3504"/>
-            <w:shd w:fill="F0F6F8"/>
             <w:tcMar>
               <w:top w:w="25" w:type="dxa"/>
               <w:bottom w:w="25" w:type="dxa"/>
@@ -1854,7 +1787,6 @@
         <w:tc>
           <w:tcPr>
             <w:tcW w:type="dxa" w:w="3504"/>
-            <w:shd w:fill="F0F6F8"/>
             <w:tcMar>
               <w:top w:w="25" w:type="dxa"/>
               <w:bottom w:w="25" w:type="dxa"/>
@@ -1877,7 +1809,6 @@
         <w:tc>
           <w:tcPr>
             <w:tcW w:type="dxa" w:w="3504"/>
-            <w:shd w:fill="F0F6F8"/>
             <w:tcMar>
               <w:top w:w="25" w:type="dxa"/>
               <w:bottom w:w="25" w:type="dxa"/>
@@ -1898,7 +1829,6 @@
         <w:tc>
           <w:tcPr>
             <w:tcW w:type="dxa" w:w="3504"/>
-            <w:shd w:fill="F0F6F8"/>
             <w:tcMar>
               <w:top w:w="25" w:type="dxa"/>
               <w:bottom w:w="25" w:type="dxa"/>
@@ -1913,7 +1843,6 @@
         <w:tc>
           <w:tcPr>
             <w:tcW w:type="dxa" w:w="3504"/>
-            <w:shd w:fill="F0F6F8"/>
             <w:tcMar>
               <w:top w:w="25" w:type="dxa"/>
               <w:bottom w:w="25" w:type="dxa"/>
@@ -1955,7 +1884,6 @@
         <w:tc>
           <w:tcPr>
             <w:tcW w:type="dxa" w:w="3504"/>
-            <w:shd w:fill="F0F6F8"/>
             <w:tcMar>
               <w:top w:w="25" w:type="dxa"/>
               <w:bottom w:w="25" w:type="dxa"/>
@@ -1976,7 +1904,6 @@
         <w:tc>
           <w:tcPr>
             <w:tcW w:type="dxa" w:w="3504"/>
-            <w:shd w:fill="F0F6F8"/>
             <w:tcMar>
               <w:top w:w="25" w:type="dxa"/>
               <w:bottom w:w="25" w:type="dxa"/>
@@ -1997,7 +1924,6 @@
         <w:tc>
           <w:tcPr>
             <w:tcW w:type="dxa" w:w="3504"/>
-            <w:shd w:fill="F0F6F8"/>
             <w:tcMar>
               <w:top w:w="25" w:type="dxa"/>
               <w:bottom w:w="25" w:type="dxa"/>
@@ -2020,7 +1946,6 @@
         <w:tc>
           <w:tcPr>
             <w:tcW w:type="dxa" w:w="3504"/>
-            <w:shd w:fill="F0F6F8"/>
             <w:tcMar>
               <w:top w:w="25" w:type="dxa"/>
               <w:bottom w:w="25" w:type="dxa"/>
@@ -2041,7 +1966,6 @@
         <w:tc>
           <w:tcPr>
             <w:tcW w:type="dxa" w:w="3504"/>
-            <w:shd w:fill="F0F6F8"/>
             <w:tcMar>
               <w:top w:w="25" w:type="dxa"/>
               <w:bottom w:w="25" w:type="dxa"/>
@@ -2062,7 +1986,6 @@
         <w:tc>
           <w:tcPr>
             <w:tcW w:type="dxa" w:w="3504"/>
-            <w:shd w:fill="F0F6F8"/>
             <w:tcMar>
               <w:top w:w="25" w:type="dxa"/>
               <w:bottom w:w="25" w:type="dxa"/>
@@ -2173,7 +2096,6 @@
         <w:tc>
           <w:tcPr>
             <w:tcW w:type="dxa" w:w="3504"/>
-            <w:shd w:fill="F0F6F8"/>
             <w:tcMar>
               <w:top w:w="25" w:type="dxa"/>
               <w:bottom w:w="25" w:type="dxa"/>
@@ -2194,7 +2116,6 @@
         <w:tc>
           <w:tcPr>
             <w:tcW w:type="dxa" w:w="3504"/>
-            <w:shd w:fill="F0F6F8"/>
             <w:tcMar>
               <w:top w:w="25" w:type="dxa"/>
               <w:bottom w:w="25" w:type="dxa"/>
@@ -2215,7 +2136,6 @@
         <w:tc>
           <w:tcPr>
             <w:tcW w:type="dxa" w:w="3504"/>
-            <w:shd w:fill="F0F6F8"/>
             <w:tcMar>
               <w:top w:w="25" w:type="dxa"/>
               <w:bottom w:w="25" w:type="dxa"/>
@@ -2238,7 +2158,6 @@
         <w:tc>
           <w:tcPr>
             <w:tcW w:type="dxa" w:w="3504"/>
-            <w:shd w:fill="F0F6F8"/>
             <w:tcMar>
               <w:top w:w="25" w:type="dxa"/>
               <w:bottom w:w="25" w:type="dxa"/>
@@ -2259,7 +2178,6 @@
         <w:tc>
           <w:tcPr>
             <w:tcW w:type="dxa" w:w="3504"/>
-            <w:shd w:fill="F0F6F8"/>
             <w:tcMar>
               <w:top w:w="25" w:type="dxa"/>
               <w:bottom w:w="25" w:type="dxa"/>
@@ -2274,7 +2192,6 @@
         <w:tc>
           <w:tcPr>
             <w:tcW w:type="dxa" w:w="3504"/>
-            <w:shd w:fill="F0F6F8"/>
             <w:tcMar>
               <w:top w:w="25" w:type="dxa"/>
               <w:bottom w:w="25" w:type="dxa"/>
@@ -2316,7 +2233,6 @@
         <w:tc>
           <w:tcPr>
             <w:tcW w:type="dxa" w:w="3504"/>
-            <w:shd w:fill="F0F6F8"/>
             <w:tcMar>
               <w:top w:w="25" w:type="dxa"/>
               <w:bottom w:w="25" w:type="dxa"/>
@@ -2337,7 +2253,6 @@
         <w:tc>
           <w:tcPr>
             <w:tcW w:type="dxa" w:w="3504"/>
-            <w:shd w:fill="F0F6F8"/>
             <w:tcMar>
               <w:top w:w="25" w:type="dxa"/>
               <w:bottom w:w="25" w:type="dxa"/>
@@ -2358,7 +2273,6 @@
         <w:tc>
           <w:tcPr>
             <w:tcW w:type="dxa" w:w="3504"/>
-            <w:shd w:fill="F0F6F8"/>
             <w:tcMar>
               <w:top w:w="25" w:type="dxa"/>
               <w:bottom w:w="25" w:type="dxa"/>
@@ -2381,7 +2295,6 @@
         <w:tc>
           <w:tcPr>
             <w:tcW w:type="dxa" w:w="3504"/>
-            <w:shd w:fill="F0F6F8"/>
             <w:tcMar>
               <w:top w:w="25" w:type="dxa"/>
               <w:bottom w:w="25" w:type="dxa"/>
@@ -2402,7 +2315,6 @@
         <w:tc>
           <w:tcPr>
             <w:tcW w:type="dxa" w:w="3504"/>
-            <w:shd w:fill="F0F6F8"/>
             <w:tcMar>
               <w:top w:w="25" w:type="dxa"/>
               <w:bottom w:w="25" w:type="dxa"/>
@@ -2423,7 +2335,6 @@
         <w:tc>
           <w:tcPr>
             <w:tcW w:type="dxa" w:w="3504"/>
-            <w:shd w:fill="F0F6F8"/>
             <w:tcMar>
               <w:top w:w="25" w:type="dxa"/>
               <w:bottom w:w="25" w:type="dxa"/>
@@ -2446,7 +2357,6 @@
         <w:tc>
           <w:tcPr>
             <w:tcW w:type="dxa" w:w="3504"/>
-            <w:shd w:fill="F0F6F8"/>
             <w:tcMar>
               <w:top w:w="25" w:type="dxa"/>
               <w:bottom w:w="25" w:type="dxa"/>
@@ -2467,7 +2377,6 @@
         <w:tc>
           <w:tcPr>
             <w:tcW w:type="dxa" w:w="3504"/>
-            <w:shd w:fill="F0F6F8"/>
             <w:tcMar>
               <w:top w:w="25" w:type="dxa"/>
               <w:bottom w:w="25" w:type="dxa"/>
@@ -2488,7 +2397,6 @@
         <w:tc>
           <w:tcPr>
             <w:tcW w:type="dxa" w:w="3504"/>
-            <w:shd w:fill="F0F6F8"/>
             <w:tcMar>
               <w:top w:w="25" w:type="dxa"/>
               <w:bottom w:w="25" w:type="dxa"/>
@@ -2511,7 +2419,6 @@
         <w:tc>
           <w:tcPr>
             <w:tcW w:type="dxa" w:w="3504"/>
-            <w:shd w:fill="F0F6F8"/>
             <w:tcMar>
               <w:top w:w="25" w:type="dxa"/>
               <w:bottom w:w="25" w:type="dxa"/>
@@ -2532,7 +2439,6 @@
         <w:tc>
           <w:tcPr>
             <w:tcW w:type="dxa" w:w="3504"/>
-            <w:shd w:fill="F0F6F8"/>
             <w:tcMar>
               <w:top w:w="25" w:type="dxa"/>
               <w:bottom w:w="25" w:type="dxa"/>
@@ -2553,7 +2459,6 @@
         <w:tc>
           <w:tcPr>
             <w:tcW w:type="dxa" w:w="3504"/>
-            <w:shd w:fill="F0F6F8"/>
             <w:tcMar>
               <w:top w:w="25" w:type="dxa"/>
               <w:bottom w:w="25" w:type="dxa"/>
@@ -2576,7 +2481,6 @@
         <w:tc>
           <w:tcPr>
             <w:tcW w:type="dxa" w:w="3504"/>
-            <w:shd w:fill="F0F6F8"/>
             <w:tcMar>
               <w:top w:w="25" w:type="dxa"/>
               <w:bottom w:w="25" w:type="dxa"/>
@@ -2597,7 +2501,6 @@
         <w:tc>
           <w:tcPr>
             <w:tcW w:type="dxa" w:w="3504"/>
-            <w:shd w:fill="F0F6F8"/>
             <w:tcMar>
               <w:top w:w="25" w:type="dxa"/>
               <w:bottom w:w="25" w:type="dxa"/>
@@ -2618,7 +2521,6 @@
         <w:tc>
           <w:tcPr>
             <w:tcW w:type="dxa" w:w="3504"/>
-            <w:shd w:fill="F0F6F8"/>
             <w:tcMar>
               <w:top w:w="25" w:type="dxa"/>
               <w:bottom w:w="25" w:type="dxa"/>
@@ -2660,7 +2562,6 @@
         <w:tc>
           <w:tcPr>
             <w:tcW w:type="dxa" w:w="3504"/>
-            <w:shd w:fill="F0F6F8"/>
             <w:tcMar>
               <w:top w:w="25" w:type="dxa"/>
               <w:bottom w:w="25" w:type="dxa"/>
@@ -2681,7 +2582,6 @@
         <w:tc>
           <w:tcPr>
             <w:tcW w:type="dxa" w:w="3504"/>
-            <w:shd w:fill="F0F6F8"/>
             <w:tcMar>
               <w:top w:w="25" w:type="dxa"/>
               <w:bottom w:w="25" w:type="dxa"/>
@@ -2702,7 +2602,6 @@
         <w:tc>
           <w:tcPr>
             <w:tcW w:type="dxa" w:w="3504"/>
-            <w:shd w:fill="F0F6F8"/>
             <w:tcMar>
               <w:top w:w="25" w:type="dxa"/>
               <w:bottom w:w="25" w:type="dxa"/>
@@ -2725,7 +2624,6 @@
         <w:tc>
           <w:tcPr>
             <w:tcW w:type="dxa" w:w="3504"/>
-            <w:shd w:fill="F0F6F8"/>
             <w:tcMar>
               <w:top w:w="25" w:type="dxa"/>
               <w:bottom w:w="25" w:type="dxa"/>
@@ -2746,7 +2644,6 @@
         <w:tc>
           <w:tcPr>
             <w:tcW w:type="dxa" w:w="3504"/>
-            <w:shd w:fill="F0F6F8"/>
             <w:tcMar>
               <w:top w:w="25" w:type="dxa"/>
               <w:bottom w:w="25" w:type="dxa"/>
@@ -2761,7 +2658,6 @@
         <w:tc>
           <w:tcPr>
             <w:tcW w:type="dxa" w:w="3504"/>
-            <w:shd w:fill="F0F6F8"/>
             <w:tcMar>
               <w:top w:w="25" w:type="dxa"/>
               <w:bottom w:w="25" w:type="dxa"/>
@@ -2803,7 +2699,6 @@
         <w:tc>
           <w:tcPr>
             <w:tcW w:type="dxa" w:w="3504"/>
-            <w:shd w:fill="F0F6F8"/>
             <w:tcMar>
               <w:top w:w="25" w:type="dxa"/>
               <w:bottom w:w="25" w:type="dxa"/>
@@ -2824,7 +2719,6 @@
         <w:tc>
           <w:tcPr>
             <w:tcW w:type="dxa" w:w="3504"/>
-            <w:shd w:fill="F0F6F8"/>
             <w:tcMar>
               <w:top w:w="25" w:type="dxa"/>
               <w:bottom w:w="25" w:type="dxa"/>
@@ -2845,7 +2739,6 @@
         <w:tc>
           <w:tcPr>
             <w:tcW w:type="dxa" w:w="3504"/>
-            <w:shd w:fill="F0F6F8"/>
             <w:tcMar>
               <w:top w:w="25" w:type="dxa"/>
               <w:bottom w:w="25" w:type="dxa"/>
@@ -2868,7 +2761,6 @@
         <w:tc>
           <w:tcPr>
             <w:tcW w:type="dxa" w:w="3504"/>
-            <w:shd w:fill="F0F6F8"/>
             <w:tcMar>
               <w:top w:w="25" w:type="dxa"/>
               <w:bottom w:w="25" w:type="dxa"/>
@@ -2889,7 +2781,6 @@
         <w:tc>
           <w:tcPr>
             <w:tcW w:type="dxa" w:w="3504"/>
-            <w:shd w:fill="F0F6F8"/>
             <w:tcMar>
               <w:top w:w="25" w:type="dxa"/>
               <w:bottom w:w="25" w:type="dxa"/>
@@ -2910,7 +2801,6 @@
         <w:tc>
           <w:tcPr>
             <w:tcW w:type="dxa" w:w="3504"/>
-            <w:shd w:fill="F0F6F8"/>
             <w:tcMar>
               <w:top w:w="25" w:type="dxa"/>
               <w:bottom w:w="25" w:type="dxa"/>
@@ -2933,7 +2823,6 @@
         <w:tc>
           <w:tcPr>
             <w:tcW w:type="dxa" w:w="3504"/>
-            <w:shd w:fill="F0F6F8"/>
             <w:tcMar>
               <w:top w:w="25" w:type="dxa"/>
               <w:bottom w:w="25" w:type="dxa"/>
@@ -2954,7 +2843,6 @@
         <w:tc>
           <w:tcPr>
             <w:tcW w:type="dxa" w:w="3504"/>
-            <w:shd w:fill="F0F6F8"/>
             <w:tcMar>
               <w:top w:w="25" w:type="dxa"/>
               <w:bottom w:w="25" w:type="dxa"/>
@@ -2975,7 +2863,6 @@
         <w:tc>
           <w:tcPr>
             <w:tcW w:type="dxa" w:w="3504"/>
-            <w:shd w:fill="F0F6F8"/>
             <w:tcMar>
               <w:top w:w="25" w:type="dxa"/>
               <w:bottom w:w="25" w:type="dxa"/>
@@ -2998,7 +2885,6 @@
         <w:tc>
           <w:tcPr>
             <w:tcW w:type="dxa" w:w="3504"/>
-            <w:shd w:fill="F0F6F8"/>
             <w:tcMar>
               <w:top w:w="25" w:type="dxa"/>
               <w:bottom w:w="25" w:type="dxa"/>
@@ -3019,7 +2905,6 @@
         <w:tc>
           <w:tcPr>
             <w:tcW w:type="dxa" w:w="3504"/>
-            <w:shd w:fill="F0F6F8"/>
             <w:tcMar>
               <w:top w:w="25" w:type="dxa"/>
               <w:bottom w:w="25" w:type="dxa"/>
@@ -3040,7 +2925,6 @@
         <w:tc>
           <w:tcPr>
             <w:tcW w:type="dxa" w:w="3504"/>
-            <w:shd w:fill="F0F6F8"/>
             <w:tcMar>
               <w:top w:w="25" w:type="dxa"/>
               <w:bottom w:w="25" w:type="dxa"/>
@@ -3098,7 +2982,6 @@
         <w:tc>
           <w:tcPr>
             <w:tcW w:type="dxa" w:w="5256"/>
-            <w:shd w:fill="F0F6F8"/>
             <w:tcMar>
               <w:top w:w="25" w:type="dxa"/>
               <w:bottom w:w="25" w:type="dxa"/>
@@ -3119,7 +3002,6 @@
         <w:tc>
           <w:tcPr>
             <w:tcW w:type="dxa" w:w="5256"/>
-            <w:shd w:fill="F0F6F8"/>
             <w:tcMar>
               <w:top w:w="25" w:type="dxa"/>
               <w:bottom w:w="25" w:type="dxa"/>
@@ -3142,7 +3024,6 @@
         <w:tc>
           <w:tcPr>
             <w:tcW w:type="dxa" w:w="5256"/>
-            <w:shd w:fill="F0F6F8"/>
             <w:tcMar>
               <w:top w:w="25" w:type="dxa"/>
               <w:bottom w:w="25" w:type="dxa"/>
@@ -3163,7 +3044,6 @@
         <w:tc>
           <w:tcPr>
             <w:tcW w:type="dxa" w:w="5256"/>
-            <w:shd w:fill="F0F6F8"/>
             <w:tcMar>
               <w:top w:w="25" w:type="dxa"/>
               <w:bottom w:w="25" w:type="dxa"/>
@@ -3186,7 +3066,6 @@
         <w:tc>
           <w:tcPr>
             <w:tcW w:type="dxa" w:w="5256"/>
-            <w:shd w:fill="F0F6F8"/>
             <w:tcMar>
               <w:top w:w="25" w:type="dxa"/>
               <w:bottom w:w="25" w:type="dxa"/>
@@ -3207,7 +3086,6 @@
         <w:tc>
           <w:tcPr>
             <w:tcW w:type="dxa" w:w="5256"/>
-            <w:shd w:fill="F0F6F8"/>
             <w:tcMar>
               <w:top w:w="25" w:type="dxa"/>
               <w:bottom w:w="25" w:type="dxa"/>
@@ -3266,7 +3144,6 @@
         <w:tc>
           <w:tcPr>
             <w:tcW w:type="dxa" w:w="3504"/>
-            <w:shd w:fill="F0F6F8"/>
             <w:tcMar>
               <w:top w:w="25" w:type="dxa"/>
               <w:bottom w:w="25" w:type="dxa"/>
@@ -3287,7 +3164,6 @@
         <w:tc>
           <w:tcPr>
             <w:tcW w:type="dxa" w:w="3504"/>
-            <w:shd w:fill="F0F6F8"/>
             <w:tcMar>
               <w:top w:w="25" w:type="dxa"/>
               <w:bottom w:w="25" w:type="dxa"/>
@@ -3308,7 +3184,6 @@
         <w:tc>
           <w:tcPr>
             <w:tcW w:type="dxa" w:w="3504"/>
-            <w:shd w:fill="F0F6F8"/>
             <w:tcMar>
               <w:top w:w="25" w:type="dxa"/>
               <w:bottom w:w="25" w:type="dxa"/>
@@ -3331,7 +3206,6 @@
         <w:tc>
           <w:tcPr>
             <w:tcW w:type="dxa" w:w="3504"/>
-            <w:shd w:fill="F0F6F8"/>
             <w:tcMar>
               <w:top w:w="25" w:type="dxa"/>
               <w:bottom w:w="25" w:type="dxa"/>
@@ -3352,7 +3226,6 @@
         <w:tc>
           <w:tcPr>
             <w:tcW w:type="dxa" w:w="3504"/>
-            <w:shd w:fill="F0F6F8"/>
             <w:tcMar>
               <w:top w:w="25" w:type="dxa"/>
               <w:bottom w:w="25" w:type="dxa"/>
@@ -3373,7 +3246,6 @@
         <w:tc>
           <w:tcPr>
             <w:tcW w:type="dxa" w:w="3504"/>
-            <w:shd w:fill="F0F6F8"/>
             <w:tcMar>
               <w:top w:w="25" w:type="dxa"/>
               <w:bottom w:w="25" w:type="dxa"/>
@@ -3415,7 +3287,6 @@
         <w:tc>
           <w:tcPr>
             <w:tcW w:type="dxa" w:w="3504"/>
-            <w:shd w:fill="F0F6F8"/>
             <w:tcMar>
               <w:top w:w="25" w:type="dxa"/>
               <w:bottom w:w="25" w:type="dxa"/>
@@ -3436,7 +3307,6 @@
         <w:tc>
           <w:tcPr>
             <w:tcW w:type="dxa" w:w="3504"/>
-            <w:shd w:fill="F0F6F8"/>
             <w:tcMar>
               <w:top w:w="25" w:type="dxa"/>
               <w:bottom w:w="25" w:type="dxa"/>
@@ -3457,7 +3327,6 @@
         <w:tc>
           <w:tcPr>
             <w:tcW w:type="dxa" w:w="3504"/>
-            <w:shd w:fill="F0F6F8"/>
             <w:tcMar>
               <w:top w:w="25" w:type="dxa"/>
               <w:bottom w:w="25" w:type="dxa"/>
@@ -3480,7 +3349,6 @@
         <w:tc>
           <w:tcPr>
             <w:tcW w:type="dxa" w:w="3504"/>
-            <w:shd w:fill="F0F6F8"/>
             <w:tcMar>
               <w:top w:w="25" w:type="dxa"/>
               <w:bottom w:w="25" w:type="dxa"/>
@@ -3501,7 +3369,6 @@
         <w:tc>
           <w:tcPr>
             <w:tcW w:type="dxa" w:w="3504"/>
-            <w:shd w:fill="F0F6F8"/>
             <w:tcMar>
               <w:top w:w="25" w:type="dxa"/>
               <w:bottom w:w="25" w:type="dxa"/>
@@ -3522,7 +3389,6 @@
         <w:tc>
           <w:tcPr>
             <w:tcW w:type="dxa" w:w="3504"/>
-            <w:shd w:fill="F0F6F8"/>
             <w:tcMar>
               <w:top w:w="25" w:type="dxa"/>
               <w:bottom w:w="25" w:type="dxa"/>
@@ -3545,7 +3411,6 @@
         <w:tc>
           <w:tcPr>
             <w:tcW w:type="dxa" w:w="3504"/>
-            <w:shd w:fill="F0F6F8"/>
             <w:tcMar>
               <w:top w:w="25" w:type="dxa"/>
               <w:bottom w:w="25" w:type="dxa"/>
@@ -3566,7 +3431,6 @@
         <w:tc>
           <w:tcPr>
             <w:tcW w:type="dxa" w:w="3504"/>
-            <w:shd w:fill="F0F6F8"/>
             <w:tcMar>
               <w:top w:w="25" w:type="dxa"/>
               <w:bottom w:w="25" w:type="dxa"/>
@@ -3587,7 +3451,6 @@
         <w:tc>
           <w:tcPr>
             <w:tcW w:type="dxa" w:w="3504"/>
-            <w:shd w:fill="F0F6F8"/>
             <w:tcMar>
               <w:top w:w="25" w:type="dxa"/>
               <w:bottom w:w="25" w:type="dxa"/>
@@ -3610,7 +3473,6 @@
         <w:tc>
           <w:tcPr>
             <w:tcW w:type="dxa" w:w="3504"/>
-            <w:shd w:fill="F0F6F8"/>
             <w:tcMar>
               <w:top w:w="25" w:type="dxa"/>
               <w:bottom w:w="25" w:type="dxa"/>
@@ -3631,7 +3493,6 @@
         <w:tc>
           <w:tcPr>
             <w:tcW w:type="dxa" w:w="3504"/>
-            <w:shd w:fill="F0F6F8"/>
             <w:tcMar>
               <w:top w:w="25" w:type="dxa"/>
               <w:bottom w:w="25" w:type="dxa"/>
@@ -3652,7 +3513,6 @@
         <w:tc>
           <w:tcPr>
             <w:tcW w:type="dxa" w:w="3504"/>
-            <w:shd w:fill="F0F6F8"/>
             <w:tcMar>
               <w:top w:w="25" w:type="dxa"/>
               <w:bottom w:w="25" w:type="dxa"/>
@@ -3700,7 +3560,6 @@
         <w:tc>
           <w:tcPr>
             <w:tcW w:type="dxa" w:w="3504"/>
-            <w:shd w:fill="F0F6F8"/>
             <w:tcMar>
               <w:top w:w="25" w:type="dxa"/>
               <w:bottom w:w="25" w:type="dxa"/>
@@ -3721,7 +3580,6 @@
         <w:tc>
           <w:tcPr>
             <w:tcW w:type="dxa" w:w="3504"/>
-            <w:shd w:fill="F0F6F8"/>
             <w:tcMar>
               <w:top w:w="25" w:type="dxa"/>
               <w:bottom w:w="25" w:type="dxa"/>
@@ -3742,7 +3600,6 @@
         <w:tc>
           <w:tcPr>
             <w:tcW w:type="dxa" w:w="3504"/>
-            <w:shd w:fill="F0F6F8"/>
             <w:tcMar>
               <w:top w:w="25" w:type="dxa"/>
               <w:bottom w:w="25" w:type="dxa"/>
@@ -3765,7 +3622,6 @@
         <w:tc>
           <w:tcPr>
             <w:tcW w:type="dxa" w:w="3504"/>
-            <w:shd w:fill="F0F6F8"/>
             <w:tcMar>
               <w:top w:w="25" w:type="dxa"/>
               <w:bottom w:w="25" w:type="dxa"/>
@@ -3786,7 +3642,6 @@
         <w:tc>
           <w:tcPr>
             <w:tcW w:type="dxa" w:w="3504"/>
-            <w:shd w:fill="F0F6F8"/>
             <w:tcMar>
               <w:top w:w="25" w:type="dxa"/>
               <w:bottom w:w="25" w:type="dxa"/>
@@ -3807,7 +3662,6 @@
         <w:tc>
           <w:tcPr>
             <w:tcW w:type="dxa" w:w="3504"/>
-            <w:shd w:fill="F0F6F8"/>
             <w:tcMar>
               <w:top w:w="25" w:type="dxa"/>
               <w:bottom w:w="25" w:type="dxa"/>
@@ -3909,7 +3763,6 @@
         <w:tc>
           <w:tcPr>
             <w:tcW w:type="dxa" w:w="3504"/>
-            <w:shd w:fill="F0F6F8"/>
             <w:tcMar>
               <w:top w:w="25" w:type="dxa"/>
               <w:bottom w:w="25" w:type="dxa"/>
@@ -3930,7 +3783,6 @@
         <w:tc>
           <w:tcPr>
             <w:tcW w:type="dxa" w:w="3504"/>
-            <w:shd w:fill="F0F6F8"/>
             <w:tcMar>
               <w:top w:w="25" w:type="dxa"/>
               <w:bottom w:w="25" w:type="dxa"/>
@@ -3951,7 +3803,6 @@
         <w:tc>
           <w:tcPr>
             <w:tcW w:type="dxa" w:w="3504"/>
-            <w:shd w:fill="F0F6F8"/>
             <w:tcMar>
               <w:top w:w="25" w:type="dxa"/>
               <w:bottom w:w="25" w:type="dxa"/>
@@ -3974,7 +3825,6 @@
         <w:tc>
           <w:tcPr>
             <w:tcW w:type="dxa" w:w="3504"/>
-            <w:shd w:fill="F0F6F8"/>
             <w:tcMar>
               <w:top w:w="25" w:type="dxa"/>
               <w:bottom w:w="25" w:type="dxa"/>
@@ -3995,7 +3845,6 @@
         <w:tc>
           <w:tcPr>
             <w:tcW w:type="dxa" w:w="3504"/>
-            <w:shd w:fill="F0F6F8"/>
             <w:tcMar>
               <w:top w:w="25" w:type="dxa"/>
               <w:bottom w:w="25" w:type="dxa"/>
@@ -4016,7 +3865,6 @@
         <w:tc>
           <w:tcPr>
             <w:tcW w:type="dxa" w:w="3504"/>
-            <w:shd w:fill="F0F6F8"/>
             <w:tcMar>
               <w:top w:w="25" w:type="dxa"/>
               <w:bottom w:w="25" w:type="dxa"/>
@@ -4058,7 +3906,6 @@
         <w:tc>
           <w:tcPr>
             <w:tcW w:type="dxa" w:w="3504"/>
-            <w:shd w:fill="F0F6F8"/>
             <w:tcMar>
               <w:top w:w="25" w:type="dxa"/>
               <w:bottom w:w="25" w:type="dxa"/>
@@ -4079,7 +3926,6 @@
         <w:tc>
           <w:tcPr>
             <w:tcW w:type="dxa" w:w="3504"/>
-            <w:shd w:fill="F0F6F8"/>
             <w:tcMar>
               <w:top w:w="25" w:type="dxa"/>
               <w:bottom w:w="25" w:type="dxa"/>
@@ -4100,7 +3946,6 @@
         <w:tc>
           <w:tcPr>
             <w:tcW w:type="dxa" w:w="3504"/>
-            <w:shd w:fill="F0F6F8"/>
             <w:tcMar>
               <w:top w:w="25" w:type="dxa"/>
               <w:bottom w:w="25" w:type="dxa"/>
@@ -4123,7 +3968,6 @@
         <w:tc>
           <w:tcPr>
             <w:tcW w:type="dxa" w:w="3504"/>
-            <w:shd w:fill="F0F6F8"/>
             <w:tcMar>
               <w:top w:w="25" w:type="dxa"/>
               <w:bottom w:w="25" w:type="dxa"/>
@@ -4144,7 +3988,6 @@
         <w:tc>
           <w:tcPr>
             <w:tcW w:type="dxa" w:w="3504"/>
-            <w:shd w:fill="F0F6F8"/>
             <w:tcMar>
               <w:top w:w="25" w:type="dxa"/>
               <w:bottom w:w="25" w:type="dxa"/>
@@ -4165,7 +4008,6 @@
         <w:tc>
           <w:tcPr>
             <w:tcW w:type="dxa" w:w="3504"/>
-            <w:shd w:fill="F0F6F8"/>
             <w:tcMar>
               <w:top w:w="25" w:type="dxa"/>
               <w:bottom w:w="25" w:type="dxa"/>
@@ -4207,7 +4049,6 @@
         <w:tc>
           <w:tcPr>
             <w:tcW w:type="dxa" w:w="3504"/>
-            <w:shd w:fill="F0F6F8"/>
             <w:tcMar>
               <w:top w:w="25" w:type="dxa"/>
               <w:bottom w:w="25" w:type="dxa"/>
@@ -4228,7 +4069,6 @@
         <w:tc>
           <w:tcPr>
             <w:tcW w:type="dxa" w:w="3504"/>
-            <w:shd w:fill="F0F6F8"/>
             <w:tcMar>
               <w:top w:w="25" w:type="dxa"/>
               <w:bottom w:w="25" w:type="dxa"/>
@@ -4249,7 +4089,6 @@
         <w:tc>
           <w:tcPr>
             <w:tcW w:type="dxa" w:w="3504"/>
-            <w:shd w:fill="F0F6F8"/>
             <w:tcMar>
               <w:top w:w="25" w:type="dxa"/>
               <w:bottom w:w="25" w:type="dxa"/>
@@ -4272,7 +4111,6 @@
         <w:tc>
           <w:tcPr>
             <w:tcW w:type="dxa" w:w="3504"/>
-            <w:shd w:fill="F0F6F8"/>
             <w:tcMar>
               <w:top w:w="25" w:type="dxa"/>
               <w:bottom w:w="25" w:type="dxa"/>
@@ -4293,7 +4131,6 @@
         <w:tc>
           <w:tcPr>
             <w:tcW w:type="dxa" w:w="3504"/>
-            <w:shd w:fill="F0F6F8"/>
             <w:tcMar>
               <w:top w:w="25" w:type="dxa"/>
               <w:bottom w:w="25" w:type="dxa"/>
@@ -4308,7 +4145,6 @@
         <w:tc>
           <w:tcPr>
             <w:tcW w:type="dxa" w:w="3504"/>
-            <w:shd w:fill="F0F6F8"/>
             <w:tcMar>
               <w:top w:w="25" w:type="dxa"/>
               <w:bottom w:w="25" w:type="dxa"/>
@@ -4350,7 +4186,6 @@
         <w:tc>
           <w:tcPr>
             <w:tcW w:type="dxa" w:w="3504"/>
-            <w:shd w:fill="F0F6F8"/>
             <w:tcMar>
               <w:top w:w="25" w:type="dxa"/>
               <w:bottom w:w="25" w:type="dxa"/>
@@ -4371,7 +4206,6 @@
         <w:tc>
           <w:tcPr>
             <w:tcW w:type="dxa" w:w="3504"/>
-            <w:shd w:fill="F0F6F8"/>
             <w:tcMar>
               <w:top w:w="25" w:type="dxa"/>
               <w:bottom w:w="25" w:type="dxa"/>
@@ -4392,7 +4226,6 @@
         <w:tc>
           <w:tcPr>
             <w:tcW w:type="dxa" w:w="3504"/>
-            <w:shd w:fill="F0F6F8"/>
             <w:tcMar>
               <w:top w:w="25" w:type="dxa"/>
               <w:bottom w:w="25" w:type="dxa"/>
@@ -4415,7 +4248,6 @@
         <w:tc>
           <w:tcPr>
             <w:tcW w:type="dxa" w:w="3504"/>
-            <w:shd w:fill="F0F6F8"/>
             <w:tcMar>
               <w:top w:w="25" w:type="dxa"/>
               <w:bottom w:w="25" w:type="dxa"/>
@@ -4436,7 +4268,6 @@
         <w:tc>
           <w:tcPr>
             <w:tcW w:type="dxa" w:w="3504"/>
-            <w:shd w:fill="F0F6F8"/>
             <w:tcMar>
               <w:top w:w="25" w:type="dxa"/>
               <w:bottom w:w="25" w:type="dxa"/>
@@ -4451,7 +4282,6 @@
         <w:tc>
           <w:tcPr>
             <w:tcW w:type="dxa" w:w="3504"/>
-            <w:shd w:fill="F0F6F8"/>
             <w:tcMar>
               <w:top w:w="25" w:type="dxa"/>
               <w:bottom w:w="25" w:type="dxa"/>
@@ -4493,7 +4323,6 @@
         <w:tc>
           <w:tcPr>
             <w:tcW w:type="dxa" w:w="3504"/>
-            <w:shd w:fill="F0F6F8"/>
             <w:tcMar>
               <w:top w:w="25" w:type="dxa"/>
               <w:bottom w:w="25" w:type="dxa"/>
@@ -4514,7 +4343,6 @@
         <w:tc>
           <w:tcPr>
             <w:tcW w:type="dxa" w:w="3504"/>
-            <w:shd w:fill="F0F6F8"/>
             <w:tcMar>
               <w:top w:w="25" w:type="dxa"/>
               <w:bottom w:w="25" w:type="dxa"/>
@@ -4535,7 +4363,6 @@
         <w:tc>
           <w:tcPr>
             <w:tcW w:type="dxa" w:w="3504"/>
-            <w:shd w:fill="F0F6F8"/>
             <w:tcMar>
               <w:top w:w="25" w:type="dxa"/>
               <w:bottom w:w="25" w:type="dxa"/>
@@ -4558,7 +4385,6 @@
         <w:tc>
           <w:tcPr>
             <w:tcW w:type="dxa" w:w="3504"/>
-            <w:shd w:fill="F0F6F8"/>
             <w:tcMar>
               <w:top w:w="25" w:type="dxa"/>
               <w:bottom w:w="25" w:type="dxa"/>
@@ -4579,7 +4405,6 @@
         <w:tc>
           <w:tcPr>
             <w:tcW w:type="dxa" w:w="3504"/>
-            <w:shd w:fill="F0F6F8"/>
             <w:tcMar>
               <w:top w:w="25" w:type="dxa"/>
               <w:bottom w:w="25" w:type="dxa"/>
@@ -4594,7 +4419,6 @@
         <w:tc>
           <w:tcPr>
             <w:tcW w:type="dxa" w:w="3504"/>
-            <w:shd w:fill="F0F6F8"/>
             <w:tcMar>
               <w:top w:w="25" w:type="dxa"/>
               <w:bottom w:w="25" w:type="dxa"/>
@@ -4635,7 +4459,6 @@
         <w:tc>
           <w:tcPr>
             <w:tcW w:type="dxa" w:w="5256"/>
-            <w:shd w:fill="F0F6F8"/>
             <w:tcMar>
               <w:top w:w="25" w:type="dxa"/>
               <w:bottom w:w="25" w:type="dxa"/>
@@ -4656,7 +4479,6 @@
         <w:tc>
           <w:tcPr>
             <w:tcW w:type="dxa" w:w="5256"/>
-            <w:shd w:fill="F0F6F8"/>
             <w:tcMar>
               <w:top w:w="25" w:type="dxa"/>
               <w:bottom w:w="25" w:type="dxa"/>
@@ -4679,7 +4501,6 @@
         <w:tc>
           <w:tcPr>
             <w:tcW w:type="dxa" w:w="5256"/>
-            <w:shd w:fill="F0F6F8"/>
             <w:tcMar>
               <w:top w:w="25" w:type="dxa"/>
               <w:bottom w:w="25" w:type="dxa"/>
@@ -4700,7 +4521,6 @@
         <w:tc>
           <w:tcPr>
             <w:tcW w:type="dxa" w:w="5256"/>
-            <w:shd w:fill="F0F6F8"/>
             <w:tcMar>
               <w:top w:w="25" w:type="dxa"/>
               <w:bottom w:w="25" w:type="dxa"/>
@@ -4748,7 +4568,6 @@
         <w:tc>
           <w:tcPr>
             <w:tcW w:type="dxa" w:w="3504"/>
-            <w:shd w:fill="F0F6F8"/>
             <w:tcMar>
               <w:top w:w="25" w:type="dxa"/>
               <w:bottom w:w="25" w:type="dxa"/>
@@ -4769,7 +4588,6 @@
         <w:tc>
           <w:tcPr>
             <w:tcW w:type="dxa" w:w="3504"/>
-            <w:shd w:fill="F0F6F8"/>
             <w:tcMar>
               <w:top w:w="25" w:type="dxa"/>
               <w:bottom w:w="25" w:type="dxa"/>
@@ -4790,7 +4608,6 @@
         <w:tc>
           <w:tcPr>
             <w:tcW w:type="dxa" w:w="3504"/>
-            <w:shd w:fill="F0F6F8"/>
             <w:tcMar>
               <w:top w:w="25" w:type="dxa"/>
               <w:bottom w:w="25" w:type="dxa"/>
@@ -4813,7 +4630,6 @@
         <w:tc>
           <w:tcPr>
             <w:tcW w:type="dxa" w:w="3504"/>
-            <w:shd w:fill="F0F6F8"/>
             <w:tcMar>
               <w:top w:w="25" w:type="dxa"/>
               <w:bottom w:w="25" w:type="dxa"/>
@@ -4834,7 +4650,6 @@
         <w:tc>
           <w:tcPr>
             <w:tcW w:type="dxa" w:w="3504"/>
-            <w:shd w:fill="F0F6F8"/>
             <w:tcMar>
               <w:top w:w="25" w:type="dxa"/>
               <w:bottom w:w="25" w:type="dxa"/>
@@ -4849,7 +4664,6 @@
         <w:tc>
           <w:tcPr>
             <w:tcW w:type="dxa" w:w="3504"/>
-            <w:shd w:fill="F0F6F8"/>
             <w:tcMar>
               <w:top w:w="25" w:type="dxa"/>
               <w:bottom w:w="25" w:type="dxa"/>
@@ -4891,7 +4705,6 @@
         <w:tc>
           <w:tcPr>
             <w:tcW w:type="dxa" w:w="3504"/>
-            <w:shd w:fill="F0F6F8"/>
             <w:tcMar>
               <w:top w:w="25" w:type="dxa"/>
               <w:bottom w:w="25" w:type="dxa"/>
@@ -4912,7 +4725,6 @@
         <w:tc>
           <w:tcPr>
             <w:tcW w:type="dxa" w:w="3504"/>
-            <w:shd w:fill="F0F6F8"/>
             <w:tcMar>
               <w:top w:w="25" w:type="dxa"/>
               <w:bottom w:w="25" w:type="dxa"/>
@@ -4933,7 +4745,6 @@
         <w:tc>
           <w:tcPr>
             <w:tcW w:type="dxa" w:w="3504"/>
-            <w:shd w:fill="F0F6F8"/>
             <w:tcMar>
               <w:top w:w="25" w:type="dxa"/>
               <w:bottom w:w="25" w:type="dxa"/>
@@ -4956,7 +4767,6 @@
         <w:tc>
           <w:tcPr>
             <w:tcW w:type="dxa" w:w="3504"/>
-            <w:shd w:fill="F0F6F8"/>
             <w:tcMar>
               <w:top w:w="25" w:type="dxa"/>
               <w:bottom w:w="25" w:type="dxa"/>
@@ -4977,7 +4787,6 @@
         <w:tc>
           <w:tcPr>
             <w:tcW w:type="dxa" w:w="3504"/>
-            <w:shd w:fill="F0F6F8"/>
             <w:tcMar>
               <w:top w:w="25" w:type="dxa"/>
               <w:bottom w:w="25" w:type="dxa"/>
@@ -4998,7 +4807,6 @@
         <w:tc>
           <w:tcPr>
             <w:tcW w:type="dxa" w:w="3504"/>
-            <w:shd w:fill="F0F6F8"/>
             <w:tcMar>
               <w:top w:w="25" w:type="dxa"/>
               <w:bottom w:w="25" w:type="dxa"/>
@@ -5021,7 +4829,6 @@
         <w:tc>
           <w:tcPr>
             <w:tcW w:type="dxa" w:w="3504"/>
-            <w:shd w:fill="F0F6F8"/>
             <w:tcMar>
               <w:top w:w="25" w:type="dxa"/>
               <w:bottom w:w="25" w:type="dxa"/>
@@ -5042,7 +4849,6 @@
         <w:tc>
           <w:tcPr>
             <w:tcW w:type="dxa" w:w="3504"/>
-            <w:shd w:fill="F0F6F8"/>
             <w:tcMar>
               <w:top w:w="25" w:type="dxa"/>
               <w:bottom w:w="25" w:type="dxa"/>
@@ -5063,7 +4869,6 @@
         <w:tc>
           <w:tcPr>
             <w:tcW w:type="dxa" w:w="3504"/>
-            <w:shd w:fill="F0F6F8"/>
             <w:tcMar>
               <w:top w:w="25" w:type="dxa"/>
               <w:bottom w:w="25" w:type="dxa"/>
@@ -5105,7 +4910,6 @@
         <w:tc>
           <w:tcPr>
             <w:tcW w:type="dxa" w:w="3504"/>
-            <w:shd w:fill="F0F6F8"/>
             <w:tcMar>
               <w:top w:w="25" w:type="dxa"/>
               <w:bottom w:w="25" w:type="dxa"/>
@@ -5126,7 +4930,6 @@
         <w:tc>
           <w:tcPr>
             <w:tcW w:type="dxa" w:w="3504"/>
-            <w:shd w:fill="F0F6F8"/>
             <w:tcMar>
               <w:top w:w="25" w:type="dxa"/>
               <w:bottom w:w="25" w:type="dxa"/>
@@ -5147,7 +4950,6 @@
         <w:tc>
           <w:tcPr>
             <w:tcW w:type="dxa" w:w="3504"/>
-            <w:shd w:fill="F0F6F8"/>
             <w:tcMar>
               <w:top w:w="25" w:type="dxa"/>
               <w:bottom w:w="25" w:type="dxa"/>
@@ -5170,7 +4972,6 @@
         <w:tc>
           <w:tcPr>
             <w:tcW w:type="dxa" w:w="3504"/>
-            <w:shd w:fill="F0F6F8"/>
             <w:tcMar>
               <w:top w:w="25" w:type="dxa"/>
               <w:bottom w:w="25" w:type="dxa"/>
@@ -5191,7 +4992,6 @@
         <w:tc>
           <w:tcPr>
             <w:tcW w:type="dxa" w:w="3504"/>
-            <w:shd w:fill="F0F6F8"/>
             <w:tcMar>
               <w:top w:w="25" w:type="dxa"/>
               <w:bottom w:w="25" w:type="dxa"/>
@@ -5206,7 +5006,6 @@
         <w:tc>
           <w:tcPr>
             <w:tcW w:type="dxa" w:w="3504"/>
-            <w:shd w:fill="F0F6F8"/>
             <w:tcMar>
               <w:top w:w="25" w:type="dxa"/>
               <w:bottom w:w="25" w:type="dxa"/>
@@ -5248,7 +5047,6 @@
         <w:tc>
           <w:tcPr>
             <w:tcW w:type="dxa" w:w="3504"/>
-            <w:shd w:fill="F0F6F8"/>
             <w:tcMar>
               <w:top w:w="25" w:type="dxa"/>
               <w:bottom w:w="25" w:type="dxa"/>
@@ -5269,7 +5067,6 @@
         <w:tc>
           <w:tcPr>
             <w:tcW w:type="dxa" w:w="3504"/>
-            <w:shd w:fill="F0F6F8"/>
             <w:tcMar>
               <w:top w:w="25" w:type="dxa"/>
               <w:bottom w:w="25" w:type="dxa"/>
@@ -5290,7 +5087,6 @@
         <w:tc>
           <w:tcPr>
             <w:tcW w:type="dxa" w:w="3504"/>
-            <w:shd w:fill="F0F6F8"/>
             <w:tcMar>
               <w:top w:w="25" w:type="dxa"/>
               <w:bottom w:w="25" w:type="dxa"/>
@@ -5313,7 +5109,6 @@
         <w:tc>
           <w:tcPr>
             <w:tcW w:type="dxa" w:w="3504"/>
-            <w:shd w:fill="F0F6F8"/>
             <w:tcMar>
               <w:top w:w="25" w:type="dxa"/>
               <w:bottom w:w="25" w:type="dxa"/>
@@ -5334,7 +5129,6 @@
         <w:tc>
           <w:tcPr>
             <w:tcW w:type="dxa" w:w="3504"/>
-            <w:shd w:fill="F0F6F8"/>
             <w:tcMar>
               <w:top w:w="25" w:type="dxa"/>
               <w:bottom w:w="25" w:type="dxa"/>
@@ -5355,7 +5149,6 @@
         <w:tc>
           <w:tcPr>
             <w:tcW w:type="dxa" w:w="3504"/>
-            <w:shd w:fill="F0F6F8"/>
             <w:tcMar>
               <w:top w:w="25" w:type="dxa"/>
               <w:bottom w:w="25" w:type="dxa"/>
@@ -5397,7 +5190,6 @@
         <w:tc>
           <w:tcPr>
             <w:tcW w:type="dxa" w:w="3504"/>
-            <w:shd w:fill="F0F6F8"/>
             <w:tcMar>
               <w:top w:w="25" w:type="dxa"/>
               <w:bottom w:w="25" w:type="dxa"/>
@@ -5418,7 +5210,6 @@
         <w:tc>
           <w:tcPr>
             <w:tcW w:type="dxa" w:w="3504"/>
-            <w:shd w:fill="F0F6F8"/>
             <w:tcMar>
               <w:top w:w="25" w:type="dxa"/>
               <w:bottom w:w="25" w:type="dxa"/>
@@ -5439,7 +5230,6 @@
         <w:tc>
           <w:tcPr>
             <w:tcW w:type="dxa" w:w="3504"/>
-            <w:shd w:fill="F0F6F8"/>
             <w:tcMar>
               <w:top w:w="25" w:type="dxa"/>
               <w:bottom w:w="25" w:type="dxa"/>
@@ -5462,7 +5252,6 @@
         <w:tc>
           <w:tcPr>
             <w:tcW w:type="dxa" w:w="3504"/>
-            <w:shd w:fill="F0F6F8"/>
             <w:tcMar>
               <w:top w:w="25" w:type="dxa"/>
               <w:bottom w:w="25" w:type="dxa"/>
@@ -5483,7 +5272,6 @@
         <w:tc>
           <w:tcPr>
             <w:tcW w:type="dxa" w:w="3504"/>
-            <w:shd w:fill="F0F6F8"/>
             <w:tcMar>
               <w:top w:w="25" w:type="dxa"/>
               <w:bottom w:w="25" w:type="dxa"/>
@@ -5498,7 +5286,6 @@
         <w:tc>
           <w:tcPr>
             <w:tcW w:type="dxa" w:w="3504"/>
-            <w:shd w:fill="F0F6F8"/>
             <w:tcMar>
               <w:top w:w="25" w:type="dxa"/>
               <w:bottom w:w="25" w:type="dxa"/>
@@ -5540,7 +5327,6 @@
         <w:tc>
           <w:tcPr>
             <w:tcW w:type="dxa" w:w="3504"/>
-            <w:shd w:fill="F0F6F8"/>
             <w:tcMar>
               <w:top w:w="25" w:type="dxa"/>
               <w:bottom w:w="25" w:type="dxa"/>
@@ -5561,7 +5347,6 @@
         <w:tc>
           <w:tcPr>
             <w:tcW w:type="dxa" w:w="3504"/>
-            <w:shd w:fill="F0F6F8"/>
             <w:tcMar>
               <w:top w:w="25" w:type="dxa"/>
               <w:bottom w:w="25" w:type="dxa"/>
@@ -5582,7 +5367,6 @@
         <w:tc>
           <w:tcPr>
             <w:tcW w:type="dxa" w:w="3504"/>
-            <w:shd w:fill="F0F6F8"/>
             <w:tcMar>
               <w:top w:w="25" w:type="dxa"/>
               <w:bottom w:w="25" w:type="dxa"/>
@@ -5605,7 +5389,6 @@
         <w:tc>
           <w:tcPr>
             <w:tcW w:type="dxa" w:w="3504"/>
-            <w:shd w:fill="F0F6F8"/>
             <w:tcMar>
               <w:top w:w="25" w:type="dxa"/>
               <w:bottom w:w="25" w:type="dxa"/>
@@ -5626,7 +5409,6 @@
         <w:tc>
           <w:tcPr>
             <w:tcW w:type="dxa" w:w="3504"/>
-            <w:shd w:fill="F0F6F8"/>
             <w:tcMar>
               <w:top w:w="25" w:type="dxa"/>
               <w:bottom w:w="25" w:type="dxa"/>
@@ -5641,7 +5423,6 @@
         <w:tc>
           <w:tcPr>
             <w:tcW w:type="dxa" w:w="3504"/>
-            <w:shd w:fill="F0F6F8"/>
             <w:tcMar>
               <w:top w:w="25" w:type="dxa"/>
               <w:bottom w:w="25" w:type="dxa"/>
@@ -5683,7 +5464,6 @@
         <w:tc>
           <w:tcPr>
             <w:tcW w:type="dxa" w:w="3504"/>
-            <w:shd w:fill="F0F6F8"/>
             <w:tcMar>
               <w:top w:w="25" w:type="dxa"/>
               <w:bottom w:w="25" w:type="dxa"/>
@@ -5704,7 +5484,6 @@
         <w:tc>
           <w:tcPr>
             <w:tcW w:type="dxa" w:w="3504"/>
-            <w:shd w:fill="F0F6F8"/>
             <w:tcMar>
               <w:top w:w="25" w:type="dxa"/>
               <w:bottom w:w="25" w:type="dxa"/>
@@ -5725,7 +5504,6 @@
         <w:tc>
           <w:tcPr>
             <w:tcW w:type="dxa" w:w="3504"/>
-            <w:shd w:fill="F0F6F8"/>
             <w:tcMar>
               <w:top w:w="25" w:type="dxa"/>
               <w:bottom w:w="25" w:type="dxa"/>
@@ -5748,7 +5526,6 @@
         <w:tc>
           <w:tcPr>
             <w:tcW w:type="dxa" w:w="3504"/>
-            <w:shd w:fill="F0F6F8"/>
             <w:tcMar>
               <w:top w:w="25" w:type="dxa"/>
               <w:bottom w:w="25" w:type="dxa"/>
@@ -5769,7 +5546,6 @@
         <w:tc>
           <w:tcPr>
             <w:tcW w:type="dxa" w:w="3504"/>
-            <w:shd w:fill="F0F6F8"/>
             <w:tcMar>
               <w:top w:w="25" w:type="dxa"/>
               <w:bottom w:w="25" w:type="dxa"/>
@@ -5784,7 +5560,6 @@
         <w:tc>
           <w:tcPr>
             <w:tcW w:type="dxa" w:w="3504"/>
-            <w:shd w:fill="F0F6F8"/>
             <w:tcMar>
               <w:top w:w="25" w:type="dxa"/>
               <w:bottom w:w="25" w:type="dxa"/>
@@ -5885,7 +5660,6 @@
         <w:tc>
           <w:tcPr>
             <w:tcW w:type="dxa" w:w="5256"/>
-            <w:shd w:fill="F0F6F8"/>
             <w:tcMar>
               <w:top w:w="25" w:type="dxa"/>
               <w:bottom w:w="25" w:type="dxa"/>
@@ -5906,7 +5680,6 @@
         <w:tc>
           <w:tcPr>
             <w:tcW w:type="dxa" w:w="5256"/>
-            <w:shd w:fill="F0F6F8"/>
             <w:tcMar>
               <w:top w:w="25" w:type="dxa"/>
               <w:bottom w:w="25" w:type="dxa"/>
@@ -5929,7 +5702,6 @@
         <w:tc>
           <w:tcPr>
             <w:tcW w:type="dxa" w:w="5256"/>
-            <w:shd w:fill="F0F6F8"/>
             <w:tcMar>
               <w:top w:w="25" w:type="dxa"/>
               <w:bottom w:w="25" w:type="dxa"/>
@@ -5950,7 +5722,6 @@
         <w:tc>
           <w:tcPr>
             <w:tcW w:type="dxa" w:w="5256"/>
-            <w:shd w:fill="F0F6F8"/>
             <w:tcMar>
               <w:top w:w="25" w:type="dxa"/>
               <w:bottom w:w="25" w:type="dxa"/>
@@ -5973,7 +5744,6 @@
         <w:tc>
           <w:tcPr>
             <w:tcW w:type="dxa" w:w="5256"/>
-            <w:shd w:fill="F0F6F8"/>
             <w:tcMar>
               <w:top w:w="25" w:type="dxa"/>
               <w:bottom w:w="25" w:type="dxa"/>
@@ -5994,7 +5764,6 @@
         <w:tc>
           <w:tcPr>
             <w:tcW w:type="dxa" w:w="5256"/>
-            <w:shd w:fill="F0F6F8"/>
             <w:tcMar>
               <w:top w:w="25" w:type="dxa"/>
               <w:bottom w:w="25" w:type="dxa"/>
@@ -6017,7 +5786,6 @@
         <w:tc>
           <w:tcPr>
             <w:tcW w:type="dxa" w:w="5256"/>
-            <w:shd w:fill="F0F6F8"/>
             <w:tcMar>
               <w:top w:w="25" w:type="dxa"/>
               <w:bottom w:w="25" w:type="dxa"/>
@@ -6038,7 +5806,6 @@
         <w:tc>
           <w:tcPr>
             <w:tcW w:type="dxa" w:w="5256"/>
-            <w:shd w:fill="F0F6F8"/>
             <w:tcMar>
               <w:top w:w="25" w:type="dxa"/>
               <w:bottom w:w="25" w:type="dxa"/>
@@ -6086,7 +5853,6 @@
         <w:tc>
           <w:tcPr>
             <w:tcW w:type="dxa" w:w="3504"/>
-            <w:shd w:fill="F0F6F8"/>
             <w:tcMar>
               <w:top w:w="25" w:type="dxa"/>
               <w:bottom w:w="25" w:type="dxa"/>
@@ -6107,7 +5873,6 @@
         <w:tc>
           <w:tcPr>
             <w:tcW w:type="dxa" w:w="3504"/>
-            <w:shd w:fill="F0F6F8"/>
             <w:tcMar>
               <w:top w:w="25" w:type="dxa"/>
               <w:bottom w:w="25" w:type="dxa"/>
@@ -6128,7 +5893,6 @@
         <w:tc>
           <w:tcPr>
             <w:tcW w:type="dxa" w:w="3504"/>
-            <w:shd w:fill="F0F6F8"/>
             <w:tcMar>
               <w:top w:w="25" w:type="dxa"/>
               <w:bottom w:w="25" w:type="dxa"/>
@@ -6151,7 +5915,6 @@
         <w:tc>
           <w:tcPr>
             <w:tcW w:type="dxa" w:w="3504"/>
-            <w:shd w:fill="F0F6F8"/>
             <w:tcMar>
               <w:top w:w="25" w:type="dxa"/>
               <w:bottom w:w="25" w:type="dxa"/>
@@ -6172,7 +5935,6 @@
         <w:tc>
           <w:tcPr>
             <w:tcW w:type="dxa" w:w="3504"/>
-            <w:shd w:fill="F0F6F8"/>
             <w:tcMar>
               <w:top w:w="25" w:type="dxa"/>
               <w:bottom w:w="25" w:type="dxa"/>
@@ -6193,7 +5955,6 @@
         <w:tc>
           <w:tcPr>
             <w:tcW w:type="dxa" w:w="3504"/>
-            <w:shd w:fill="F0F6F8"/>
             <w:tcMar>
               <w:top w:w="25" w:type="dxa"/>
               <w:bottom w:w="25" w:type="dxa"/>
@@ -6216,7 +5977,6 @@
         <w:tc>
           <w:tcPr>
             <w:tcW w:type="dxa" w:w="3504"/>
-            <w:shd w:fill="F0F6F8"/>
             <w:tcMar>
               <w:top w:w="25" w:type="dxa"/>
               <w:bottom w:w="25" w:type="dxa"/>
@@ -6237,7 +5997,6 @@
         <w:tc>
           <w:tcPr>
             <w:tcW w:type="dxa" w:w="3504"/>
-            <w:shd w:fill="F0F6F8"/>
             <w:tcMar>
               <w:top w:w="25" w:type="dxa"/>
               <w:bottom w:w="25" w:type="dxa"/>
@@ -6258,7 +6017,6 @@
         <w:tc>
           <w:tcPr>
             <w:tcW w:type="dxa" w:w="3504"/>
-            <w:shd w:fill="F0F6F8"/>
             <w:tcMar>
               <w:top w:w="25" w:type="dxa"/>
               <w:bottom w:w="25" w:type="dxa"/>
@@ -6299,7 +6057,6 @@
         <w:tc>
           <w:tcPr>
             <w:tcW w:type="dxa" w:w="5256"/>
-            <w:shd w:fill="F0F6F8"/>
             <w:tcMar>
               <w:top w:w="25" w:type="dxa"/>
               <w:bottom w:w="25" w:type="dxa"/>
@@ -6320,7 +6077,6 @@
         <w:tc>
           <w:tcPr>
             <w:tcW w:type="dxa" w:w="5256"/>
-            <w:shd w:fill="F0F6F8"/>
             <w:tcMar>
               <w:top w:w="25" w:type="dxa"/>
               <w:bottom w:w="25" w:type="dxa"/>
@@ -6343,7 +6099,6 @@
         <w:tc>
           <w:tcPr>
             <w:tcW w:type="dxa" w:w="5256"/>
-            <w:shd w:fill="F0F6F8"/>
             <w:tcMar>
               <w:top w:w="25" w:type="dxa"/>
               <w:bottom w:w="25" w:type="dxa"/>
@@ -6364,7 +6119,6 @@
         <w:tc>
           <w:tcPr>
             <w:tcW w:type="dxa" w:w="5256"/>
-            <w:shd w:fill="F0F6F8"/>
             <w:tcMar>
               <w:top w:w="25" w:type="dxa"/>
               <w:bottom w:w="25" w:type="dxa"/>
@@ -6387,7 +6141,6 @@
         <w:tc>
           <w:tcPr>
             <w:tcW w:type="dxa" w:w="5256"/>
-            <w:shd w:fill="F0F6F8"/>
             <w:tcMar>
               <w:top w:w="25" w:type="dxa"/>
               <w:bottom w:w="25" w:type="dxa"/>
@@ -6408,7 +6161,6 @@
         <w:tc>
           <w:tcPr>
             <w:tcW w:type="dxa" w:w="5256"/>
-            <w:shd w:fill="F0F6F8"/>
             <w:tcMar>
               <w:top w:w="25" w:type="dxa"/>
               <w:bottom w:w="25" w:type="dxa"/>
@@ -6449,7 +6201,6 @@
         <w:tc>
           <w:tcPr>
             <w:tcW w:type="dxa" w:w="5256"/>
-            <w:shd w:fill="F0F6F8"/>
             <w:tcMar>
               <w:top w:w="25" w:type="dxa"/>
               <w:bottom w:w="25" w:type="dxa"/>
@@ -6470,7 +6221,6 @@
         <w:tc>
           <w:tcPr>
             <w:tcW w:type="dxa" w:w="5256"/>
-            <w:shd w:fill="F0F6F8"/>
             <w:tcMar>
               <w:top w:w="25" w:type="dxa"/>
               <w:bottom w:w="25" w:type="dxa"/>
@@ -6493,7 +6243,6 @@
         <w:tc>
           <w:tcPr>
             <w:tcW w:type="dxa" w:w="5256"/>
-            <w:shd w:fill="F0F6F8"/>
             <w:tcMar>
               <w:top w:w="25" w:type="dxa"/>
               <w:bottom w:w="25" w:type="dxa"/>
@@ -6514,7 +6263,6 @@
         <w:tc>
           <w:tcPr>
             <w:tcW w:type="dxa" w:w="5256"/>
-            <w:shd w:fill="F0F6F8"/>
             <w:tcMar>
               <w:top w:w="25" w:type="dxa"/>
               <w:bottom w:w="25" w:type="dxa"/>
@@ -6537,7 +6285,6 @@
         <w:tc>
           <w:tcPr>
             <w:tcW w:type="dxa" w:w="5256"/>
-            <w:shd w:fill="F0F6F8"/>
             <w:tcMar>
               <w:top w:w="25" w:type="dxa"/>
               <w:bottom w:w="25" w:type="dxa"/>
@@ -6558,7 +6305,6 @@
         <w:tc>
           <w:tcPr>
             <w:tcW w:type="dxa" w:w="5256"/>
-            <w:shd w:fill="F0F6F8"/>
             <w:tcMar>
               <w:top w:w="25" w:type="dxa"/>
               <w:bottom w:w="25" w:type="dxa"/>
@@ -6600,7 +6346,6 @@
         <w:tc>
           <w:tcPr>
             <w:tcW w:type="dxa" w:w="3504"/>
-            <w:shd w:fill="F0F6F8"/>
             <w:tcMar>
               <w:top w:w="25" w:type="dxa"/>
               <w:bottom w:w="25" w:type="dxa"/>
@@ -6621,7 +6366,6 @@
         <w:tc>
           <w:tcPr>
             <w:tcW w:type="dxa" w:w="3504"/>
-            <w:shd w:fill="F0F6F8"/>
             <w:tcMar>
               <w:top w:w="25" w:type="dxa"/>
               <w:bottom w:w="25" w:type="dxa"/>
@@ -6642,7 +6386,6 @@
         <w:tc>
           <w:tcPr>
             <w:tcW w:type="dxa" w:w="3504"/>
-            <w:shd w:fill="F0F6F8"/>
             <w:tcMar>
               <w:top w:w="25" w:type="dxa"/>
               <w:bottom w:w="25" w:type="dxa"/>
@@ -6665,7 +6408,6 @@
         <w:tc>
           <w:tcPr>
             <w:tcW w:type="dxa" w:w="3504"/>
-            <w:shd w:fill="F0F6F8"/>
             <w:tcMar>
               <w:top w:w="25" w:type="dxa"/>
               <w:bottom w:w="25" w:type="dxa"/>
@@ -6686,7 +6428,6 @@
         <w:tc>
           <w:tcPr>
             <w:tcW w:type="dxa" w:w="3504"/>
-            <w:shd w:fill="F0F6F8"/>
             <w:tcMar>
               <w:top w:w="25" w:type="dxa"/>
               <w:bottom w:w="25" w:type="dxa"/>
@@ -6707,7 +6448,6 @@
         <w:tc>
           <w:tcPr>
             <w:tcW w:type="dxa" w:w="3504"/>
-            <w:shd w:fill="F0F6F8"/>
             <w:tcMar>
               <w:top w:w="25" w:type="dxa"/>
               <w:bottom w:w="25" w:type="dxa"/>
@@ -6730,7 +6470,6 @@
         <w:tc>
           <w:tcPr>
             <w:tcW w:type="dxa" w:w="3504"/>
-            <w:shd w:fill="F0F6F8"/>
             <w:tcMar>
               <w:top w:w="25" w:type="dxa"/>
               <w:bottom w:w="25" w:type="dxa"/>
@@ -6751,7 +6490,6 @@
         <w:tc>
           <w:tcPr>
             <w:tcW w:type="dxa" w:w="3504"/>
-            <w:shd w:fill="F0F6F8"/>
             <w:tcMar>
               <w:top w:w="25" w:type="dxa"/>
               <w:bottom w:w="25" w:type="dxa"/>
@@ -6772,7 +6510,6 @@
         <w:tc>
           <w:tcPr>
             <w:tcW w:type="dxa" w:w="3504"/>
-            <w:shd w:fill="F0F6F8"/>
             <w:tcMar>
               <w:top w:w="25" w:type="dxa"/>
               <w:bottom w:w="25" w:type="dxa"/>
@@ -6814,7 +6551,6 @@
         <w:tc>
           <w:tcPr>
             <w:tcW w:type="dxa" w:w="3504"/>
-            <w:shd w:fill="F0F6F8"/>
             <w:tcMar>
               <w:top w:w="25" w:type="dxa"/>
               <w:bottom w:w="25" w:type="dxa"/>
@@ -6835,7 +6571,6 @@
         <w:tc>
           <w:tcPr>
             <w:tcW w:type="dxa" w:w="3504"/>
-            <w:shd w:fill="F0F6F8"/>
             <w:tcMar>
               <w:top w:w="25" w:type="dxa"/>
               <w:bottom w:w="25" w:type="dxa"/>
@@ -6856,7 +6591,6 @@
         <w:tc>
           <w:tcPr>
             <w:tcW w:type="dxa" w:w="3504"/>
-            <w:shd w:fill="F0F6F8"/>
             <w:tcMar>
               <w:top w:w="25" w:type="dxa"/>
               <w:bottom w:w="25" w:type="dxa"/>
@@ -6879,7 +6613,6 @@
         <w:tc>
           <w:tcPr>
             <w:tcW w:type="dxa" w:w="3504"/>
-            <w:shd w:fill="F0F6F8"/>
             <w:tcMar>
               <w:top w:w="25" w:type="dxa"/>
               <w:bottom w:w="25" w:type="dxa"/>
@@ -6900,7 +6633,6 @@
         <w:tc>
           <w:tcPr>
             <w:tcW w:type="dxa" w:w="3504"/>
-            <w:shd w:fill="F0F6F8"/>
             <w:tcMar>
               <w:top w:w="25" w:type="dxa"/>
               <w:bottom w:w="25" w:type="dxa"/>
@@ -6921,7 +6653,6 @@
         <w:tc>
           <w:tcPr>
             <w:tcW w:type="dxa" w:w="3504"/>
-            <w:shd w:fill="F0F6F8"/>
             <w:tcMar>
               <w:top w:w="25" w:type="dxa"/>
               <w:bottom w:w="25" w:type="dxa"/>
@@ -6969,7 +6700,6 @@
         <w:tc>
           <w:tcPr>
             <w:tcW w:type="dxa" w:w="3504"/>
-            <w:shd w:fill="F0F6F8"/>
             <w:tcMar>
               <w:top w:w="25" w:type="dxa"/>
               <w:bottom w:w="25" w:type="dxa"/>
@@ -6990,7 +6720,6 @@
         <w:tc>
           <w:tcPr>
             <w:tcW w:type="dxa" w:w="3504"/>
-            <w:shd w:fill="F0F6F8"/>
             <w:tcMar>
               <w:top w:w="25" w:type="dxa"/>
               <w:bottom w:w="25" w:type="dxa"/>
@@ -7011,7 +6740,6 @@
         <w:tc>
           <w:tcPr>
             <w:tcW w:type="dxa" w:w="3504"/>
-            <w:shd w:fill="F0F6F8"/>
             <w:tcMar>
               <w:top w:w="25" w:type="dxa"/>
               <w:bottom w:w="25" w:type="dxa"/>
@@ -7059,7 +6787,6 @@
         <w:tc>
           <w:tcPr>
             <w:tcW w:type="dxa" w:w="3504"/>
-            <w:shd w:fill="F0F6F8"/>
             <w:tcMar>
               <w:top w:w="25" w:type="dxa"/>
               <w:bottom w:w="25" w:type="dxa"/>
@@ -7080,7 +6807,6 @@
         <w:tc>
           <w:tcPr>
             <w:tcW w:type="dxa" w:w="3504"/>
-            <w:shd w:fill="F0F6F8"/>
             <w:tcMar>
               <w:top w:w="25" w:type="dxa"/>
               <w:bottom w:w="25" w:type="dxa"/>
@@ -7101,7 +6827,6 @@
         <w:tc>
           <w:tcPr>
             <w:tcW w:type="dxa" w:w="3504"/>
-            <w:shd w:fill="F0F6F8"/>
             <w:tcMar>
               <w:top w:w="25" w:type="dxa"/>
               <w:bottom w:w="25" w:type="dxa"/>
@@ -7124,7 +6849,6 @@
         <w:tc>
           <w:tcPr>
             <w:tcW w:type="dxa" w:w="3504"/>
-            <w:shd w:fill="F0F6F8"/>
             <w:tcMar>
               <w:top w:w="25" w:type="dxa"/>
               <w:bottom w:w="25" w:type="dxa"/>
@@ -7145,7 +6869,6 @@
         <w:tc>
           <w:tcPr>
             <w:tcW w:type="dxa" w:w="3504"/>
-            <w:shd w:fill="F0F6F8"/>
             <w:tcMar>
               <w:top w:w="25" w:type="dxa"/>
               <w:bottom w:w="25" w:type="dxa"/>
@@ -7166,7 +6889,6 @@
         <w:tc>
           <w:tcPr>
             <w:tcW w:type="dxa" w:w="3504"/>
-            <w:shd w:fill="F0F6F8"/>
             <w:tcMar>
               <w:top w:w="25" w:type="dxa"/>
               <w:bottom w:w="25" w:type="dxa"/>
@@ -7214,7 +6936,6 @@
         <w:tc>
           <w:tcPr>
             <w:tcW w:type="dxa" w:w="3504"/>
-            <w:shd w:fill="F0F6F8"/>
             <w:tcMar>
               <w:top w:w="25" w:type="dxa"/>
               <w:bottom w:w="25" w:type="dxa"/>
@@ -7235,7 +6956,6 @@
         <w:tc>
           <w:tcPr>
             <w:tcW w:type="dxa" w:w="3504"/>
-            <w:shd w:fill="F0F6F8"/>
             <w:tcMar>
               <w:top w:w="25" w:type="dxa"/>
               <w:bottom w:w="25" w:type="dxa"/>
@@ -7256,7 +6976,6 @@
         <w:tc>
           <w:tcPr>
             <w:tcW w:type="dxa" w:w="3504"/>
-            <w:shd w:fill="F0F6F8"/>
             <w:tcMar>
               <w:top w:w="25" w:type="dxa"/>
               <w:bottom w:w="25" w:type="dxa"/>
@@ -7279,7 +6998,6 @@
         <w:tc>
           <w:tcPr>
             <w:tcW w:type="dxa" w:w="3504"/>
-            <w:shd w:fill="F0F6F8"/>
             <w:tcMar>
               <w:top w:w="25" w:type="dxa"/>
               <w:bottom w:w="25" w:type="dxa"/>
@@ -7300,7 +7018,6 @@
         <w:tc>
           <w:tcPr>
             <w:tcW w:type="dxa" w:w="3504"/>
-            <w:shd w:fill="F0F6F8"/>
             <w:tcMar>
               <w:top w:w="25" w:type="dxa"/>
               <w:bottom w:w="25" w:type="dxa"/>
@@ -7315,7 +7032,6 @@
         <w:tc>
           <w:tcPr>
             <w:tcW w:type="dxa" w:w="3504"/>
-            <w:shd w:fill="F0F6F8"/>
             <w:tcMar>
               <w:top w:w="25" w:type="dxa"/>
               <w:bottom w:w="25" w:type="dxa"/>
@@ -7426,7 +7142,6 @@
         <w:tc>
           <w:tcPr>
             <w:tcW w:type="dxa" w:w="3504"/>
-            <w:shd w:fill="F0F6F8"/>
             <w:tcMar>
               <w:top w:w="25" w:type="dxa"/>
               <w:bottom w:w="25" w:type="dxa"/>
@@ -7447,7 +7162,6 @@
         <w:tc>
           <w:tcPr>
             <w:tcW w:type="dxa" w:w="3504"/>
-            <w:shd w:fill="F0F6F8"/>
             <w:tcMar>
               <w:top w:w="25" w:type="dxa"/>
               <w:bottom w:w="25" w:type="dxa"/>
@@ -7468,7 +7182,6 @@
         <w:tc>
           <w:tcPr>
             <w:tcW w:type="dxa" w:w="3504"/>
-            <w:shd w:fill="F0F6F8"/>
             <w:tcMar>
               <w:top w:w="25" w:type="dxa"/>
               <w:bottom w:w="25" w:type="dxa"/>
@@ -7491,7 +7204,6 @@
         <w:tc>
           <w:tcPr>
             <w:tcW w:type="dxa" w:w="3504"/>
-            <w:shd w:fill="F0F6F8"/>
             <w:tcMar>
               <w:top w:w="25" w:type="dxa"/>
               <w:bottom w:w="25" w:type="dxa"/>
@@ -7512,7 +7224,6 @@
         <w:tc>
           <w:tcPr>
             <w:tcW w:type="dxa" w:w="3504"/>
-            <w:shd w:fill="F0F6F8"/>
             <w:tcMar>
               <w:top w:w="25" w:type="dxa"/>
               <w:bottom w:w="25" w:type="dxa"/>
@@ -7533,7 +7244,6 @@
         <w:tc>
           <w:tcPr>
             <w:tcW w:type="dxa" w:w="3504"/>
-            <w:shd w:fill="F0F6F8"/>
             <w:tcMar>
               <w:top w:w="25" w:type="dxa"/>
               <w:bottom w:w="25" w:type="dxa"/>
@@ -7574,7 +7284,6 @@
         <w:tc>
           <w:tcPr>
             <w:tcW w:type="dxa" w:w="5256"/>
-            <w:shd w:fill="F0F6F8"/>
             <w:tcMar>
               <w:top w:w="25" w:type="dxa"/>
               <w:bottom w:w="25" w:type="dxa"/>
@@ -7595,7 +7304,6 @@
         <w:tc>
           <w:tcPr>
             <w:tcW w:type="dxa" w:w="5256"/>
-            <w:shd w:fill="F0F6F8"/>
             <w:tcMar>
               <w:top w:w="25" w:type="dxa"/>
               <w:bottom w:w="25" w:type="dxa"/>
@@ -7618,7 +7326,6 @@
         <w:tc>
           <w:tcPr>
             <w:tcW w:type="dxa" w:w="5256"/>
-            <w:shd w:fill="F0F6F8"/>
             <w:tcMar>
               <w:top w:w="25" w:type="dxa"/>
               <w:bottom w:w="25" w:type="dxa"/>
@@ -7639,7 +7346,6 @@
         <w:tc>
           <w:tcPr>
             <w:tcW w:type="dxa" w:w="5256"/>
-            <w:shd w:fill="F0F6F8"/>
             <w:tcMar>
               <w:top w:w="25" w:type="dxa"/>
               <w:bottom w:w="25" w:type="dxa"/>
@@ -7662,7 +7368,6 @@
         <w:tc>
           <w:tcPr>
             <w:tcW w:type="dxa" w:w="5256"/>
-            <w:shd w:fill="F0F6F8"/>
             <w:tcMar>
               <w:top w:w="25" w:type="dxa"/>
               <w:bottom w:w="25" w:type="dxa"/>
@@ -7683,7 +7388,6 @@
         <w:tc>
           <w:tcPr>
             <w:tcW w:type="dxa" w:w="5256"/>
-            <w:shd w:fill="F0F6F8"/>
             <w:tcMar>
               <w:top w:w="25" w:type="dxa"/>
               <w:bottom w:w="25" w:type="dxa"/>
@@ -7706,7 +7410,6 @@
         <w:tc>
           <w:tcPr>
             <w:tcW w:type="dxa" w:w="5256"/>
-            <w:shd w:fill="F0F6F8"/>
             <w:tcMar>
               <w:top w:w="25" w:type="dxa"/>
               <w:bottom w:w="25" w:type="dxa"/>
@@ -7727,7 +7430,6 @@
         <w:tc>
           <w:tcPr>
             <w:tcW w:type="dxa" w:w="5256"/>
-            <w:shd w:fill="F0F6F8"/>
             <w:tcMar>
               <w:top w:w="25" w:type="dxa"/>
               <w:bottom w:w="25" w:type="dxa"/>
@@ -7750,7 +7452,6 @@
         <w:tc>
           <w:tcPr>
             <w:tcW w:type="dxa" w:w="5256"/>
-            <w:shd w:fill="F0F6F8"/>
             <w:tcMar>
               <w:top w:w="25" w:type="dxa"/>
               <w:bottom w:w="25" w:type="dxa"/>
@@ -7771,7 +7472,6 @@
         <w:tc>
           <w:tcPr>
             <w:tcW w:type="dxa" w:w="5256"/>
-            <w:shd w:fill="F0F6F8"/>
             <w:tcMar>
               <w:top w:w="25" w:type="dxa"/>
               <w:bottom w:w="25" w:type="dxa"/>
@@ -7794,7 +7494,6 @@
         <w:tc>
           <w:tcPr>
             <w:tcW w:type="dxa" w:w="5256"/>
-            <w:shd w:fill="F0F6F8"/>
             <w:tcMar>
               <w:top w:w="25" w:type="dxa"/>
               <w:bottom w:w="25" w:type="dxa"/>
@@ -7815,7 +7514,6 @@
         <w:tc>
           <w:tcPr>
             <w:tcW w:type="dxa" w:w="5256"/>
-            <w:shd w:fill="F0F6F8"/>
             <w:tcMar>
               <w:top w:w="25" w:type="dxa"/>
               <w:bottom w:w="25" w:type="dxa"/>
@@ -7863,7 +7561,6 @@
         <w:tc>
           <w:tcPr>
             <w:tcW w:type="dxa" w:w="3504"/>
-            <w:shd w:fill="F0F6F8"/>
             <w:tcMar>
               <w:top w:w="25" w:type="dxa"/>
               <w:bottom w:w="25" w:type="dxa"/>
@@ -7884,7 +7581,6 @@
         <w:tc>
           <w:tcPr>
             <w:tcW w:type="dxa" w:w="3504"/>
-            <w:shd w:fill="F0F6F8"/>
             <w:tcMar>
               <w:top w:w="25" w:type="dxa"/>
               <w:bottom w:w="25" w:type="dxa"/>
@@ -7905,7 +7601,6 @@
         <w:tc>
           <w:tcPr>
             <w:tcW w:type="dxa" w:w="3504"/>
-            <w:shd w:fill="F0F6F8"/>
             <w:tcMar>
               <w:top w:w="25" w:type="dxa"/>
               <w:bottom w:w="25" w:type="dxa"/>
@@ -7928,7 +7623,6 @@
         <w:tc>
           <w:tcPr>
             <w:tcW w:type="dxa" w:w="3504"/>
-            <w:shd w:fill="F0F6F8"/>
             <w:tcMar>
               <w:top w:w="25" w:type="dxa"/>
               <w:bottom w:w="25" w:type="dxa"/>
@@ -7949,7 +7643,6 @@
         <w:tc>
           <w:tcPr>
             <w:tcW w:type="dxa" w:w="3504"/>
-            <w:shd w:fill="F0F6F8"/>
             <w:tcMar>
               <w:top w:w="25" w:type="dxa"/>
               <w:bottom w:w="25" w:type="dxa"/>
@@ -7970,7 +7663,6 @@
         <w:tc>
           <w:tcPr>
             <w:tcW w:type="dxa" w:w="3504"/>
-            <w:shd w:fill="F0F6F8"/>
             <w:tcMar>
               <w:top w:w="25" w:type="dxa"/>
               <w:bottom w:w="25" w:type="dxa"/>
@@ -7993,7 +7685,6 @@
         <w:tc>
           <w:tcPr>
             <w:tcW w:type="dxa" w:w="3504"/>
-            <w:shd w:fill="F0F6F8"/>
             <w:tcMar>
               <w:top w:w="25" w:type="dxa"/>
               <w:bottom w:w="25" w:type="dxa"/>
@@ -8014,7 +7705,6 @@
         <w:tc>
           <w:tcPr>
             <w:tcW w:type="dxa" w:w="3504"/>
-            <w:shd w:fill="F0F6F8"/>
             <w:tcMar>
               <w:top w:w="25" w:type="dxa"/>
               <w:bottom w:w="25" w:type="dxa"/>
@@ -8035,7 +7725,6 @@
         <w:tc>
           <w:tcPr>
             <w:tcW w:type="dxa" w:w="3504"/>
-            <w:shd w:fill="F0F6F8"/>
             <w:tcMar>
               <w:top w:w="25" w:type="dxa"/>
               <w:bottom w:w="25" w:type="dxa"/>
@@ -8058,7 +7747,6 @@
         <w:tc>
           <w:tcPr>
             <w:tcW w:type="dxa" w:w="3504"/>
-            <w:shd w:fill="F0F6F8"/>
             <w:tcMar>
               <w:top w:w="25" w:type="dxa"/>
               <w:bottom w:w="25" w:type="dxa"/>
@@ -8079,7 +7767,6 @@
         <w:tc>
           <w:tcPr>
             <w:tcW w:type="dxa" w:w="3504"/>
-            <w:shd w:fill="F0F6F8"/>
             <w:tcMar>
               <w:top w:w="25" w:type="dxa"/>
               <w:bottom w:w="25" w:type="dxa"/>
@@ -8094,7 +7781,6 @@
         <w:tc>
           <w:tcPr>
             <w:tcW w:type="dxa" w:w="3504"/>
-            <w:shd w:fill="F0F6F8"/>
             <w:tcMar>
               <w:top w:w="25" w:type="dxa"/>
               <w:bottom w:w="25" w:type="dxa"/>
@@ -8136,7 +7822,6 @@
         <w:tc>
           <w:tcPr>
             <w:tcW w:type="dxa" w:w="3504"/>
-            <w:shd w:fill="F0F6F8"/>
             <w:tcMar>
               <w:top w:w="25" w:type="dxa"/>
               <w:bottom w:w="25" w:type="dxa"/>
@@ -8157,7 +7842,6 @@
         <w:tc>
           <w:tcPr>
             <w:tcW w:type="dxa" w:w="3504"/>
-            <w:shd w:fill="F0F6F8"/>
             <w:tcMar>
               <w:top w:w="25" w:type="dxa"/>
               <w:bottom w:w="25" w:type="dxa"/>
@@ -8178,7 +7862,6 @@
         <w:tc>
           <w:tcPr>
             <w:tcW w:type="dxa" w:w="3504"/>
-            <w:shd w:fill="F0F6F8"/>
             <w:tcMar>
               <w:top w:w="25" w:type="dxa"/>
               <w:bottom w:w="25" w:type="dxa"/>
@@ -8201,7 +7884,6 @@
         <w:tc>
           <w:tcPr>
             <w:tcW w:type="dxa" w:w="3504"/>
-            <w:shd w:fill="F0F6F8"/>
             <w:tcMar>
               <w:top w:w="25" w:type="dxa"/>
               <w:bottom w:w="25" w:type="dxa"/>
@@ -8222,7 +7904,6 @@
         <w:tc>
           <w:tcPr>
             <w:tcW w:type="dxa" w:w="3504"/>
-            <w:shd w:fill="F0F6F8"/>
             <w:tcMar>
               <w:top w:w="25" w:type="dxa"/>
               <w:bottom w:w="25" w:type="dxa"/>
@@ -8237,7 +7918,6 @@
         <w:tc>
           <w:tcPr>
             <w:tcW w:type="dxa" w:w="3504"/>
-            <w:shd w:fill="F0F6F8"/>
             <w:tcMar>
               <w:top w:w="25" w:type="dxa"/>
               <w:bottom w:w="25" w:type="dxa"/>
@@ -8278,7 +7958,6 @@
         <w:tc>
           <w:tcPr>
             <w:tcW w:type="dxa" w:w="5256"/>
-            <w:shd w:fill="F0F6F8"/>
             <w:tcMar>
               <w:top w:w="25" w:type="dxa"/>
               <w:bottom w:w="25" w:type="dxa"/>
@@ -8299,7 +7978,6 @@
         <w:tc>
           <w:tcPr>
             <w:tcW w:type="dxa" w:w="5256"/>
-            <w:shd w:fill="F0F6F8"/>
             <w:tcMar>
               <w:top w:w="25" w:type="dxa"/>
               <w:bottom w:w="25" w:type="dxa"/>
@@ -8322,7 +8000,6 @@
         <w:tc>
           <w:tcPr>
             <w:tcW w:type="dxa" w:w="5256"/>
-            <w:shd w:fill="F0F6F8"/>
             <w:tcMar>
               <w:top w:w="25" w:type="dxa"/>
               <w:bottom w:w="25" w:type="dxa"/>
@@ -8343,7 +8020,6 @@
         <w:tc>
           <w:tcPr>
             <w:tcW w:type="dxa" w:w="5256"/>
-            <w:shd w:fill="F0F6F8"/>
             <w:tcMar>
               <w:top w:w="25" w:type="dxa"/>
               <w:bottom w:w="25" w:type="dxa"/>
@@ -8366,7 +8042,6 @@
         <w:tc>
           <w:tcPr>
             <w:tcW w:type="dxa" w:w="5256"/>
-            <w:shd w:fill="F0F6F8"/>
             <w:tcMar>
               <w:top w:w="25" w:type="dxa"/>
               <w:bottom w:w="25" w:type="dxa"/>
@@ -8387,7 +8062,6 @@
         <w:tc>
           <w:tcPr>
             <w:tcW w:type="dxa" w:w="5256"/>
-            <w:shd w:fill="F0F6F8"/>
             <w:tcMar>
               <w:top w:w="25" w:type="dxa"/>
               <w:bottom w:w="25" w:type="dxa"/>
@@ -8410,7 +8084,6 @@
         <w:tc>
           <w:tcPr>
             <w:tcW w:type="dxa" w:w="5256"/>
-            <w:shd w:fill="F0F6F8"/>
             <w:tcMar>
               <w:top w:w="25" w:type="dxa"/>
               <w:bottom w:w="25" w:type="dxa"/>
@@ -8431,7 +8104,6 @@
         <w:tc>
           <w:tcPr>
             <w:tcW w:type="dxa" w:w="5256"/>
-            <w:shd w:fill="F0F6F8"/>
             <w:tcMar>
               <w:top w:w="25" w:type="dxa"/>
               <w:bottom w:w="25" w:type="dxa"/>
@@ -8454,7 +8126,6 @@
         <w:tc>
           <w:tcPr>
             <w:tcW w:type="dxa" w:w="5256"/>
-            <w:shd w:fill="F0F6F8"/>
             <w:tcMar>
               <w:top w:w="25" w:type="dxa"/>
               <w:bottom w:w="25" w:type="dxa"/>
@@ -8475,7 +8146,6 @@
         <w:tc>
           <w:tcPr>
             <w:tcW w:type="dxa" w:w="5256"/>
-            <w:shd w:fill="F0F6F8"/>
             <w:tcMar>
               <w:top w:w="25" w:type="dxa"/>
               <w:bottom w:w="25" w:type="dxa"/>
@@ -8498,7 +8168,6 @@
         <w:tc>
           <w:tcPr>
             <w:tcW w:type="dxa" w:w="5256"/>
-            <w:shd w:fill="F0F6F8"/>
             <w:tcMar>
               <w:top w:w="25" w:type="dxa"/>
               <w:bottom w:w="25" w:type="dxa"/>
@@ -8519,7 +8188,6 @@
         <w:tc>
           <w:tcPr>
             <w:tcW w:type="dxa" w:w="5256"/>
-            <w:shd w:fill="F0F6F8"/>
             <w:tcMar>
               <w:top w:w="25" w:type="dxa"/>
               <w:bottom w:w="25" w:type="dxa"/>
@@ -8542,7 +8210,6 @@
         <w:tc>
           <w:tcPr>
             <w:tcW w:type="dxa" w:w="5256"/>
-            <w:shd w:fill="F0F6F8"/>
             <w:tcMar>
               <w:top w:w="25" w:type="dxa"/>
               <w:bottom w:w="25" w:type="dxa"/>
@@ -8563,7 +8230,6 @@
         <w:tc>
           <w:tcPr>
             <w:tcW w:type="dxa" w:w="5256"/>
-            <w:shd w:fill="F0F6F8"/>
             <w:tcMar>
               <w:top w:w="25" w:type="dxa"/>
               <w:bottom w:w="25" w:type="dxa"/>
@@ -8621,7 +8287,6 @@
         <w:tc>
           <w:tcPr>
             <w:tcW w:type="dxa" w:w="5256"/>
-            <w:shd w:fill="F0F6F8"/>
             <w:tcMar>
               <w:top w:w="25" w:type="dxa"/>
               <w:bottom w:w="25" w:type="dxa"/>
@@ -8642,7 +8307,6 @@
         <w:tc>
           <w:tcPr>
             <w:tcW w:type="dxa" w:w="5256"/>
-            <w:shd w:fill="F0F6F8"/>
             <w:tcMar>
               <w:top w:w="25" w:type="dxa"/>
               <w:bottom w:w="25" w:type="dxa"/>
@@ -8665,7 +8329,6 @@
         <w:tc>
           <w:tcPr>
             <w:tcW w:type="dxa" w:w="5256"/>
-            <w:shd w:fill="F0F6F8"/>
             <w:tcMar>
               <w:top w:w="25" w:type="dxa"/>
               <w:bottom w:w="25" w:type="dxa"/>
@@ -8686,7 +8349,6 @@
         <w:tc>
           <w:tcPr>
             <w:tcW w:type="dxa" w:w="5256"/>
-            <w:shd w:fill="F0F6F8"/>
             <w:tcMar>
               <w:top w:w="25" w:type="dxa"/>
               <w:bottom w:w="25" w:type="dxa"/>
@@ -8709,7 +8371,6 @@
         <w:tc>
           <w:tcPr>
             <w:tcW w:type="dxa" w:w="5256"/>
-            <w:shd w:fill="F0F6F8"/>
             <w:tcMar>
               <w:top w:w="25" w:type="dxa"/>
               <w:bottom w:w="25" w:type="dxa"/>
@@ -8730,7 +8391,6 @@
         <w:tc>
           <w:tcPr>
             <w:tcW w:type="dxa" w:w="5256"/>
-            <w:shd w:fill="F0F6F8"/>
             <w:tcMar>
               <w:top w:w="25" w:type="dxa"/>
               <w:bottom w:w="25" w:type="dxa"/>
@@ -8772,7 +8432,6 @@
         <w:tc>
           <w:tcPr>
             <w:tcW w:type="dxa" w:w="3504"/>
-            <w:shd w:fill="F0F6F8"/>
             <w:tcMar>
               <w:top w:w="25" w:type="dxa"/>
               <w:bottom w:w="25" w:type="dxa"/>
@@ -8793,7 +8452,6 @@
         <w:tc>
           <w:tcPr>
             <w:tcW w:type="dxa" w:w="3504"/>
-            <w:shd w:fill="F0F6F8"/>
             <w:tcMar>
               <w:top w:w="25" w:type="dxa"/>
               <w:bottom w:w="25" w:type="dxa"/>
@@ -8814,7 +8472,6 @@
         <w:tc>
           <w:tcPr>
             <w:tcW w:type="dxa" w:w="3504"/>
-            <w:shd w:fill="F0F6F8"/>
             <w:tcMar>
               <w:top w:w="25" w:type="dxa"/>
               <w:bottom w:w="25" w:type="dxa"/>
@@ -8837,7 +8494,6 @@
         <w:tc>
           <w:tcPr>
             <w:tcW w:type="dxa" w:w="3504"/>
-            <w:shd w:fill="F0F6F8"/>
             <w:tcMar>
               <w:top w:w="25" w:type="dxa"/>
               <w:bottom w:w="25" w:type="dxa"/>
@@ -8858,7 +8514,6 @@
         <w:tc>
           <w:tcPr>
             <w:tcW w:type="dxa" w:w="3504"/>
-            <w:shd w:fill="F0F6F8"/>
             <w:tcMar>
               <w:top w:w="25" w:type="dxa"/>
               <w:bottom w:w="25" w:type="dxa"/>
@@ -8879,7 +8534,6 @@
         <w:tc>
           <w:tcPr>
             <w:tcW w:type="dxa" w:w="3504"/>
-            <w:shd w:fill="F0F6F8"/>
             <w:tcMar>
               <w:top w:w="25" w:type="dxa"/>
               <w:bottom w:w="25" w:type="dxa"/>
@@ -8902,7 +8556,6 @@
         <w:tc>
           <w:tcPr>
             <w:tcW w:type="dxa" w:w="3504"/>
-            <w:shd w:fill="F0F6F8"/>
             <w:tcMar>
               <w:top w:w="25" w:type="dxa"/>
               <w:bottom w:w="25" w:type="dxa"/>
@@ -8923,7 +8576,6 @@
         <w:tc>
           <w:tcPr>
             <w:tcW w:type="dxa" w:w="3504"/>
-            <w:shd w:fill="F0F6F8"/>
             <w:tcMar>
               <w:top w:w="25" w:type="dxa"/>
               <w:bottom w:w="25" w:type="dxa"/>
@@ -8938,7 +8590,6 @@
         <w:tc>
           <w:tcPr>
             <w:tcW w:type="dxa" w:w="3504"/>
-            <w:shd w:fill="F0F6F8"/>
             <w:tcMar>
               <w:top w:w="25" w:type="dxa"/>
               <w:bottom w:w="25" w:type="dxa"/>
@@ -9365,24 +9016,9 @@
   <w:p>
     <w:pPr>
       <w:pStyle w:val="Footer"/>
-      <w:spacing w:after="0" w:before="0" w:line="240" w:lineRule="auto"/>
-      <w:jc w:val="right"/>
     </w:pPr>
     <w:r>
-      <w:rPr>
-        <w:b/>
-        <w:color w:val="087F8C"/>
-        <w:sz w:val="16"/>
-      </w:rPr>
-      <w:t>BC  |  BORDA CARDENAS, YANET</w:t>
-    </w:r>
-    <w:r>
-      <w:rPr>
-        <w:color w:val="173846"/>
-        <w:sz w:val="15"/>
-      </w:rPr>
-      <w:br/>
-      <w:t>Especialista Social</w:t>
+      <w:t>Encuesta urbana y rural · Uso reservado</w:t>
     </w:r>
   </w:p>
 </w:ftr>
@@ -9396,6 +9032,48 @@
     </w:pPr>
     <w:r>
       <w:t>KIMBIRI  |  ENCUESTA URBANA Y RURAL  |  CUI 2627896</w:t>
+    </w:r>
+    <w:r>
+      <w:drawing>
+        <wp:anchor distT="0" distB="0" distL="0" distR="0" simplePos="0" relativeHeight="0" behindDoc="1" locked="0" layoutInCell="1" allowOverlap="1">
+          <wp:simplePos x="0" y="0"/>
+          <wp:positionH relativeFrom="page">
+            <wp:align>center</wp:align>
+          </wp:positionH>
+          <wp:positionV relativeFrom="page">
+            <wp:align>center</wp:align>
+          </wp:positionV>
+          <wp:extent cx="5907024" cy="3609848"/>
+          <wp:wrapNone/>
+          <wp:docPr id="1" name="Picture 1"/>
+          <wp:cNvGraphicFramePr xmlns:a="http://schemas.openxmlformats.org/drawingml/2006/main">
+            <a:graphicFrameLocks noChangeAspect="1"/>
+          </wp:cNvGraphicFramePr>
+          <a:graphic xmlns:a="http://schemas.openxmlformats.org/drawingml/2006/main" xmlns:pic="http://schemas.openxmlformats.org/drawingml/2006/picture">
+            <a:graphicData uri="http://schemas.openxmlformats.org/drawingml/2006/picture">
+              <pic:pic>
+                <pic:nvPicPr>
+                  <pic:cNvPr id="0" name="Marca_agua_Yanet.png"/>
+                  <pic:cNvPicPr/>
+                </pic:nvPicPr>
+                <pic:blipFill>
+                  <a:blip r:embed="rId1"/>
+                  <a:stretch>
+                    <a:fillRect/>
+                  </a:stretch>
+                </pic:blipFill>
+                <pic:spPr>
+                  <a:xfrm>
+                    <a:off x="0" y="0"/>
+                    <a:ext cx="5907024" cy="3609848"/>
+                  </a:xfrm>
+                  <a:prstGeom prst="rect"/>
+                </pic:spPr>
+              </pic:pic>
+            </a:graphicData>
+          </a:graphic>
+        </wp:anchor>
+      </w:drawing>
     </w:r>
   </w:p>
 </w:hdr>

</xml_diff>

<commit_message>
Rediseñar logo de trabajo social y ubicarlo en encabezados
</commit_message>
<xml_diff>
--- a/documentos/Encuesta_Kimbiri_visual.docx
+++ b/documentos/Encuesta_Kimbiri_visual.docx
@@ -90,6 +90,7 @@
         <w:tc>
           <w:tcPr>
             <w:tcW w:type="dxa" w:w="3504"/>
+            <w:shd w:fill="F0F6F8"/>
             <w:tcMar>
               <w:top w:w="25" w:type="dxa"/>
               <w:bottom w:w="25" w:type="dxa"/>
@@ -110,6 +111,7 @@
         <w:tc>
           <w:tcPr>
             <w:tcW w:type="dxa" w:w="3504"/>
+            <w:shd w:fill="F0F6F8"/>
             <w:tcMar>
               <w:top w:w="25" w:type="dxa"/>
               <w:bottom w:w="25" w:type="dxa"/>
@@ -130,6 +132,7 @@
         <w:tc>
           <w:tcPr>
             <w:tcW w:type="dxa" w:w="3504"/>
+            <w:shd w:fill="F0F6F8"/>
             <w:tcMar>
               <w:top w:w="25" w:type="dxa"/>
               <w:bottom w:w="25" w:type="dxa"/>
@@ -171,6 +174,7 @@
         <w:tc>
           <w:tcPr>
             <w:tcW w:type="dxa" w:w="3504"/>
+            <w:shd w:fill="F0F6F8"/>
             <w:tcMar>
               <w:top w:w="25" w:type="dxa"/>
               <w:bottom w:w="25" w:type="dxa"/>
@@ -191,6 +195,7 @@
         <w:tc>
           <w:tcPr>
             <w:tcW w:type="dxa" w:w="3504"/>
+            <w:shd w:fill="F0F6F8"/>
             <w:tcMar>
               <w:top w:w="25" w:type="dxa"/>
               <w:bottom w:w="25" w:type="dxa"/>
@@ -211,6 +216,7 @@
         <w:tc>
           <w:tcPr>
             <w:tcW w:type="dxa" w:w="3504"/>
+            <w:shd w:fill="F0F6F8"/>
             <w:tcMar>
               <w:top w:w="25" w:type="dxa"/>
               <w:bottom w:w="25" w:type="dxa"/>
@@ -273,6 +279,7 @@
         <w:tc>
           <w:tcPr>
             <w:tcW w:type="dxa" w:w="3504"/>
+            <w:shd w:fill="F0F6F8"/>
             <w:tcMar>
               <w:top w:w="25" w:type="dxa"/>
               <w:bottom w:w="25" w:type="dxa"/>
@@ -293,6 +300,7 @@
         <w:tc>
           <w:tcPr>
             <w:tcW w:type="dxa" w:w="3504"/>
+            <w:shd w:fill="F0F6F8"/>
             <w:tcMar>
               <w:top w:w="25" w:type="dxa"/>
               <w:bottom w:w="25" w:type="dxa"/>
@@ -313,6 +321,7 @@
         <w:tc>
           <w:tcPr>
             <w:tcW w:type="dxa" w:w="3504"/>
+            <w:shd w:fill="F0F6F8"/>
             <w:tcMar>
               <w:top w:w="25" w:type="dxa"/>
               <w:bottom w:w="25" w:type="dxa"/>
@@ -440,6 +449,7 @@
         <w:tc>
           <w:tcPr>
             <w:tcW w:type="dxa" w:w="3504"/>
+            <w:shd w:fill="F0F6F8"/>
             <w:tcMar>
               <w:top w:w="25" w:type="dxa"/>
               <w:bottom w:w="25" w:type="dxa"/>
@@ -460,6 +470,7 @@
         <w:tc>
           <w:tcPr>
             <w:tcW w:type="dxa" w:w="3504"/>
+            <w:shd w:fill="F0F6F8"/>
             <w:tcMar>
               <w:top w:w="25" w:type="dxa"/>
               <w:bottom w:w="25" w:type="dxa"/>
@@ -480,6 +491,7 @@
         <w:tc>
           <w:tcPr>
             <w:tcW w:type="dxa" w:w="3504"/>
+            <w:shd w:fill="F0F6F8"/>
             <w:tcMar>
               <w:top w:w="25" w:type="dxa"/>
               <w:bottom w:w="25" w:type="dxa"/>
@@ -502,6 +514,7 @@
         <w:tc>
           <w:tcPr>
             <w:tcW w:type="dxa" w:w="3504"/>
+            <w:shd w:fill="F0F6F8"/>
             <w:tcMar>
               <w:top w:w="25" w:type="dxa"/>
               <w:bottom w:w="25" w:type="dxa"/>
@@ -522,6 +535,7 @@
         <w:tc>
           <w:tcPr>
             <w:tcW w:type="dxa" w:w="3504"/>
+            <w:shd w:fill="F0F6F8"/>
             <w:tcMar>
               <w:top w:w="25" w:type="dxa"/>
               <w:bottom w:w="25" w:type="dxa"/>
@@ -542,6 +556,7 @@
         <w:tc>
           <w:tcPr>
             <w:tcW w:type="dxa" w:w="3504"/>
+            <w:shd w:fill="F0F6F8"/>
             <w:tcMar>
               <w:top w:w="25" w:type="dxa"/>
               <w:bottom w:w="25" w:type="dxa"/>
@@ -564,6 +579,7 @@
         <w:tc>
           <w:tcPr>
             <w:tcW w:type="dxa" w:w="3504"/>
+            <w:shd w:fill="F0F6F8"/>
             <w:tcMar>
               <w:top w:w="25" w:type="dxa"/>
               <w:bottom w:w="25" w:type="dxa"/>
@@ -584,6 +600,7 @@
         <w:tc>
           <w:tcPr>
             <w:tcW w:type="dxa" w:w="3504"/>
+            <w:shd w:fill="F0F6F8"/>
             <w:tcMar>
               <w:top w:w="25" w:type="dxa"/>
               <w:bottom w:w="25" w:type="dxa"/>
@@ -598,6 +615,7 @@
         <w:tc>
           <w:tcPr>
             <w:tcW w:type="dxa" w:w="3504"/>
+            <w:shd w:fill="F0F6F8"/>
             <w:tcMar>
               <w:top w:w="25" w:type="dxa"/>
               <w:bottom w:w="25" w:type="dxa"/>
@@ -638,6 +656,7 @@
         <w:tc>
           <w:tcPr>
             <w:tcW w:type="dxa" w:w="5256"/>
+            <w:shd w:fill="F0F6F8"/>
             <w:tcMar>
               <w:top w:w="25" w:type="dxa"/>
               <w:bottom w:w="25" w:type="dxa"/>
@@ -658,6 +677,7 @@
         <w:tc>
           <w:tcPr>
             <w:tcW w:type="dxa" w:w="5256"/>
+            <w:shd w:fill="F0F6F8"/>
             <w:tcMar>
               <w:top w:w="25" w:type="dxa"/>
               <w:bottom w:w="25" w:type="dxa"/>
@@ -680,6 +700,7 @@
         <w:tc>
           <w:tcPr>
             <w:tcW w:type="dxa" w:w="5256"/>
+            <w:shd w:fill="F0F6F8"/>
             <w:tcMar>
               <w:top w:w="25" w:type="dxa"/>
               <w:bottom w:w="25" w:type="dxa"/>
@@ -700,6 +721,7 @@
         <w:tc>
           <w:tcPr>
             <w:tcW w:type="dxa" w:w="5256"/>
+            <w:shd w:fill="F0F6F8"/>
             <w:tcMar>
               <w:top w:w="25" w:type="dxa"/>
               <w:bottom w:w="25" w:type="dxa"/>
@@ -741,6 +763,7 @@
         <w:tc>
           <w:tcPr>
             <w:tcW w:type="dxa" w:w="3504"/>
+            <w:shd w:fill="F0F6F8"/>
             <w:tcMar>
               <w:top w:w="25" w:type="dxa"/>
               <w:bottom w:w="25" w:type="dxa"/>
@@ -761,6 +784,7 @@
         <w:tc>
           <w:tcPr>
             <w:tcW w:type="dxa" w:w="3504"/>
+            <w:shd w:fill="F0F6F8"/>
             <w:tcMar>
               <w:top w:w="25" w:type="dxa"/>
               <w:bottom w:w="25" w:type="dxa"/>
@@ -781,6 +805,7 @@
         <w:tc>
           <w:tcPr>
             <w:tcW w:type="dxa" w:w="3504"/>
+            <w:shd w:fill="F0F6F8"/>
             <w:tcMar>
               <w:top w:w="25" w:type="dxa"/>
               <w:bottom w:w="25" w:type="dxa"/>
@@ -803,6 +828,7 @@
         <w:tc>
           <w:tcPr>
             <w:tcW w:type="dxa" w:w="3504"/>
+            <w:shd w:fill="F0F6F8"/>
             <w:tcMar>
               <w:top w:w="25" w:type="dxa"/>
               <w:bottom w:w="25" w:type="dxa"/>
@@ -823,6 +849,7 @@
         <w:tc>
           <w:tcPr>
             <w:tcW w:type="dxa" w:w="3504"/>
+            <w:shd w:fill="F0F6F8"/>
             <w:tcMar>
               <w:top w:w="25" w:type="dxa"/>
               <w:bottom w:w="25" w:type="dxa"/>
@@ -843,6 +870,7 @@
         <w:tc>
           <w:tcPr>
             <w:tcW w:type="dxa" w:w="3504"/>
+            <w:shd w:fill="F0F6F8"/>
             <w:tcMar>
               <w:top w:w="25" w:type="dxa"/>
               <w:bottom w:w="25" w:type="dxa"/>
@@ -890,6 +918,7 @@
         <w:tc>
           <w:tcPr>
             <w:tcW w:type="dxa" w:w="3504"/>
+            <w:shd w:fill="F0F6F8"/>
             <w:tcMar>
               <w:top w:w="25" w:type="dxa"/>
               <w:bottom w:w="25" w:type="dxa"/>
@@ -910,6 +939,7 @@
         <w:tc>
           <w:tcPr>
             <w:tcW w:type="dxa" w:w="3504"/>
+            <w:shd w:fill="F0F6F8"/>
             <w:tcMar>
               <w:top w:w="25" w:type="dxa"/>
               <w:bottom w:w="25" w:type="dxa"/>
@@ -930,6 +960,7 @@
         <w:tc>
           <w:tcPr>
             <w:tcW w:type="dxa" w:w="3504"/>
+            <w:shd w:fill="F0F6F8"/>
             <w:tcMar>
               <w:top w:w="25" w:type="dxa"/>
               <w:bottom w:w="25" w:type="dxa"/>
@@ -952,6 +983,7 @@
         <w:tc>
           <w:tcPr>
             <w:tcW w:type="dxa" w:w="3504"/>
+            <w:shd w:fill="F0F6F8"/>
             <w:tcMar>
               <w:top w:w="25" w:type="dxa"/>
               <w:bottom w:w="25" w:type="dxa"/>
@@ -972,6 +1004,7 @@
         <w:tc>
           <w:tcPr>
             <w:tcW w:type="dxa" w:w="3504"/>
+            <w:shd w:fill="F0F6F8"/>
             <w:tcMar>
               <w:top w:w="25" w:type="dxa"/>
               <w:bottom w:w="25" w:type="dxa"/>
@@ -986,6 +1019,7 @@
         <w:tc>
           <w:tcPr>
             <w:tcW w:type="dxa" w:w="3504"/>
+            <w:shd w:fill="F0F6F8"/>
             <w:tcMar>
               <w:top w:w="25" w:type="dxa"/>
               <w:bottom w:w="25" w:type="dxa"/>
@@ -1026,6 +1060,7 @@
         <w:tc>
           <w:tcPr>
             <w:tcW w:type="dxa" w:w="3504"/>
+            <w:shd w:fill="F0F6F8"/>
             <w:tcMar>
               <w:top w:w="25" w:type="dxa"/>
               <w:bottom w:w="25" w:type="dxa"/>
@@ -1046,6 +1081,7 @@
         <w:tc>
           <w:tcPr>
             <w:tcW w:type="dxa" w:w="3504"/>
+            <w:shd w:fill="F0F6F8"/>
             <w:tcMar>
               <w:top w:w="25" w:type="dxa"/>
               <w:bottom w:w="25" w:type="dxa"/>
@@ -1066,6 +1102,7 @@
         <w:tc>
           <w:tcPr>
             <w:tcW w:type="dxa" w:w="3504"/>
+            <w:shd w:fill="F0F6F8"/>
             <w:tcMar>
               <w:top w:w="25" w:type="dxa"/>
               <w:bottom w:w="25" w:type="dxa"/>
@@ -1088,6 +1125,7 @@
         <w:tc>
           <w:tcPr>
             <w:tcW w:type="dxa" w:w="3504"/>
+            <w:shd w:fill="F0F6F8"/>
             <w:tcMar>
               <w:top w:w="25" w:type="dxa"/>
               <w:bottom w:w="25" w:type="dxa"/>
@@ -1108,6 +1146,7 @@
         <w:tc>
           <w:tcPr>
             <w:tcW w:type="dxa" w:w="3504"/>
+            <w:shd w:fill="F0F6F8"/>
             <w:tcMar>
               <w:top w:w="25" w:type="dxa"/>
               <w:bottom w:w="25" w:type="dxa"/>
@@ -1128,6 +1167,7 @@
         <w:tc>
           <w:tcPr>
             <w:tcW w:type="dxa" w:w="3504"/>
+            <w:shd w:fill="F0F6F8"/>
             <w:tcMar>
               <w:top w:w="25" w:type="dxa"/>
               <w:bottom w:w="25" w:type="dxa"/>
@@ -1150,6 +1190,7 @@
         <w:tc>
           <w:tcPr>
             <w:tcW w:type="dxa" w:w="3504"/>
+            <w:shd w:fill="F0F6F8"/>
             <w:tcMar>
               <w:top w:w="25" w:type="dxa"/>
               <w:bottom w:w="25" w:type="dxa"/>
@@ -1170,6 +1211,7 @@
         <w:tc>
           <w:tcPr>
             <w:tcW w:type="dxa" w:w="3504"/>
+            <w:shd w:fill="F0F6F8"/>
             <w:tcMar>
               <w:top w:w="25" w:type="dxa"/>
               <w:bottom w:w="25" w:type="dxa"/>
@@ -1190,6 +1232,7 @@
         <w:tc>
           <w:tcPr>
             <w:tcW w:type="dxa" w:w="3504"/>
+            <w:shd w:fill="F0F6F8"/>
             <w:tcMar>
               <w:top w:w="25" w:type="dxa"/>
               <w:bottom w:w="25" w:type="dxa"/>
@@ -1212,6 +1255,7 @@
         <w:tc>
           <w:tcPr>
             <w:tcW w:type="dxa" w:w="3504"/>
+            <w:shd w:fill="F0F6F8"/>
             <w:tcMar>
               <w:top w:w="25" w:type="dxa"/>
               <w:bottom w:w="25" w:type="dxa"/>
@@ -1232,6 +1276,7 @@
         <w:tc>
           <w:tcPr>
             <w:tcW w:type="dxa" w:w="3504"/>
+            <w:shd w:fill="F0F6F8"/>
             <w:tcMar>
               <w:top w:w="25" w:type="dxa"/>
               <w:bottom w:w="25" w:type="dxa"/>
@@ -1252,6 +1297,7 @@
         <w:tc>
           <w:tcPr>
             <w:tcW w:type="dxa" w:w="3504"/>
+            <w:shd w:fill="F0F6F8"/>
             <w:tcMar>
               <w:top w:w="25" w:type="dxa"/>
               <w:bottom w:w="25" w:type="dxa"/>
@@ -1274,6 +1320,7 @@
         <w:tc>
           <w:tcPr>
             <w:tcW w:type="dxa" w:w="3504"/>
+            <w:shd w:fill="F0F6F8"/>
             <w:tcMar>
               <w:top w:w="25" w:type="dxa"/>
               <w:bottom w:w="25" w:type="dxa"/>
@@ -1294,6 +1341,7 @@
         <w:tc>
           <w:tcPr>
             <w:tcW w:type="dxa" w:w="3504"/>
+            <w:shd w:fill="F0F6F8"/>
             <w:tcMar>
               <w:top w:w="25" w:type="dxa"/>
               <w:bottom w:w="25" w:type="dxa"/>
@@ -1314,6 +1362,7 @@
         <w:tc>
           <w:tcPr>
             <w:tcW w:type="dxa" w:w="3504"/>
+            <w:shd w:fill="F0F6F8"/>
             <w:tcMar>
               <w:top w:w="25" w:type="dxa"/>
               <w:bottom w:w="25" w:type="dxa"/>
@@ -1336,6 +1385,7 @@
         <w:tc>
           <w:tcPr>
             <w:tcW w:type="dxa" w:w="3504"/>
+            <w:shd w:fill="F0F6F8"/>
             <w:tcMar>
               <w:top w:w="25" w:type="dxa"/>
               <w:bottom w:w="25" w:type="dxa"/>
@@ -1356,6 +1406,7 @@
         <w:tc>
           <w:tcPr>
             <w:tcW w:type="dxa" w:w="3504"/>
+            <w:shd w:fill="F0F6F8"/>
             <w:tcMar>
               <w:top w:w="25" w:type="dxa"/>
               <w:bottom w:w="25" w:type="dxa"/>
@@ -1376,6 +1427,7 @@
         <w:tc>
           <w:tcPr>
             <w:tcW w:type="dxa" w:w="3504"/>
+            <w:shd w:fill="F0F6F8"/>
             <w:tcMar>
               <w:top w:w="25" w:type="dxa"/>
               <w:bottom w:w="25" w:type="dxa"/>
@@ -1398,6 +1450,7 @@
         <w:tc>
           <w:tcPr>
             <w:tcW w:type="dxa" w:w="3504"/>
+            <w:shd w:fill="F0F6F8"/>
             <w:tcMar>
               <w:top w:w="25" w:type="dxa"/>
               <w:bottom w:w="25" w:type="dxa"/>
@@ -1418,6 +1471,7 @@
         <w:tc>
           <w:tcPr>
             <w:tcW w:type="dxa" w:w="3504"/>
+            <w:shd w:fill="F0F6F8"/>
             <w:tcMar>
               <w:top w:w="25" w:type="dxa"/>
               <w:bottom w:w="25" w:type="dxa"/>
@@ -1438,6 +1492,7 @@
         <w:tc>
           <w:tcPr>
             <w:tcW w:type="dxa" w:w="3504"/>
+            <w:shd w:fill="F0F6F8"/>
             <w:tcMar>
               <w:top w:w="25" w:type="dxa"/>
               <w:bottom w:w="25" w:type="dxa"/>
@@ -1484,6 +1539,7 @@
         <w:tc>
           <w:tcPr>
             <w:tcW w:type="dxa" w:w="5256"/>
+            <w:shd w:fill="F0F6F8"/>
             <w:tcMar>
               <w:top w:w="25" w:type="dxa"/>
               <w:bottom w:w="25" w:type="dxa"/>
@@ -1504,6 +1560,7 @@
         <w:tc>
           <w:tcPr>
             <w:tcW w:type="dxa" w:w="5256"/>
+            <w:shd w:fill="F0F6F8"/>
             <w:tcMar>
               <w:top w:w="25" w:type="dxa"/>
               <w:bottom w:w="25" w:type="dxa"/>
@@ -1526,6 +1583,7 @@
         <w:tc>
           <w:tcPr>
             <w:tcW w:type="dxa" w:w="5256"/>
+            <w:shd w:fill="F0F6F8"/>
             <w:tcMar>
               <w:top w:w="25" w:type="dxa"/>
               <w:bottom w:w="25" w:type="dxa"/>
@@ -1546,6 +1604,7 @@
         <w:tc>
           <w:tcPr>
             <w:tcW w:type="dxa" w:w="5256"/>
+            <w:shd w:fill="F0F6F8"/>
             <w:tcMar>
               <w:top w:w="25" w:type="dxa"/>
               <w:bottom w:w="25" w:type="dxa"/>
@@ -1593,6 +1652,7 @@
         <w:tc>
           <w:tcPr>
             <w:tcW w:type="dxa" w:w="3504"/>
+            <w:shd w:fill="F0F6F8"/>
             <w:tcMar>
               <w:top w:w="25" w:type="dxa"/>
               <w:bottom w:w="25" w:type="dxa"/>
@@ -1613,6 +1673,7 @@
         <w:tc>
           <w:tcPr>
             <w:tcW w:type="dxa" w:w="3504"/>
+            <w:shd w:fill="F0F6F8"/>
             <w:tcMar>
               <w:top w:w="25" w:type="dxa"/>
               <w:bottom w:w="25" w:type="dxa"/>
@@ -1633,6 +1694,7 @@
         <w:tc>
           <w:tcPr>
             <w:tcW w:type="dxa" w:w="3504"/>
+            <w:shd w:fill="F0F6F8"/>
             <w:tcMar>
               <w:top w:w="25" w:type="dxa"/>
               <w:bottom w:w="25" w:type="dxa"/>
@@ -1655,6 +1717,7 @@
         <w:tc>
           <w:tcPr>
             <w:tcW w:type="dxa" w:w="3504"/>
+            <w:shd w:fill="F0F6F8"/>
             <w:tcMar>
               <w:top w:w="25" w:type="dxa"/>
               <w:bottom w:w="25" w:type="dxa"/>
@@ -1675,6 +1738,7 @@
         <w:tc>
           <w:tcPr>
             <w:tcW w:type="dxa" w:w="3504"/>
+            <w:shd w:fill="F0F6F8"/>
             <w:tcMar>
               <w:top w:w="25" w:type="dxa"/>
               <w:bottom w:w="25" w:type="dxa"/>
@@ -1695,6 +1759,7 @@
         <w:tc>
           <w:tcPr>
             <w:tcW w:type="dxa" w:w="3504"/>
+            <w:shd w:fill="F0F6F8"/>
             <w:tcMar>
               <w:top w:w="25" w:type="dxa"/>
               <w:bottom w:w="25" w:type="dxa"/>
@@ -1747,6 +1812,7 @@
         <w:tc>
           <w:tcPr>
             <w:tcW w:type="dxa" w:w="3504"/>
+            <w:shd w:fill="F0F6F8"/>
             <w:tcMar>
               <w:top w:w="25" w:type="dxa"/>
               <w:bottom w:w="25" w:type="dxa"/>
@@ -1767,6 +1833,7 @@
         <w:tc>
           <w:tcPr>
             <w:tcW w:type="dxa" w:w="3504"/>
+            <w:shd w:fill="F0F6F8"/>
             <w:tcMar>
               <w:top w:w="25" w:type="dxa"/>
               <w:bottom w:w="25" w:type="dxa"/>
@@ -1787,6 +1854,7 @@
         <w:tc>
           <w:tcPr>
             <w:tcW w:type="dxa" w:w="3504"/>
+            <w:shd w:fill="F0F6F8"/>
             <w:tcMar>
               <w:top w:w="25" w:type="dxa"/>
               <w:bottom w:w="25" w:type="dxa"/>
@@ -1809,6 +1877,7 @@
         <w:tc>
           <w:tcPr>
             <w:tcW w:type="dxa" w:w="3504"/>
+            <w:shd w:fill="F0F6F8"/>
             <w:tcMar>
               <w:top w:w="25" w:type="dxa"/>
               <w:bottom w:w="25" w:type="dxa"/>
@@ -1829,6 +1898,7 @@
         <w:tc>
           <w:tcPr>
             <w:tcW w:type="dxa" w:w="3504"/>
+            <w:shd w:fill="F0F6F8"/>
             <w:tcMar>
               <w:top w:w="25" w:type="dxa"/>
               <w:bottom w:w="25" w:type="dxa"/>
@@ -1843,6 +1913,7 @@
         <w:tc>
           <w:tcPr>
             <w:tcW w:type="dxa" w:w="3504"/>
+            <w:shd w:fill="F0F6F8"/>
             <w:tcMar>
               <w:top w:w="25" w:type="dxa"/>
               <w:bottom w:w="25" w:type="dxa"/>
@@ -1884,6 +1955,7 @@
         <w:tc>
           <w:tcPr>
             <w:tcW w:type="dxa" w:w="3504"/>
+            <w:shd w:fill="F0F6F8"/>
             <w:tcMar>
               <w:top w:w="25" w:type="dxa"/>
               <w:bottom w:w="25" w:type="dxa"/>
@@ -1904,6 +1976,7 @@
         <w:tc>
           <w:tcPr>
             <w:tcW w:type="dxa" w:w="3504"/>
+            <w:shd w:fill="F0F6F8"/>
             <w:tcMar>
               <w:top w:w="25" w:type="dxa"/>
               <w:bottom w:w="25" w:type="dxa"/>
@@ -1924,6 +1997,7 @@
         <w:tc>
           <w:tcPr>
             <w:tcW w:type="dxa" w:w="3504"/>
+            <w:shd w:fill="F0F6F8"/>
             <w:tcMar>
               <w:top w:w="25" w:type="dxa"/>
               <w:bottom w:w="25" w:type="dxa"/>
@@ -1946,6 +2020,7 @@
         <w:tc>
           <w:tcPr>
             <w:tcW w:type="dxa" w:w="3504"/>
+            <w:shd w:fill="F0F6F8"/>
             <w:tcMar>
               <w:top w:w="25" w:type="dxa"/>
               <w:bottom w:w="25" w:type="dxa"/>
@@ -1966,6 +2041,7 @@
         <w:tc>
           <w:tcPr>
             <w:tcW w:type="dxa" w:w="3504"/>
+            <w:shd w:fill="F0F6F8"/>
             <w:tcMar>
               <w:top w:w="25" w:type="dxa"/>
               <w:bottom w:w="25" w:type="dxa"/>
@@ -1986,6 +2062,7 @@
         <w:tc>
           <w:tcPr>
             <w:tcW w:type="dxa" w:w="3504"/>
+            <w:shd w:fill="F0F6F8"/>
             <w:tcMar>
               <w:top w:w="25" w:type="dxa"/>
               <w:bottom w:w="25" w:type="dxa"/>
@@ -2096,6 +2173,7 @@
         <w:tc>
           <w:tcPr>
             <w:tcW w:type="dxa" w:w="3504"/>
+            <w:shd w:fill="F0F6F8"/>
             <w:tcMar>
               <w:top w:w="25" w:type="dxa"/>
               <w:bottom w:w="25" w:type="dxa"/>
@@ -2116,6 +2194,7 @@
         <w:tc>
           <w:tcPr>
             <w:tcW w:type="dxa" w:w="3504"/>
+            <w:shd w:fill="F0F6F8"/>
             <w:tcMar>
               <w:top w:w="25" w:type="dxa"/>
               <w:bottom w:w="25" w:type="dxa"/>
@@ -2136,6 +2215,7 @@
         <w:tc>
           <w:tcPr>
             <w:tcW w:type="dxa" w:w="3504"/>
+            <w:shd w:fill="F0F6F8"/>
             <w:tcMar>
               <w:top w:w="25" w:type="dxa"/>
               <w:bottom w:w="25" w:type="dxa"/>
@@ -2158,6 +2238,7 @@
         <w:tc>
           <w:tcPr>
             <w:tcW w:type="dxa" w:w="3504"/>
+            <w:shd w:fill="F0F6F8"/>
             <w:tcMar>
               <w:top w:w="25" w:type="dxa"/>
               <w:bottom w:w="25" w:type="dxa"/>
@@ -2178,6 +2259,7 @@
         <w:tc>
           <w:tcPr>
             <w:tcW w:type="dxa" w:w="3504"/>
+            <w:shd w:fill="F0F6F8"/>
             <w:tcMar>
               <w:top w:w="25" w:type="dxa"/>
               <w:bottom w:w="25" w:type="dxa"/>
@@ -2192,6 +2274,7 @@
         <w:tc>
           <w:tcPr>
             <w:tcW w:type="dxa" w:w="3504"/>
+            <w:shd w:fill="F0F6F8"/>
             <w:tcMar>
               <w:top w:w="25" w:type="dxa"/>
               <w:bottom w:w="25" w:type="dxa"/>
@@ -2233,6 +2316,7 @@
         <w:tc>
           <w:tcPr>
             <w:tcW w:type="dxa" w:w="3504"/>
+            <w:shd w:fill="F0F6F8"/>
             <w:tcMar>
               <w:top w:w="25" w:type="dxa"/>
               <w:bottom w:w="25" w:type="dxa"/>
@@ -2253,6 +2337,7 @@
         <w:tc>
           <w:tcPr>
             <w:tcW w:type="dxa" w:w="3504"/>
+            <w:shd w:fill="F0F6F8"/>
             <w:tcMar>
               <w:top w:w="25" w:type="dxa"/>
               <w:bottom w:w="25" w:type="dxa"/>
@@ -2273,6 +2358,7 @@
         <w:tc>
           <w:tcPr>
             <w:tcW w:type="dxa" w:w="3504"/>
+            <w:shd w:fill="F0F6F8"/>
             <w:tcMar>
               <w:top w:w="25" w:type="dxa"/>
               <w:bottom w:w="25" w:type="dxa"/>
@@ -2295,6 +2381,7 @@
         <w:tc>
           <w:tcPr>
             <w:tcW w:type="dxa" w:w="3504"/>
+            <w:shd w:fill="F0F6F8"/>
             <w:tcMar>
               <w:top w:w="25" w:type="dxa"/>
               <w:bottom w:w="25" w:type="dxa"/>
@@ -2315,6 +2402,7 @@
         <w:tc>
           <w:tcPr>
             <w:tcW w:type="dxa" w:w="3504"/>
+            <w:shd w:fill="F0F6F8"/>
             <w:tcMar>
               <w:top w:w="25" w:type="dxa"/>
               <w:bottom w:w="25" w:type="dxa"/>
@@ -2335,6 +2423,7 @@
         <w:tc>
           <w:tcPr>
             <w:tcW w:type="dxa" w:w="3504"/>
+            <w:shd w:fill="F0F6F8"/>
             <w:tcMar>
               <w:top w:w="25" w:type="dxa"/>
               <w:bottom w:w="25" w:type="dxa"/>
@@ -2357,6 +2446,7 @@
         <w:tc>
           <w:tcPr>
             <w:tcW w:type="dxa" w:w="3504"/>
+            <w:shd w:fill="F0F6F8"/>
             <w:tcMar>
               <w:top w:w="25" w:type="dxa"/>
               <w:bottom w:w="25" w:type="dxa"/>
@@ -2377,6 +2467,7 @@
         <w:tc>
           <w:tcPr>
             <w:tcW w:type="dxa" w:w="3504"/>
+            <w:shd w:fill="F0F6F8"/>
             <w:tcMar>
               <w:top w:w="25" w:type="dxa"/>
               <w:bottom w:w="25" w:type="dxa"/>
@@ -2397,6 +2488,7 @@
         <w:tc>
           <w:tcPr>
             <w:tcW w:type="dxa" w:w="3504"/>
+            <w:shd w:fill="F0F6F8"/>
             <w:tcMar>
               <w:top w:w="25" w:type="dxa"/>
               <w:bottom w:w="25" w:type="dxa"/>
@@ -2419,6 +2511,7 @@
         <w:tc>
           <w:tcPr>
             <w:tcW w:type="dxa" w:w="3504"/>
+            <w:shd w:fill="F0F6F8"/>
             <w:tcMar>
               <w:top w:w="25" w:type="dxa"/>
               <w:bottom w:w="25" w:type="dxa"/>
@@ -2439,6 +2532,7 @@
         <w:tc>
           <w:tcPr>
             <w:tcW w:type="dxa" w:w="3504"/>
+            <w:shd w:fill="F0F6F8"/>
             <w:tcMar>
               <w:top w:w="25" w:type="dxa"/>
               <w:bottom w:w="25" w:type="dxa"/>
@@ -2459,6 +2553,7 @@
         <w:tc>
           <w:tcPr>
             <w:tcW w:type="dxa" w:w="3504"/>
+            <w:shd w:fill="F0F6F8"/>
             <w:tcMar>
               <w:top w:w="25" w:type="dxa"/>
               <w:bottom w:w="25" w:type="dxa"/>
@@ -2481,6 +2576,7 @@
         <w:tc>
           <w:tcPr>
             <w:tcW w:type="dxa" w:w="3504"/>
+            <w:shd w:fill="F0F6F8"/>
             <w:tcMar>
               <w:top w:w="25" w:type="dxa"/>
               <w:bottom w:w="25" w:type="dxa"/>
@@ -2501,6 +2597,7 @@
         <w:tc>
           <w:tcPr>
             <w:tcW w:type="dxa" w:w="3504"/>
+            <w:shd w:fill="F0F6F8"/>
             <w:tcMar>
               <w:top w:w="25" w:type="dxa"/>
               <w:bottom w:w="25" w:type="dxa"/>
@@ -2521,6 +2618,7 @@
         <w:tc>
           <w:tcPr>
             <w:tcW w:type="dxa" w:w="3504"/>
+            <w:shd w:fill="F0F6F8"/>
             <w:tcMar>
               <w:top w:w="25" w:type="dxa"/>
               <w:bottom w:w="25" w:type="dxa"/>
@@ -2562,6 +2660,7 @@
         <w:tc>
           <w:tcPr>
             <w:tcW w:type="dxa" w:w="3504"/>
+            <w:shd w:fill="F0F6F8"/>
             <w:tcMar>
               <w:top w:w="25" w:type="dxa"/>
               <w:bottom w:w="25" w:type="dxa"/>
@@ -2582,6 +2681,7 @@
         <w:tc>
           <w:tcPr>
             <w:tcW w:type="dxa" w:w="3504"/>
+            <w:shd w:fill="F0F6F8"/>
             <w:tcMar>
               <w:top w:w="25" w:type="dxa"/>
               <w:bottom w:w="25" w:type="dxa"/>
@@ -2602,6 +2702,7 @@
         <w:tc>
           <w:tcPr>
             <w:tcW w:type="dxa" w:w="3504"/>
+            <w:shd w:fill="F0F6F8"/>
             <w:tcMar>
               <w:top w:w="25" w:type="dxa"/>
               <w:bottom w:w="25" w:type="dxa"/>
@@ -2624,6 +2725,7 @@
         <w:tc>
           <w:tcPr>
             <w:tcW w:type="dxa" w:w="3504"/>
+            <w:shd w:fill="F0F6F8"/>
             <w:tcMar>
               <w:top w:w="25" w:type="dxa"/>
               <w:bottom w:w="25" w:type="dxa"/>
@@ -2644,6 +2746,7 @@
         <w:tc>
           <w:tcPr>
             <w:tcW w:type="dxa" w:w="3504"/>
+            <w:shd w:fill="F0F6F8"/>
             <w:tcMar>
               <w:top w:w="25" w:type="dxa"/>
               <w:bottom w:w="25" w:type="dxa"/>
@@ -2658,6 +2761,7 @@
         <w:tc>
           <w:tcPr>
             <w:tcW w:type="dxa" w:w="3504"/>
+            <w:shd w:fill="F0F6F8"/>
             <w:tcMar>
               <w:top w:w="25" w:type="dxa"/>
               <w:bottom w:w="25" w:type="dxa"/>
@@ -2699,6 +2803,7 @@
         <w:tc>
           <w:tcPr>
             <w:tcW w:type="dxa" w:w="3504"/>
+            <w:shd w:fill="F0F6F8"/>
             <w:tcMar>
               <w:top w:w="25" w:type="dxa"/>
               <w:bottom w:w="25" w:type="dxa"/>
@@ -2719,6 +2824,7 @@
         <w:tc>
           <w:tcPr>
             <w:tcW w:type="dxa" w:w="3504"/>
+            <w:shd w:fill="F0F6F8"/>
             <w:tcMar>
               <w:top w:w="25" w:type="dxa"/>
               <w:bottom w:w="25" w:type="dxa"/>
@@ -2739,6 +2845,7 @@
         <w:tc>
           <w:tcPr>
             <w:tcW w:type="dxa" w:w="3504"/>
+            <w:shd w:fill="F0F6F8"/>
             <w:tcMar>
               <w:top w:w="25" w:type="dxa"/>
               <w:bottom w:w="25" w:type="dxa"/>
@@ -2761,6 +2868,7 @@
         <w:tc>
           <w:tcPr>
             <w:tcW w:type="dxa" w:w="3504"/>
+            <w:shd w:fill="F0F6F8"/>
             <w:tcMar>
               <w:top w:w="25" w:type="dxa"/>
               <w:bottom w:w="25" w:type="dxa"/>
@@ -2781,6 +2889,7 @@
         <w:tc>
           <w:tcPr>
             <w:tcW w:type="dxa" w:w="3504"/>
+            <w:shd w:fill="F0F6F8"/>
             <w:tcMar>
               <w:top w:w="25" w:type="dxa"/>
               <w:bottom w:w="25" w:type="dxa"/>
@@ -2801,6 +2910,7 @@
         <w:tc>
           <w:tcPr>
             <w:tcW w:type="dxa" w:w="3504"/>
+            <w:shd w:fill="F0F6F8"/>
             <w:tcMar>
               <w:top w:w="25" w:type="dxa"/>
               <w:bottom w:w="25" w:type="dxa"/>
@@ -2823,6 +2933,7 @@
         <w:tc>
           <w:tcPr>
             <w:tcW w:type="dxa" w:w="3504"/>
+            <w:shd w:fill="F0F6F8"/>
             <w:tcMar>
               <w:top w:w="25" w:type="dxa"/>
               <w:bottom w:w="25" w:type="dxa"/>
@@ -2843,6 +2954,7 @@
         <w:tc>
           <w:tcPr>
             <w:tcW w:type="dxa" w:w="3504"/>
+            <w:shd w:fill="F0F6F8"/>
             <w:tcMar>
               <w:top w:w="25" w:type="dxa"/>
               <w:bottom w:w="25" w:type="dxa"/>
@@ -2863,6 +2975,7 @@
         <w:tc>
           <w:tcPr>
             <w:tcW w:type="dxa" w:w="3504"/>
+            <w:shd w:fill="F0F6F8"/>
             <w:tcMar>
               <w:top w:w="25" w:type="dxa"/>
               <w:bottom w:w="25" w:type="dxa"/>
@@ -2885,6 +2998,7 @@
         <w:tc>
           <w:tcPr>
             <w:tcW w:type="dxa" w:w="3504"/>
+            <w:shd w:fill="F0F6F8"/>
             <w:tcMar>
               <w:top w:w="25" w:type="dxa"/>
               <w:bottom w:w="25" w:type="dxa"/>
@@ -2905,6 +3019,7 @@
         <w:tc>
           <w:tcPr>
             <w:tcW w:type="dxa" w:w="3504"/>
+            <w:shd w:fill="F0F6F8"/>
             <w:tcMar>
               <w:top w:w="25" w:type="dxa"/>
               <w:bottom w:w="25" w:type="dxa"/>
@@ -2925,6 +3040,7 @@
         <w:tc>
           <w:tcPr>
             <w:tcW w:type="dxa" w:w="3504"/>
+            <w:shd w:fill="F0F6F8"/>
             <w:tcMar>
               <w:top w:w="25" w:type="dxa"/>
               <w:bottom w:w="25" w:type="dxa"/>
@@ -2982,6 +3098,7 @@
         <w:tc>
           <w:tcPr>
             <w:tcW w:type="dxa" w:w="5256"/>
+            <w:shd w:fill="F0F6F8"/>
             <w:tcMar>
               <w:top w:w="25" w:type="dxa"/>
               <w:bottom w:w="25" w:type="dxa"/>
@@ -3002,6 +3119,7 @@
         <w:tc>
           <w:tcPr>
             <w:tcW w:type="dxa" w:w="5256"/>
+            <w:shd w:fill="F0F6F8"/>
             <w:tcMar>
               <w:top w:w="25" w:type="dxa"/>
               <w:bottom w:w="25" w:type="dxa"/>
@@ -3024,6 +3142,7 @@
         <w:tc>
           <w:tcPr>
             <w:tcW w:type="dxa" w:w="5256"/>
+            <w:shd w:fill="F0F6F8"/>
             <w:tcMar>
               <w:top w:w="25" w:type="dxa"/>
               <w:bottom w:w="25" w:type="dxa"/>
@@ -3044,6 +3163,7 @@
         <w:tc>
           <w:tcPr>
             <w:tcW w:type="dxa" w:w="5256"/>
+            <w:shd w:fill="F0F6F8"/>
             <w:tcMar>
               <w:top w:w="25" w:type="dxa"/>
               <w:bottom w:w="25" w:type="dxa"/>
@@ -3066,6 +3186,7 @@
         <w:tc>
           <w:tcPr>
             <w:tcW w:type="dxa" w:w="5256"/>
+            <w:shd w:fill="F0F6F8"/>
             <w:tcMar>
               <w:top w:w="25" w:type="dxa"/>
               <w:bottom w:w="25" w:type="dxa"/>
@@ -3086,6 +3207,7 @@
         <w:tc>
           <w:tcPr>
             <w:tcW w:type="dxa" w:w="5256"/>
+            <w:shd w:fill="F0F6F8"/>
             <w:tcMar>
               <w:top w:w="25" w:type="dxa"/>
               <w:bottom w:w="25" w:type="dxa"/>
@@ -3144,6 +3266,7 @@
         <w:tc>
           <w:tcPr>
             <w:tcW w:type="dxa" w:w="3504"/>
+            <w:shd w:fill="F0F6F8"/>
             <w:tcMar>
               <w:top w:w="25" w:type="dxa"/>
               <w:bottom w:w="25" w:type="dxa"/>
@@ -3164,6 +3287,7 @@
         <w:tc>
           <w:tcPr>
             <w:tcW w:type="dxa" w:w="3504"/>
+            <w:shd w:fill="F0F6F8"/>
             <w:tcMar>
               <w:top w:w="25" w:type="dxa"/>
               <w:bottom w:w="25" w:type="dxa"/>
@@ -3184,6 +3308,7 @@
         <w:tc>
           <w:tcPr>
             <w:tcW w:type="dxa" w:w="3504"/>
+            <w:shd w:fill="F0F6F8"/>
             <w:tcMar>
               <w:top w:w="25" w:type="dxa"/>
               <w:bottom w:w="25" w:type="dxa"/>
@@ -3206,6 +3331,7 @@
         <w:tc>
           <w:tcPr>
             <w:tcW w:type="dxa" w:w="3504"/>
+            <w:shd w:fill="F0F6F8"/>
             <w:tcMar>
               <w:top w:w="25" w:type="dxa"/>
               <w:bottom w:w="25" w:type="dxa"/>
@@ -3226,6 +3352,7 @@
         <w:tc>
           <w:tcPr>
             <w:tcW w:type="dxa" w:w="3504"/>
+            <w:shd w:fill="F0F6F8"/>
             <w:tcMar>
               <w:top w:w="25" w:type="dxa"/>
               <w:bottom w:w="25" w:type="dxa"/>
@@ -3246,6 +3373,7 @@
         <w:tc>
           <w:tcPr>
             <w:tcW w:type="dxa" w:w="3504"/>
+            <w:shd w:fill="F0F6F8"/>
             <w:tcMar>
               <w:top w:w="25" w:type="dxa"/>
               <w:bottom w:w="25" w:type="dxa"/>
@@ -3287,6 +3415,7 @@
         <w:tc>
           <w:tcPr>
             <w:tcW w:type="dxa" w:w="3504"/>
+            <w:shd w:fill="F0F6F8"/>
             <w:tcMar>
               <w:top w:w="25" w:type="dxa"/>
               <w:bottom w:w="25" w:type="dxa"/>
@@ -3307,6 +3436,7 @@
         <w:tc>
           <w:tcPr>
             <w:tcW w:type="dxa" w:w="3504"/>
+            <w:shd w:fill="F0F6F8"/>
             <w:tcMar>
               <w:top w:w="25" w:type="dxa"/>
               <w:bottom w:w="25" w:type="dxa"/>
@@ -3327,6 +3457,7 @@
         <w:tc>
           <w:tcPr>
             <w:tcW w:type="dxa" w:w="3504"/>
+            <w:shd w:fill="F0F6F8"/>
             <w:tcMar>
               <w:top w:w="25" w:type="dxa"/>
               <w:bottom w:w="25" w:type="dxa"/>
@@ -3349,6 +3480,7 @@
         <w:tc>
           <w:tcPr>
             <w:tcW w:type="dxa" w:w="3504"/>
+            <w:shd w:fill="F0F6F8"/>
             <w:tcMar>
               <w:top w:w="25" w:type="dxa"/>
               <w:bottom w:w="25" w:type="dxa"/>
@@ -3369,6 +3501,7 @@
         <w:tc>
           <w:tcPr>
             <w:tcW w:type="dxa" w:w="3504"/>
+            <w:shd w:fill="F0F6F8"/>
             <w:tcMar>
               <w:top w:w="25" w:type="dxa"/>
               <w:bottom w:w="25" w:type="dxa"/>
@@ -3389,6 +3522,7 @@
         <w:tc>
           <w:tcPr>
             <w:tcW w:type="dxa" w:w="3504"/>
+            <w:shd w:fill="F0F6F8"/>
             <w:tcMar>
               <w:top w:w="25" w:type="dxa"/>
               <w:bottom w:w="25" w:type="dxa"/>
@@ -3411,6 +3545,7 @@
         <w:tc>
           <w:tcPr>
             <w:tcW w:type="dxa" w:w="3504"/>
+            <w:shd w:fill="F0F6F8"/>
             <w:tcMar>
               <w:top w:w="25" w:type="dxa"/>
               <w:bottom w:w="25" w:type="dxa"/>
@@ -3431,6 +3566,7 @@
         <w:tc>
           <w:tcPr>
             <w:tcW w:type="dxa" w:w="3504"/>
+            <w:shd w:fill="F0F6F8"/>
             <w:tcMar>
               <w:top w:w="25" w:type="dxa"/>
               <w:bottom w:w="25" w:type="dxa"/>
@@ -3451,6 +3587,7 @@
         <w:tc>
           <w:tcPr>
             <w:tcW w:type="dxa" w:w="3504"/>
+            <w:shd w:fill="F0F6F8"/>
             <w:tcMar>
               <w:top w:w="25" w:type="dxa"/>
               <w:bottom w:w="25" w:type="dxa"/>
@@ -3473,6 +3610,7 @@
         <w:tc>
           <w:tcPr>
             <w:tcW w:type="dxa" w:w="3504"/>
+            <w:shd w:fill="F0F6F8"/>
             <w:tcMar>
               <w:top w:w="25" w:type="dxa"/>
               <w:bottom w:w="25" w:type="dxa"/>
@@ -3493,6 +3631,7 @@
         <w:tc>
           <w:tcPr>
             <w:tcW w:type="dxa" w:w="3504"/>
+            <w:shd w:fill="F0F6F8"/>
             <w:tcMar>
               <w:top w:w="25" w:type="dxa"/>
               <w:bottom w:w="25" w:type="dxa"/>
@@ -3513,6 +3652,7 @@
         <w:tc>
           <w:tcPr>
             <w:tcW w:type="dxa" w:w="3504"/>
+            <w:shd w:fill="F0F6F8"/>
             <w:tcMar>
               <w:top w:w="25" w:type="dxa"/>
               <w:bottom w:w="25" w:type="dxa"/>
@@ -3560,6 +3700,7 @@
         <w:tc>
           <w:tcPr>
             <w:tcW w:type="dxa" w:w="3504"/>
+            <w:shd w:fill="F0F6F8"/>
             <w:tcMar>
               <w:top w:w="25" w:type="dxa"/>
               <w:bottom w:w="25" w:type="dxa"/>
@@ -3580,6 +3721,7 @@
         <w:tc>
           <w:tcPr>
             <w:tcW w:type="dxa" w:w="3504"/>
+            <w:shd w:fill="F0F6F8"/>
             <w:tcMar>
               <w:top w:w="25" w:type="dxa"/>
               <w:bottom w:w="25" w:type="dxa"/>
@@ -3600,6 +3742,7 @@
         <w:tc>
           <w:tcPr>
             <w:tcW w:type="dxa" w:w="3504"/>
+            <w:shd w:fill="F0F6F8"/>
             <w:tcMar>
               <w:top w:w="25" w:type="dxa"/>
               <w:bottom w:w="25" w:type="dxa"/>
@@ -3622,6 +3765,7 @@
         <w:tc>
           <w:tcPr>
             <w:tcW w:type="dxa" w:w="3504"/>
+            <w:shd w:fill="F0F6F8"/>
             <w:tcMar>
               <w:top w:w="25" w:type="dxa"/>
               <w:bottom w:w="25" w:type="dxa"/>
@@ -3642,6 +3786,7 @@
         <w:tc>
           <w:tcPr>
             <w:tcW w:type="dxa" w:w="3504"/>
+            <w:shd w:fill="F0F6F8"/>
             <w:tcMar>
               <w:top w:w="25" w:type="dxa"/>
               <w:bottom w:w="25" w:type="dxa"/>
@@ -3662,6 +3807,7 @@
         <w:tc>
           <w:tcPr>
             <w:tcW w:type="dxa" w:w="3504"/>
+            <w:shd w:fill="F0F6F8"/>
             <w:tcMar>
               <w:top w:w="25" w:type="dxa"/>
               <w:bottom w:w="25" w:type="dxa"/>
@@ -3763,6 +3909,7 @@
         <w:tc>
           <w:tcPr>
             <w:tcW w:type="dxa" w:w="3504"/>
+            <w:shd w:fill="F0F6F8"/>
             <w:tcMar>
               <w:top w:w="25" w:type="dxa"/>
               <w:bottom w:w="25" w:type="dxa"/>
@@ -3783,6 +3930,7 @@
         <w:tc>
           <w:tcPr>
             <w:tcW w:type="dxa" w:w="3504"/>
+            <w:shd w:fill="F0F6F8"/>
             <w:tcMar>
               <w:top w:w="25" w:type="dxa"/>
               <w:bottom w:w="25" w:type="dxa"/>
@@ -3803,6 +3951,7 @@
         <w:tc>
           <w:tcPr>
             <w:tcW w:type="dxa" w:w="3504"/>
+            <w:shd w:fill="F0F6F8"/>
             <w:tcMar>
               <w:top w:w="25" w:type="dxa"/>
               <w:bottom w:w="25" w:type="dxa"/>
@@ -3825,6 +3974,7 @@
         <w:tc>
           <w:tcPr>
             <w:tcW w:type="dxa" w:w="3504"/>
+            <w:shd w:fill="F0F6F8"/>
             <w:tcMar>
               <w:top w:w="25" w:type="dxa"/>
               <w:bottom w:w="25" w:type="dxa"/>
@@ -3845,6 +3995,7 @@
         <w:tc>
           <w:tcPr>
             <w:tcW w:type="dxa" w:w="3504"/>
+            <w:shd w:fill="F0F6F8"/>
             <w:tcMar>
               <w:top w:w="25" w:type="dxa"/>
               <w:bottom w:w="25" w:type="dxa"/>
@@ -3865,6 +4016,7 @@
         <w:tc>
           <w:tcPr>
             <w:tcW w:type="dxa" w:w="3504"/>
+            <w:shd w:fill="F0F6F8"/>
             <w:tcMar>
               <w:top w:w="25" w:type="dxa"/>
               <w:bottom w:w="25" w:type="dxa"/>
@@ -3906,6 +4058,7 @@
         <w:tc>
           <w:tcPr>
             <w:tcW w:type="dxa" w:w="3504"/>
+            <w:shd w:fill="F0F6F8"/>
             <w:tcMar>
               <w:top w:w="25" w:type="dxa"/>
               <w:bottom w:w="25" w:type="dxa"/>
@@ -3926,6 +4079,7 @@
         <w:tc>
           <w:tcPr>
             <w:tcW w:type="dxa" w:w="3504"/>
+            <w:shd w:fill="F0F6F8"/>
             <w:tcMar>
               <w:top w:w="25" w:type="dxa"/>
               <w:bottom w:w="25" w:type="dxa"/>
@@ -3946,6 +4100,7 @@
         <w:tc>
           <w:tcPr>
             <w:tcW w:type="dxa" w:w="3504"/>
+            <w:shd w:fill="F0F6F8"/>
             <w:tcMar>
               <w:top w:w="25" w:type="dxa"/>
               <w:bottom w:w="25" w:type="dxa"/>
@@ -3968,6 +4123,7 @@
         <w:tc>
           <w:tcPr>
             <w:tcW w:type="dxa" w:w="3504"/>
+            <w:shd w:fill="F0F6F8"/>
             <w:tcMar>
               <w:top w:w="25" w:type="dxa"/>
               <w:bottom w:w="25" w:type="dxa"/>
@@ -3988,6 +4144,7 @@
         <w:tc>
           <w:tcPr>
             <w:tcW w:type="dxa" w:w="3504"/>
+            <w:shd w:fill="F0F6F8"/>
             <w:tcMar>
               <w:top w:w="25" w:type="dxa"/>
               <w:bottom w:w="25" w:type="dxa"/>
@@ -4008,6 +4165,7 @@
         <w:tc>
           <w:tcPr>
             <w:tcW w:type="dxa" w:w="3504"/>
+            <w:shd w:fill="F0F6F8"/>
             <w:tcMar>
               <w:top w:w="25" w:type="dxa"/>
               <w:bottom w:w="25" w:type="dxa"/>
@@ -4049,6 +4207,7 @@
         <w:tc>
           <w:tcPr>
             <w:tcW w:type="dxa" w:w="3504"/>
+            <w:shd w:fill="F0F6F8"/>
             <w:tcMar>
               <w:top w:w="25" w:type="dxa"/>
               <w:bottom w:w="25" w:type="dxa"/>
@@ -4069,6 +4228,7 @@
         <w:tc>
           <w:tcPr>
             <w:tcW w:type="dxa" w:w="3504"/>
+            <w:shd w:fill="F0F6F8"/>
             <w:tcMar>
               <w:top w:w="25" w:type="dxa"/>
               <w:bottom w:w="25" w:type="dxa"/>
@@ -4089,6 +4249,7 @@
         <w:tc>
           <w:tcPr>
             <w:tcW w:type="dxa" w:w="3504"/>
+            <w:shd w:fill="F0F6F8"/>
             <w:tcMar>
               <w:top w:w="25" w:type="dxa"/>
               <w:bottom w:w="25" w:type="dxa"/>
@@ -4111,6 +4272,7 @@
         <w:tc>
           <w:tcPr>
             <w:tcW w:type="dxa" w:w="3504"/>
+            <w:shd w:fill="F0F6F8"/>
             <w:tcMar>
               <w:top w:w="25" w:type="dxa"/>
               <w:bottom w:w="25" w:type="dxa"/>
@@ -4131,6 +4293,7 @@
         <w:tc>
           <w:tcPr>
             <w:tcW w:type="dxa" w:w="3504"/>
+            <w:shd w:fill="F0F6F8"/>
             <w:tcMar>
               <w:top w:w="25" w:type="dxa"/>
               <w:bottom w:w="25" w:type="dxa"/>
@@ -4145,6 +4308,7 @@
         <w:tc>
           <w:tcPr>
             <w:tcW w:type="dxa" w:w="3504"/>
+            <w:shd w:fill="F0F6F8"/>
             <w:tcMar>
               <w:top w:w="25" w:type="dxa"/>
               <w:bottom w:w="25" w:type="dxa"/>
@@ -4186,6 +4350,7 @@
         <w:tc>
           <w:tcPr>
             <w:tcW w:type="dxa" w:w="3504"/>
+            <w:shd w:fill="F0F6F8"/>
             <w:tcMar>
               <w:top w:w="25" w:type="dxa"/>
               <w:bottom w:w="25" w:type="dxa"/>
@@ -4206,6 +4371,7 @@
         <w:tc>
           <w:tcPr>
             <w:tcW w:type="dxa" w:w="3504"/>
+            <w:shd w:fill="F0F6F8"/>
             <w:tcMar>
               <w:top w:w="25" w:type="dxa"/>
               <w:bottom w:w="25" w:type="dxa"/>
@@ -4226,6 +4392,7 @@
         <w:tc>
           <w:tcPr>
             <w:tcW w:type="dxa" w:w="3504"/>
+            <w:shd w:fill="F0F6F8"/>
             <w:tcMar>
               <w:top w:w="25" w:type="dxa"/>
               <w:bottom w:w="25" w:type="dxa"/>
@@ -4248,6 +4415,7 @@
         <w:tc>
           <w:tcPr>
             <w:tcW w:type="dxa" w:w="3504"/>
+            <w:shd w:fill="F0F6F8"/>
             <w:tcMar>
               <w:top w:w="25" w:type="dxa"/>
               <w:bottom w:w="25" w:type="dxa"/>
@@ -4268,6 +4436,7 @@
         <w:tc>
           <w:tcPr>
             <w:tcW w:type="dxa" w:w="3504"/>
+            <w:shd w:fill="F0F6F8"/>
             <w:tcMar>
               <w:top w:w="25" w:type="dxa"/>
               <w:bottom w:w="25" w:type="dxa"/>
@@ -4282,6 +4451,7 @@
         <w:tc>
           <w:tcPr>
             <w:tcW w:type="dxa" w:w="3504"/>
+            <w:shd w:fill="F0F6F8"/>
             <w:tcMar>
               <w:top w:w="25" w:type="dxa"/>
               <w:bottom w:w="25" w:type="dxa"/>
@@ -4323,6 +4493,7 @@
         <w:tc>
           <w:tcPr>
             <w:tcW w:type="dxa" w:w="3504"/>
+            <w:shd w:fill="F0F6F8"/>
             <w:tcMar>
               <w:top w:w="25" w:type="dxa"/>
               <w:bottom w:w="25" w:type="dxa"/>
@@ -4343,6 +4514,7 @@
         <w:tc>
           <w:tcPr>
             <w:tcW w:type="dxa" w:w="3504"/>
+            <w:shd w:fill="F0F6F8"/>
             <w:tcMar>
               <w:top w:w="25" w:type="dxa"/>
               <w:bottom w:w="25" w:type="dxa"/>
@@ -4363,6 +4535,7 @@
         <w:tc>
           <w:tcPr>
             <w:tcW w:type="dxa" w:w="3504"/>
+            <w:shd w:fill="F0F6F8"/>
             <w:tcMar>
               <w:top w:w="25" w:type="dxa"/>
               <w:bottom w:w="25" w:type="dxa"/>
@@ -4385,6 +4558,7 @@
         <w:tc>
           <w:tcPr>
             <w:tcW w:type="dxa" w:w="3504"/>
+            <w:shd w:fill="F0F6F8"/>
             <w:tcMar>
               <w:top w:w="25" w:type="dxa"/>
               <w:bottom w:w="25" w:type="dxa"/>
@@ -4405,6 +4579,7 @@
         <w:tc>
           <w:tcPr>
             <w:tcW w:type="dxa" w:w="3504"/>
+            <w:shd w:fill="F0F6F8"/>
             <w:tcMar>
               <w:top w:w="25" w:type="dxa"/>
               <w:bottom w:w="25" w:type="dxa"/>
@@ -4419,6 +4594,7 @@
         <w:tc>
           <w:tcPr>
             <w:tcW w:type="dxa" w:w="3504"/>
+            <w:shd w:fill="F0F6F8"/>
             <w:tcMar>
               <w:top w:w="25" w:type="dxa"/>
               <w:bottom w:w="25" w:type="dxa"/>
@@ -4459,6 +4635,7 @@
         <w:tc>
           <w:tcPr>
             <w:tcW w:type="dxa" w:w="5256"/>
+            <w:shd w:fill="F0F6F8"/>
             <w:tcMar>
               <w:top w:w="25" w:type="dxa"/>
               <w:bottom w:w="25" w:type="dxa"/>
@@ -4479,6 +4656,7 @@
         <w:tc>
           <w:tcPr>
             <w:tcW w:type="dxa" w:w="5256"/>
+            <w:shd w:fill="F0F6F8"/>
             <w:tcMar>
               <w:top w:w="25" w:type="dxa"/>
               <w:bottom w:w="25" w:type="dxa"/>
@@ -4501,6 +4679,7 @@
         <w:tc>
           <w:tcPr>
             <w:tcW w:type="dxa" w:w="5256"/>
+            <w:shd w:fill="F0F6F8"/>
             <w:tcMar>
               <w:top w:w="25" w:type="dxa"/>
               <w:bottom w:w="25" w:type="dxa"/>
@@ -4521,6 +4700,7 @@
         <w:tc>
           <w:tcPr>
             <w:tcW w:type="dxa" w:w="5256"/>
+            <w:shd w:fill="F0F6F8"/>
             <w:tcMar>
               <w:top w:w="25" w:type="dxa"/>
               <w:bottom w:w="25" w:type="dxa"/>
@@ -4568,6 +4748,7 @@
         <w:tc>
           <w:tcPr>
             <w:tcW w:type="dxa" w:w="3504"/>
+            <w:shd w:fill="F0F6F8"/>
             <w:tcMar>
               <w:top w:w="25" w:type="dxa"/>
               <w:bottom w:w="25" w:type="dxa"/>
@@ -4588,6 +4769,7 @@
         <w:tc>
           <w:tcPr>
             <w:tcW w:type="dxa" w:w="3504"/>
+            <w:shd w:fill="F0F6F8"/>
             <w:tcMar>
               <w:top w:w="25" w:type="dxa"/>
               <w:bottom w:w="25" w:type="dxa"/>
@@ -4608,6 +4790,7 @@
         <w:tc>
           <w:tcPr>
             <w:tcW w:type="dxa" w:w="3504"/>
+            <w:shd w:fill="F0F6F8"/>
             <w:tcMar>
               <w:top w:w="25" w:type="dxa"/>
               <w:bottom w:w="25" w:type="dxa"/>
@@ -4630,6 +4813,7 @@
         <w:tc>
           <w:tcPr>
             <w:tcW w:type="dxa" w:w="3504"/>
+            <w:shd w:fill="F0F6F8"/>
             <w:tcMar>
               <w:top w:w="25" w:type="dxa"/>
               <w:bottom w:w="25" w:type="dxa"/>
@@ -4650,6 +4834,7 @@
         <w:tc>
           <w:tcPr>
             <w:tcW w:type="dxa" w:w="3504"/>
+            <w:shd w:fill="F0F6F8"/>
             <w:tcMar>
               <w:top w:w="25" w:type="dxa"/>
               <w:bottom w:w="25" w:type="dxa"/>
@@ -4664,6 +4849,7 @@
         <w:tc>
           <w:tcPr>
             <w:tcW w:type="dxa" w:w="3504"/>
+            <w:shd w:fill="F0F6F8"/>
             <w:tcMar>
               <w:top w:w="25" w:type="dxa"/>
               <w:bottom w:w="25" w:type="dxa"/>
@@ -4705,6 +4891,7 @@
         <w:tc>
           <w:tcPr>
             <w:tcW w:type="dxa" w:w="3504"/>
+            <w:shd w:fill="F0F6F8"/>
             <w:tcMar>
               <w:top w:w="25" w:type="dxa"/>
               <w:bottom w:w="25" w:type="dxa"/>
@@ -4725,6 +4912,7 @@
         <w:tc>
           <w:tcPr>
             <w:tcW w:type="dxa" w:w="3504"/>
+            <w:shd w:fill="F0F6F8"/>
             <w:tcMar>
               <w:top w:w="25" w:type="dxa"/>
               <w:bottom w:w="25" w:type="dxa"/>
@@ -4745,6 +4933,7 @@
         <w:tc>
           <w:tcPr>
             <w:tcW w:type="dxa" w:w="3504"/>
+            <w:shd w:fill="F0F6F8"/>
             <w:tcMar>
               <w:top w:w="25" w:type="dxa"/>
               <w:bottom w:w="25" w:type="dxa"/>
@@ -4767,6 +4956,7 @@
         <w:tc>
           <w:tcPr>
             <w:tcW w:type="dxa" w:w="3504"/>
+            <w:shd w:fill="F0F6F8"/>
             <w:tcMar>
               <w:top w:w="25" w:type="dxa"/>
               <w:bottom w:w="25" w:type="dxa"/>
@@ -4787,6 +4977,7 @@
         <w:tc>
           <w:tcPr>
             <w:tcW w:type="dxa" w:w="3504"/>
+            <w:shd w:fill="F0F6F8"/>
             <w:tcMar>
               <w:top w:w="25" w:type="dxa"/>
               <w:bottom w:w="25" w:type="dxa"/>
@@ -4807,6 +4998,7 @@
         <w:tc>
           <w:tcPr>
             <w:tcW w:type="dxa" w:w="3504"/>
+            <w:shd w:fill="F0F6F8"/>
             <w:tcMar>
               <w:top w:w="25" w:type="dxa"/>
               <w:bottom w:w="25" w:type="dxa"/>
@@ -4829,6 +5021,7 @@
         <w:tc>
           <w:tcPr>
             <w:tcW w:type="dxa" w:w="3504"/>
+            <w:shd w:fill="F0F6F8"/>
             <w:tcMar>
               <w:top w:w="25" w:type="dxa"/>
               <w:bottom w:w="25" w:type="dxa"/>
@@ -4849,6 +5042,7 @@
         <w:tc>
           <w:tcPr>
             <w:tcW w:type="dxa" w:w="3504"/>
+            <w:shd w:fill="F0F6F8"/>
             <w:tcMar>
               <w:top w:w="25" w:type="dxa"/>
               <w:bottom w:w="25" w:type="dxa"/>
@@ -4869,6 +5063,7 @@
         <w:tc>
           <w:tcPr>
             <w:tcW w:type="dxa" w:w="3504"/>
+            <w:shd w:fill="F0F6F8"/>
             <w:tcMar>
               <w:top w:w="25" w:type="dxa"/>
               <w:bottom w:w="25" w:type="dxa"/>
@@ -4910,6 +5105,7 @@
         <w:tc>
           <w:tcPr>
             <w:tcW w:type="dxa" w:w="3504"/>
+            <w:shd w:fill="F0F6F8"/>
             <w:tcMar>
               <w:top w:w="25" w:type="dxa"/>
               <w:bottom w:w="25" w:type="dxa"/>
@@ -4930,6 +5126,7 @@
         <w:tc>
           <w:tcPr>
             <w:tcW w:type="dxa" w:w="3504"/>
+            <w:shd w:fill="F0F6F8"/>
             <w:tcMar>
               <w:top w:w="25" w:type="dxa"/>
               <w:bottom w:w="25" w:type="dxa"/>
@@ -4950,6 +5147,7 @@
         <w:tc>
           <w:tcPr>
             <w:tcW w:type="dxa" w:w="3504"/>
+            <w:shd w:fill="F0F6F8"/>
             <w:tcMar>
               <w:top w:w="25" w:type="dxa"/>
               <w:bottom w:w="25" w:type="dxa"/>
@@ -4972,6 +5170,7 @@
         <w:tc>
           <w:tcPr>
             <w:tcW w:type="dxa" w:w="3504"/>
+            <w:shd w:fill="F0F6F8"/>
             <w:tcMar>
               <w:top w:w="25" w:type="dxa"/>
               <w:bottom w:w="25" w:type="dxa"/>
@@ -4992,6 +5191,7 @@
         <w:tc>
           <w:tcPr>
             <w:tcW w:type="dxa" w:w="3504"/>
+            <w:shd w:fill="F0F6F8"/>
             <w:tcMar>
               <w:top w:w="25" w:type="dxa"/>
               <w:bottom w:w="25" w:type="dxa"/>
@@ -5006,6 +5206,7 @@
         <w:tc>
           <w:tcPr>
             <w:tcW w:type="dxa" w:w="3504"/>
+            <w:shd w:fill="F0F6F8"/>
             <w:tcMar>
               <w:top w:w="25" w:type="dxa"/>
               <w:bottom w:w="25" w:type="dxa"/>
@@ -5047,6 +5248,7 @@
         <w:tc>
           <w:tcPr>
             <w:tcW w:type="dxa" w:w="3504"/>
+            <w:shd w:fill="F0F6F8"/>
             <w:tcMar>
               <w:top w:w="25" w:type="dxa"/>
               <w:bottom w:w="25" w:type="dxa"/>
@@ -5067,6 +5269,7 @@
         <w:tc>
           <w:tcPr>
             <w:tcW w:type="dxa" w:w="3504"/>
+            <w:shd w:fill="F0F6F8"/>
             <w:tcMar>
               <w:top w:w="25" w:type="dxa"/>
               <w:bottom w:w="25" w:type="dxa"/>
@@ -5087,6 +5290,7 @@
         <w:tc>
           <w:tcPr>
             <w:tcW w:type="dxa" w:w="3504"/>
+            <w:shd w:fill="F0F6F8"/>
             <w:tcMar>
               <w:top w:w="25" w:type="dxa"/>
               <w:bottom w:w="25" w:type="dxa"/>
@@ -5109,6 +5313,7 @@
         <w:tc>
           <w:tcPr>
             <w:tcW w:type="dxa" w:w="3504"/>
+            <w:shd w:fill="F0F6F8"/>
             <w:tcMar>
               <w:top w:w="25" w:type="dxa"/>
               <w:bottom w:w="25" w:type="dxa"/>
@@ -5129,6 +5334,7 @@
         <w:tc>
           <w:tcPr>
             <w:tcW w:type="dxa" w:w="3504"/>
+            <w:shd w:fill="F0F6F8"/>
             <w:tcMar>
               <w:top w:w="25" w:type="dxa"/>
               <w:bottom w:w="25" w:type="dxa"/>
@@ -5149,6 +5355,7 @@
         <w:tc>
           <w:tcPr>
             <w:tcW w:type="dxa" w:w="3504"/>
+            <w:shd w:fill="F0F6F8"/>
             <w:tcMar>
               <w:top w:w="25" w:type="dxa"/>
               <w:bottom w:w="25" w:type="dxa"/>
@@ -5190,6 +5397,7 @@
         <w:tc>
           <w:tcPr>
             <w:tcW w:type="dxa" w:w="3504"/>
+            <w:shd w:fill="F0F6F8"/>
             <w:tcMar>
               <w:top w:w="25" w:type="dxa"/>
               <w:bottom w:w="25" w:type="dxa"/>
@@ -5210,6 +5418,7 @@
         <w:tc>
           <w:tcPr>
             <w:tcW w:type="dxa" w:w="3504"/>
+            <w:shd w:fill="F0F6F8"/>
             <w:tcMar>
               <w:top w:w="25" w:type="dxa"/>
               <w:bottom w:w="25" w:type="dxa"/>
@@ -5230,6 +5439,7 @@
         <w:tc>
           <w:tcPr>
             <w:tcW w:type="dxa" w:w="3504"/>
+            <w:shd w:fill="F0F6F8"/>
             <w:tcMar>
               <w:top w:w="25" w:type="dxa"/>
               <w:bottom w:w="25" w:type="dxa"/>
@@ -5252,6 +5462,7 @@
         <w:tc>
           <w:tcPr>
             <w:tcW w:type="dxa" w:w="3504"/>
+            <w:shd w:fill="F0F6F8"/>
             <w:tcMar>
               <w:top w:w="25" w:type="dxa"/>
               <w:bottom w:w="25" w:type="dxa"/>
@@ -5272,6 +5483,7 @@
         <w:tc>
           <w:tcPr>
             <w:tcW w:type="dxa" w:w="3504"/>
+            <w:shd w:fill="F0F6F8"/>
             <w:tcMar>
               <w:top w:w="25" w:type="dxa"/>
               <w:bottom w:w="25" w:type="dxa"/>
@@ -5286,6 +5498,7 @@
         <w:tc>
           <w:tcPr>
             <w:tcW w:type="dxa" w:w="3504"/>
+            <w:shd w:fill="F0F6F8"/>
             <w:tcMar>
               <w:top w:w="25" w:type="dxa"/>
               <w:bottom w:w="25" w:type="dxa"/>
@@ -5327,6 +5540,7 @@
         <w:tc>
           <w:tcPr>
             <w:tcW w:type="dxa" w:w="3504"/>
+            <w:shd w:fill="F0F6F8"/>
             <w:tcMar>
               <w:top w:w="25" w:type="dxa"/>
               <w:bottom w:w="25" w:type="dxa"/>
@@ -5347,6 +5561,7 @@
         <w:tc>
           <w:tcPr>
             <w:tcW w:type="dxa" w:w="3504"/>
+            <w:shd w:fill="F0F6F8"/>
             <w:tcMar>
               <w:top w:w="25" w:type="dxa"/>
               <w:bottom w:w="25" w:type="dxa"/>
@@ -5367,6 +5582,7 @@
         <w:tc>
           <w:tcPr>
             <w:tcW w:type="dxa" w:w="3504"/>
+            <w:shd w:fill="F0F6F8"/>
             <w:tcMar>
               <w:top w:w="25" w:type="dxa"/>
               <w:bottom w:w="25" w:type="dxa"/>
@@ -5389,6 +5605,7 @@
         <w:tc>
           <w:tcPr>
             <w:tcW w:type="dxa" w:w="3504"/>
+            <w:shd w:fill="F0F6F8"/>
             <w:tcMar>
               <w:top w:w="25" w:type="dxa"/>
               <w:bottom w:w="25" w:type="dxa"/>
@@ -5409,6 +5626,7 @@
         <w:tc>
           <w:tcPr>
             <w:tcW w:type="dxa" w:w="3504"/>
+            <w:shd w:fill="F0F6F8"/>
             <w:tcMar>
               <w:top w:w="25" w:type="dxa"/>
               <w:bottom w:w="25" w:type="dxa"/>
@@ -5423,6 +5641,7 @@
         <w:tc>
           <w:tcPr>
             <w:tcW w:type="dxa" w:w="3504"/>
+            <w:shd w:fill="F0F6F8"/>
             <w:tcMar>
               <w:top w:w="25" w:type="dxa"/>
               <w:bottom w:w="25" w:type="dxa"/>
@@ -5464,6 +5683,7 @@
         <w:tc>
           <w:tcPr>
             <w:tcW w:type="dxa" w:w="3504"/>
+            <w:shd w:fill="F0F6F8"/>
             <w:tcMar>
               <w:top w:w="25" w:type="dxa"/>
               <w:bottom w:w="25" w:type="dxa"/>
@@ -5484,6 +5704,7 @@
         <w:tc>
           <w:tcPr>
             <w:tcW w:type="dxa" w:w="3504"/>
+            <w:shd w:fill="F0F6F8"/>
             <w:tcMar>
               <w:top w:w="25" w:type="dxa"/>
               <w:bottom w:w="25" w:type="dxa"/>
@@ -5504,6 +5725,7 @@
         <w:tc>
           <w:tcPr>
             <w:tcW w:type="dxa" w:w="3504"/>
+            <w:shd w:fill="F0F6F8"/>
             <w:tcMar>
               <w:top w:w="25" w:type="dxa"/>
               <w:bottom w:w="25" w:type="dxa"/>
@@ -5526,6 +5748,7 @@
         <w:tc>
           <w:tcPr>
             <w:tcW w:type="dxa" w:w="3504"/>
+            <w:shd w:fill="F0F6F8"/>
             <w:tcMar>
               <w:top w:w="25" w:type="dxa"/>
               <w:bottom w:w="25" w:type="dxa"/>
@@ -5546,6 +5769,7 @@
         <w:tc>
           <w:tcPr>
             <w:tcW w:type="dxa" w:w="3504"/>
+            <w:shd w:fill="F0F6F8"/>
             <w:tcMar>
               <w:top w:w="25" w:type="dxa"/>
               <w:bottom w:w="25" w:type="dxa"/>
@@ -5560,6 +5784,7 @@
         <w:tc>
           <w:tcPr>
             <w:tcW w:type="dxa" w:w="3504"/>
+            <w:shd w:fill="F0F6F8"/>
             <w:tcMar>
               <w:top w:w="25" w:type="dxa"/>
               <w:bottom w:w="25" w:type="dxa"/>
@@ -5660,6 +5885,7 @@
         <w:tc>
           <w:tcPr>
             <w:tcW w:type="dxa" w:w="5256"/>
+            <w:shd w:fill="F0F6F8"/>
             <w:tcMar>
               <w:top w:w="25" w:type="dxa"/>
               <w:bottom w:w="25" w:type="dxa"/>
@@ -5680,6 +5906,7 @@
         <w:tc>
           <w:tcPr>
             <w:tcW w:type="dxa" w:w="5256"/>
+            <w:shd w:fill="F0F6F8"/>
             <w:tcMar>
               <w:top w:w="25" w:type="dxa"/>
               <w:bottom w:w="25" w:type="dxa"/>
@@ -5702,6 +5929,7 @@
         <w:tc>
           <w:tcPr>
             <w:tcW w:type="dxa" w:w="5256"/>
+            <w:shd w:fill="F0F6F8"/>
             <w:tcMar>
               <w:top w:w="25" w:type="dxa"/>
               <w:bottom w:w="25" w:type="dxa"/>
@@ -5722,6 +5950,7 @@
         <w:tc>
           <w:tcPr>
             <w:tcW w:type="dxa" w:w="5256"/>
+            <w:shd w:fill="F0F6F8"/>
             <w:tcMar>
               <w:top w:w="25" w:type="dxa"/>
               <w:bottom w:w="25" w:type="dxa"/>
@@ -5744,6 +5973,7 @@
         <w:tc>
           <w:tcPr>
             <w:tcW w:type="dxa" w:w="5256"/>
+            <w:shd w:fill="F0F6F8"/>
             <w:tcMar>
               <w:top w:w="25" w:type="dxa"/>
               <w:bottom w:w="25" w:type="dxa"/>
@@ -5764,6 +5994,7 @@
         <w:tc>
           <w:tcPr>
             <w:tcW w:type="dxa" w:w="5256"/>
+            <w:shd w:fill="F0F6F8"/>
             <w:tcMar>
               <w:top w:w="25" w:type="dxa"/>
               <w:bottom w:w="25" w:type="dxa"/>
@@ -5786,6 +6017,7 @@
         <w:tc>
           <w:tcPr>
             <w:tcW w:type="dxa" w:w="5256"/>
+            <w:shd w:fill="F0F6F8"/>
             <w:tcMar>
               <w:top w:w="25" w:type="dxa"/>
               <w:bottom w:w="25" w:type="dxa"/>
@@ -5806,6 +6038,7 @@
         <w:tc>
           <w:tcPr>
             <w:tcW w:type="dxa" w:w="5256"/>
+            <w:shd w:fill="F0F6F8"/>
             <w:tcMar>
               <w:top w:w="25" w:type="dxa"/>
               <w:bottom w:w="25" w:type="dxa"/>
@@ -5853,6 +6086,7 @@
         <w:tc>
           <w:tcPr>
             <w:tcW w:type="dxa" w:w="3504"/>
+            <w:shd w:fill="F0F6F8"/>
             <w:tcMar>
               <w:top w:w="25" w:type="dxa"/>
               <w:bottom w:w="25" w:type="dxa"/>
@@ -5873,6 +6107,7 @@
         <w:tc>
           <w:tcPr>
             <w:tcW w:type="dxa" w:w="3504"/>
+            <w:shd w:fill="F0F6F8"/>
             <w:tcMar>
               <w:top w:w="25" w:type="dxa"/>
               <w:bottom w:w="25" w:type="dxa"/>
@@ -5893,6 +6128,7 @@
         <w:tc>
           <w:tcPr>
             <w:tcW w:type="dxa" w:w="3504"/>
+            <w:shd w:fill="F0F6F8"/>
             <w:tcMar>
               <w:top w:w="25" w:type="dxa"/>
               <w:bottom w:w="25" w:type="dxa"/>
@@ -5915,6 +6151,7 @@
         <w:tc>
           <w:tcPr>
             <w:tcW w:type="dxa" w:w="3504"/>
+            <w:shd w:fill="F0F6F8"/>
             <w:tcMar>
               <w:top w:w="25" w:type="dxa"/>
               <w:bottom w:w="25" w:type="dxa"/>
@@ -5935,6 +6172,7 @@
         <w:tc>
           <w:tcPr>
             <w:tcW w:type="dxa" w:w="3504"/>
+            <w:shd w:fill="F0F6F8"/>
             <w:tcMar>
               <w:top w:w="25" w:type="dxa"/>
               <w:bottom w:w="25" w:type="dxa"/>
@@ -5955,6 +6193,7 @@
         <w:tc>
           <w:tcPr>
             <w:tcW w:type="dxa" w:w="3504"/>
+            <w:shd w:fill="F0F6F8"/>
             <w:tcMar>
               <w:top w:w="25" w:type="dxa"/>
               <w:bottom w:w="25" w:type="dxa"/>
@@ -5977,6 +6216,7 @@
         <w:tc>
           <w:tcPr>
             <w:tcW w:type="dxa" w:w="3504"/>
+            <w:shd w:fill="F0F6F8"/>
             <w:tcMar>
               <w:top w:w="25" w:type="dxa"/>
               <w:bottom w:w="25" w:type="dxa"/>
@@ -5997,6 +6237,7 @@
         <w:tc>
           <w:tcPr>
             <w:tcW w:type="dxa" w:w="3504"/>
+            <w:shd w:fill="F0F6F8"/>
             <w:tcMar>
               <w:top w:w="25" w:type="dxa"/>
               <w:bottom w:w="25" w:type="dxa"/>
@@ -6017,6 +6258,7 @@
         <w:tc>
           <w:tcPr>
             <w:tcW w:type="dxa" w:w="3504"/>
+            <w:shd w:fill="F0F6F8"/>
             <w:tcMar>
               <w:top w:w="25" w:type="dxa"/>
               <w:bottom w:w="25" w:type="dxa"/>
@@ -6057,6 +6299,7 @@
         <w:tc>
           <w:tcPr>
             <w:tcW w:type="dxa" w:w="5256"/>
+            <w:shd w:fill="F0F6F8"/>
             <w:tcMar>
               <w:top w:w="25" w:type="dxa"/>
               <w:bottom w:w="25" w:type="dxa"/>
@@ -6077,6 +6320,7 @@
         <w:tc>
           <w:tcPr>
             <w:tcW w:type="dxa" w:w="5256"/>
+            <w:shd w:fill="F0F6F8"/>
             <w:tcMar>
               <w:top w:w="25" w:type="dxa"/>
               <w:bottom w:w="25" w:type="dxa"/>
@@ -6099,6 +6343,7 @@
         <w:tc>
           <w:tcPr>
             <w:tcW w:type="dxa" w:w="5256"/>
+            <w:shd w:fill="F0F6F8"/>
             <w:tcMar>
               <w:top w:w="25" w:type="dxa"/>
               <w:bottom w:w="25" w:type="dxa"/>
@@ -6119,6 +6364,7 @@
         <w:tc>
           <w:tcPr>
             <w:tcW w:type="dxa" w:w="5256"/>
+            <w:shd w:fill="F0F6F8"/>
             <w:tcMar>
               <w:top w:w="25" w:type="dxa"/>
               <w:bottom w:w="25" w:type="dxa"/>
@@ -6141,6 +6387,7 @@
         <w:tc>
           <w:tcPr>
             <w:tcW w:type="dxa" w:w="5256"/>
+            <w:shd w:fill="F0F6F8"/>
             <w:tcMar>
               <w:top w:w="25" w:type="dxa"/>
               <w:bottom w:w="25" w:type="dxa"/>
@@ -6161,6 +6408,7 @@
         <w:tc>
           <w:tcPr>
             <w:tcW w:type="dxa" w:w="5256"/>
+            <w:shd w:fill="F0F6F8"/>
             <w:tcMar>
               <w:top w:w="25" w:type="dxa"/>
               <w:bottom w:w="25" w:type="dxa"/>
@@ -6201,6 +6449,7 @@
         <w:tc>
           <w:tcPr>
             <w:tcW w:type="dxa" w:w="5256"/>
+            <w:shd w:fill="F0F6F8"/>
             <w:tcMar>
               <w:top w:w="25" w:type="dxa"/>
               <w:bottom w:w="25" w:type="dxa"/>
@@ -6221,6 +6470,7 @@
         <w:tc>
           <w:tcPr>
             <w:tcW w:type="dxa" w:w="5256"/>
+            <w:shd w:fill="F0F6F8"/>
             <w:tcMar>
               <w:top w:w="25" w:type="dxa"/>
               <w:bottom w:w="25" w:type="dxa"/>
@@ -6243,6 +6493,7 @@
         <w:tc>
           <w:tcPr>
             <w:tcW w:type="dxa" w:w="5256"/>
+            <w:shd w:fill="F0F6F8"/>
             <w:tcMar>
               <w:top w:w="25" w:type="dxa"/>
               <w:bottom w:w="25" w:type="dxa"/>
@@ -6263,6 +6514,7 @@
         <w:tc>
           <w:tcPr>
             <w:tcW w:type="dxa" w:w="5256"/>
+            <w:shd w:fill="F0F6F8"/>
             <w:tcMar>
               <w:top w:w="25" w:type="dxa"/>
               <w:bottom w:w="25" w:type="dxa"/>
@@ -6285,6 +6537,7 @@
         <w:tc>
           <w:tcPr>
             <w:tcW w:type="dxa" w:w="5256"/>
+            <w:shd w:fill="F0F6F8"/>
             <w:tcMar>
               <w:top w:w="25" w:type="dxa"/>
               <w:bottom w:w="25" w:type="dxa"/>
@@ -6305,6 +6558,7 @@
         <w:tc>
           <w:tcPr>
             <w:tcW w:type="dxa" w:w="5256"/>
+            <w:shd w:fill="F0F6F8"/>
             <w:tcMar>
               <w:top w:w="25" w:type="dxa"/>
               <w:bottom w:w="25" w:type="dxa"/>
@@ -6346,6 +6600,7 @@
         <w:tc>
           <w:tcPr>
             <w:tcW w:type="dxa" w:w="3504"/>
+            <w:shd w:fill="F0F6F8"/>
             <w:tcMar>
               <w:top w:w="25" w:type="dxa"/>
               <w:bottom w:w="25" w:type="dxa"/>
@@ -6366,6 +6621,7 @@
         <w:tc>
           <w:tcPr>
             <w:tcW w:type="dxa" w:w="3504"/>
+            <w:shd w:fill="F0F6F8"/>
             <w:tcMar>
               <w:top w:w="25" w:type="dxa"/>
               <w:bottom w:w="25" w:type="dxa"/>
@@ -6386,6 +6642,7 @@
         <w:tc>
           <w:tcPr>
             <w:tcW w:type="dxa" w:w="3504"/>
+            <w:shd w:fill="F0F6F8"/>
             <w:tcMar>
               <w:top w:w="25" w:type="dxa"/>
               <w:bottom w:w="25" w:type="dxa"/>
@@ -6408,6 +6665,7 @@
         <w:tc>
           <w:tcPr>
             <w:tcW w:type="dxa" w:w="3504"/>
+            <w:shd w:fill="F0F6F8"/>
             <w:tcMar>
               <w:top w:w="25" w:type="dxa"/>
               <w:bottom w:w="25" w:type="dxa"/>
@@ -6428,6 +6686,7 @@
         <w:tc>
           <w:tcPr>
             <w:tcW w:type="dxa" w:w="3504"/>
+            <w:shd w:fill="F0F6F8"/>
             <w:tcMar>
               <w:top w:w="25" w:type="dxa"/>
               <w:bottom w:w="25" w:type="dxa"/>
@@ -6448,6 +6707,7 @@
         <w:tc>
           <w:tcPr>
             <w:tcW w:type="dxa" w:w="3504"/>
+            <w:shd w:fill="F0F6F8"/>
             <w:tcMar>
               <w:top w:w="25" w:type="dxa"/>
               <w:bottom w:w="25" w:type="dxa"/>
@@ -6470,6 +6730,7 @@
         <w:tc>
           <w:tcPr>
             <w:tcW w:type="dxa" w:w="3504"/>
+            <w:shd w:fill="F0F6F8"/>
             <w:tcMar>
               <w:top w:w="25" w:type="dxa"/>
               <w:bottom w:w="25" w:type="dxa"/>
@@ -6490,6 +6751,7 @@
         <w:tc>
           <w:tcPr>
             <w:tcW w:type="dxa" w:w="3504"/>
+            <w:shd w:fill="F0F6F8"/>
             <w:tcMar>
               <w:top w:w="25" w:type="dxa"/>
               <w:bottom w:w="25" w:type="dxa"/>
@@ -6510,6 +6772,7 @@
         <w:tc>
           <w:tcPr>
             <w:tcW w:type="dxa" w:w="3504"/>
+            <w:shd w:fill="F0F6F8"/>
             <w:tcMar>
               <w:top w:w="25" w:type="dxa"/>
               <w:bottom w:w="25" w:type="dxa"/>
@@ -6551,6 +6814,7 @@
         <w:tc>
           <w:tcPr>
             <w:tcW w:type="dxa" w:w="3504"/>
+            <w:shd w:fill="F0F6F8"/>
             <w:tcMar>
               <w:top w:w="25" w:type="dxa"/>
               <w:bottom w:w="25" w:type="dxa"/>
@@ -6571,6 +6835,7 @@
         <w:tc>
           <w:tcPr>
             <w:tcW w:type="dxa" w:w="3504"/>
+            <w:shd w:fill="F0F6F8"/>
             <w:tcMar>
               <w:top w:w="25" w:type="dxa"/>
               <w:bottom w:w="25" w:type="dxa"/>
@@ -6591,6 +6856,7 @@
         <w:tc>
           <w:tcPr>
             <w:tcW w:type="dxa" w:w="3504"/>
+            <w:shd w:fill="F0F6F8"/>
             <w:tcMar>
               <w:top w:w="25" w:type="dxa"/>
               <w:bottom w:w="25" w:type="dxa"/>
@@ -6613,6 +6879,7 @@
         <w:tc>
           <w:tcPr>
             <w:tcW w:type="dxa" w:w="3504"/>
+            <w:shd w:fill="F0F6F8"/>
             <w:tcMar>
               <w:top w:w="25" w:type="dxa"/>
               <w:bottom w:w="25" w:type="dxa"/>
@@ -6633,6 +6900,7 @@
         <w:tc>
           <w:tcPr>
             <w:tcW w:type="dxa" w:w="3504"/>
+            <w:shd w:fill="F0F6F8"/>
             <w:tcMar>
               <w:top w:w="25" w:type="dxa"/>
               <w:bottom w:w="25" w:type="dxa"/>
@@ -6653,6 +6921,7 @@
         <w:tc>
           <w:tcPr>
             <w:tcW w:type="dxa" w:w="3504"/>
+            <w:shd w:fill="F0F6F8"/>
             <w:tcMar>
               <w:top w:w="25" w:type="dxa"/>
               <w:bottom w:w="25" w:type="dxa"/>
@@ -6700,6 +6969,7 @@
         <w:tc>
           <w:tcPr>
             <w:tcW w:type="dxa" w:w="3504"/>
+            <w:shd w:fill="F0F6F8"/>
             <w:tcMar>
               <w:top w:w="25" w:type="dxa"/>
               <w:bottom w:w="25" w:type="dxa"/>
@@ -6720,6 +6990,7 @@
         <w:tc>
           <w:tcPr>
             <w:tcW w:type="dxa" w:w="3504"/>
+            <w:shd w:fill="F0F6F8"/>
             <w:tcMar>
               <w:top w:w="25" w:type="dxa"/>
               <w:bottom w:w="25" w:type="dxa"/>
@@ -6740,6 +7011,7 @@
         <w:tc>
           <w:tcPr>
             <w:tcW w:type="dxa" w:w="3504"/>
+            <w:shd w:fill="F0F6F8"/>
             <w:tcMar>
               <w:top w:w="25" w:type="dxa"/>
               <w:bottom w:w="25" w:type="dxa"/>
@@ -6787,6 +7059,7 @@
         <w:tc>
           <w:tcPr>
             <w:tcW w:type="dxa" w:w="3504"/>
+            <w:shd w:fill="F0F6F8"/>
             <w:tcMar>
               <w:top w:w="25" w:type="dxa"/>
               <w:bottom w:w="25" w:type="dxa"/>
@@ -6807,6 +7080,7 @@
         <w:tc>
           <w:tcPr>
             <w:tcW w:type="dxa" w:w="3504"/>
+            <w:shd w:fill="F0F6F8"/>
             <w:tcMar>
               <w:top w:w="25" w:type="dxa"/>
               <w:bottom w:w="25" w:type="dxa"/>
@@ -6827,6 +7101,7 @@
         <w:tc>
           <w:tcPr>
             <w:tcW w:type="dxa" w:w="3504"/>
+            <w:shd w:fill="F0F6F8"/>
             <w:tcMar>
               <w:top w:w="25" w:type="dxa"/>
               <w:bottom w:w="25" w:type="dxa"/>
@@ -6849,6 +7124,7 @@
         <w:tc>
           <w:tcPr>
             <w:tcW w:type="dxa" w:w="3504"/>
+            <w:shd w:fill="F0F6F8"/>
             <w:tcMar>
               <w:top w:w="25" w:type="dxa"/>
               <w:bottom w:w="25" w:type="dxa"/>
@@ -6869,6 +7145,7 @@
         <w:tc>
           <w:tcPr>
             <w:tcW w:type="dxa" w:w="3504"/>
+            <w:shd w:fill="F0F6F8"/>
             <w:tcMar>
               <w:top w:w="25" w:type="dxa"/>
               <w:bottom w:w="25" w:type="dxa"/>
@@ -6889,6 +7166,7 @@
         <w:tc>
           <w:tcPr>
             <w:tcW w:type="dxa" w:w="3504"/>
+            <w:shd w:fill="F0F6F8"/>
             <w:tcMar>
               <w:top w:w="25" w:type="dxa"/>
               <w:bottom w:w="25" w:type="dxa"/>
@@ -6936,6 +7214,7 @@
         <w:tc>
           <w:tcPr>
             <w:tcW w:type="dxa" w:w="3504"/>
+            <w:shd w:fill="F0F6F8"/>
             <w:tcMar>
               <w:top w:w="25" w:type="dxa"/>
               <w:bottom w:w="25" w:type="dxa"/>
@@ -6956,6 +7235,7 @@
         <w:tc>
           <w:tcPr>
             <w:tcW w:type="dxa" w:w="3504"/>
+            <w:shd w:fill="F0F6F8"/>
             <w:tcMar>
               <w:top w:w="25" w:type="dxa"/>
               <w:bottom w:w="25" w:type="dxa"/>
@@ -6976,6 +7256,7 @@
         <w:tc>
           <w:tcPr>
             <w:tcW w:type="dxa" w:w="3504"/>
+            <w:shd w:fill="F0F6F8"/>
             <w:tcMar>
               <w:top w:w="25" w:type="dxa"/>
               <w:bottom w:w="25" w:type="dxa"/>
@@ -6998,6 +7279,7 @@
         <w:tc>
           <w:tcPr>
             <w:tcW w:type="dxa" w:w="3504"/>
+            <w:shd w:fill="F0F6F8"/>
             <w:tcMar>
               <w:top w:w="25" w:type="dxa"/>
               <w:bottom w:w="25" w:type="dxa"/>
@@ -7018,6 +7300,7 @@
         <w:tc>
           <w:tcPr>
             <w:tcW w:type="dxa" w:w="3504"/>
+            <w:shd w:fill="F0F6F8"/>
             <w:tcMar>
               <w:top w:w="25" w:type="dxa"/>
               <w:bottom w:w="25" w:type="dxa"/>
@@ -7032,6 +7315,7 @@
         <w:tc>
           <w:tcPr>
             <w:tcW w:type="dxa" w:w="3504"/>
+            <w:shd w:fill="F0F6F8"/>
             <w:tcMar>
               <w:top w:w="25" w:type="dxa"/>
               <w:bottom w:w="25" w:type="dxa"/>
@@ -7142,6 +7426,7 @@
         <w:tc>
           <w:tcPr>
             <w:tcW w:type="dxa" w:w="3504"/>
+            <w:shd w:fill="F0F6F8"/>
             <w:tcMar>
               <w:top w:w="25" w:type="dxa"/>
               <w:bottom w:w="25" w:type="dxa"/>
@@ -7162,6 +7447,7 @@
         <w:tc>
           <w:tcPr>
             <w:tcW w:type="dxa" w:w="3504"/>
+            <w:shd w:fill="F0F6F8"/>
             <w:tcMar>
               <w:top w:w="25" w:type="dxa"/>
               <w:bottom w:w="25" w:type="dxa"/>
@@ -7182,6 +7468,7 @@
         <w:tc>
           <w:tcPr>
             <w:tcW w:type="dxa" w:w="3504"/>
+            <w:shd w:fill="F0F6F8"/>
             <w:tcMar>
               <w:top w:w="25" w:type="dxa"/>
               <w:bottom w:w="25" w:type="dxa"/>
@@ -7204,6 +7491,7 @@
         <w:tc>
           <w:tcPr>
             <w:tcW w:type="dxa" w:w="3504"/>
+            <w:shd w:fill="F0F6F8"/>
             <w:tcMar>
               <w:top w:w="25" w:type="dxa"/>
               <w:bottom w:w="25" w:type="dxa"/>
@@ -7224,6 +7512,7 @@
         <w:tc>
           <w:tcPr>
             <w:tcW w:type="dxa" w:w="3504"/>
+            <w:shd w:fill="F0F6F8"/>
             <w:tcMar>
               <w:top w:w="25" w:type="dxa"/>
               <w:bottom w:w="25" w:type="dxa"/>
@@ -7244,6 +7533,7 @@
         <w:tc>
           <w:tcPr>
             <w:tcW w:type="dxa" w:w="3504"/>
+            <w:shd w:fill="F0F6F8"/>
             <w:tcMar>
               <w:top w:w="25" w:type="dxa"/>
               <w:bottom w:w="25" w:type="dxa"/>
@@ -7284,6 +7574,7 @@
         <w:tc>
           <w:tcPr>
             <w:tcW w:type="dxa" w:w="5256"/>
+            <w:shd w:fill="F0F6F8"/>
             <w:tcMar>
               <w:top w:w="25" w:type="dxa"/>
               <w:bottom w:w="25" w:type="dxa"/>
@@ -7304,6 +7595,7 @@
         <w:tc>
           <w:tcPr>
             <w:tcW w:type="dxa" w:w="5256"/>
+            <w:shd w:fill="F0F6F8"/>
             <w:tcMar>
               <w:top w:w="25" w:type="dxa"/>
               <w:bottom w:w="25" w:type="dxa"/>
@@ -7326,6 +7618,7 @@
         <w:tc>
           <w:tcPr>
             <w:tcW w:type="dxa" w:w="5256"/>
+            <w:shd w:fill="F0F6F8"/>
             <w:tcMar>
               <w:top w:w="25" w:type="dxa"/>
               <w:bottom w:w="25" w:type="dxa"/>
@@ -7346,6 +7639,7 @@
         <w:tc>
           <w:tcPr>
             <w:tcW w:type="dxa" w:w="5256"/>
+            <w:shd w:fill="F0F6F8"/>
             <w:tcMar>
               <w:top w:w="25" w:type="dxa"/>
               <w:bottom w:w="25" w:type="dxa"/>
@@ -7368,6 +7662,7 @@
         <w:tc>
           <w:tcPr>
             <w:tcW w:type="dxa" w:w="5256"/>
+            <w:shd w:fill="F0F6F8"/>
             <w:tcMar>
               <w:top w:w="25" w:type="dxa"/>
               <w:bottom w:w="25" w:type="dxa"/>
@@ -7388,6 +7683,7 @@
         <w:tc>
           <w:tcPr>
             <w:tcW w:type="dxa" w:w="5256"/>
+            <w:shd w:fill="F0F6F8"/>
             <w:tcMar>
               <w:top w:w="25" w:type="dxa"/>
               <w:bottom w:w="25" w:type="dxa"/>
@@ -7410,6 +7706,7 @@
         <w:tc>
           <w:tcPr>
             <w:tcW w:type="dxa" w:w="5256"/>
+            <w:shd w:fill="F0F6F8"/>
             <w:tcMar>
               <w:top w:w="25" w:type="dxa"/>
               <w:bottom w:w="25" w:type="dxa"/>
@@ -7430,6 +7727,7 @@
         <w:tc>
           <w:tcPr>
             <w:tcW w:type="dxa" w:w="5256"/>
+            <w:shd w:fill="F0F6F8"/>
             <w:tcMar>
               <w:top w:w="25" w:type="dxa"/>
               <w:bottom w:w="25" w:type="dxa"/>
@@ -7452,6 +7750,7 @@
         <w:tc>
           <w:tcPr>
             <w:tcW w:type="dxa" w:w="5256"/>
+            <w:shd w:fill="F0F6F8"/>
             <w:tcMar>
               <w:top w:w="25" w:type="dxa"/>
               <w:bottom w:w="25" w:type="dxa"/>
@@ -7472,6 +7771,7 @@
         <w:tc>
           <w:tcPr>
             <w:tcW w:type="dxa" w:w="5256"/>
+            <w:shd w:fill="F0F6F8"/>
             <w:tcMar>
               <w:top w:w="25" w:type="dxa"/>
               <w:bottom w:w="25" w:type="dxa"/>
@@ -7494,6 +7794,7 @@
         <w:tc>
           <w:tcPr>
             <w:tcW w:type="dxa" w:w="5256"/>
+            <w:shd w:fill="F0F6F8"/>
             <w:tcMar>
               <w:top w:w="25" w:type="dxa"/>
               <w:bottom w:w="25" w:type="dxa"/>
@@ -7514,6 +7815,7 @@
         <w:tc>
           <w:tcPr>
             <w:tcW w:type="dxa" w:w="5256"/>
+            <w:shd w:fill="F0F6F8"/>
             <w:tcMar>
               <w:top w:w="25" w:type="dxa"/>
               <w:bottom w:w="25" w:type="dxa"/>
@@ -7561,6 +7863,7 @@
         <w:tc>
           <w:tcPr>
             <w:tcW w:type="dxa" w:w="3504"/>
+            <w:shd w:fill="F0F6F8"/>
             <w:tcMar>
               <w:top w:w="25" w:type="dxa"/>
               <w:bottom w:w="25" w:type="dxa"/>
@@ -7581,6 +7884,7 @@
         <w:tc>
           <w:tcPr>
             <w:tcW w:type="dxa" w:w="3504"/>
+            <w:shd w:fill="F0F6F8"/>
             <w:tcMar>
               <w:top w:w="25" w:type="dxa"/>
               <w:bottom w:w="25" w:type="dxa"/>
@@ -7601,6 +7905,7 @@
         <w:tc>
           <w:tcPr>
             <w:tcW w:type="dxa" w:w="3504"/>
+            <w:shd w:fill="F0F6F8"/>
             <w:tcMar>
               <w:top w:w="25" w:type="dxa"/>
               <w:bottom w:w="25" w:type="dxa"/>
@@ -7623,6 +7928,7 @@
         <w:tc>
           <w:tcPr>
             <w:tcW w:type="dxa" w:w="3504"/>
+            <w:shd w:fill="F0F6F8"/>
             <w:tcMar>
               <w:top w:w="25" w:type="dxa"/>
               <w:bottom w:w="25" w:type="dxa"/>
@@ -7643,6 +7949,7 @@
         <w:tc>
           <w:tcPr>
             <w:tcW w:type="dxa" w:w="3504"/>
+            <w:shd w:fill="F0F6F8"/>
             <w:tcMar>
               <w:top w:w="25" w:type="dxa"/>
               <w:bottom w:w="25" w:type="dxa"/>
@@ -7663,6 +7970,7 @@
         <w:tc>
           <w:tcPr>
             <w:tcW w:type="dxa" w:w="3504"/>
+            <w:shd w:fill="F0F6F8"/>
             <w:tcMar>
               <w:top w:w="25" w:type="dxa"/>
               <w:bottom w:w="25" w:type="dxa"/>
@@ -7685,6 +7993,7 @@
         <w:tc>
           <w:tcPr>
             <w:tcW w:type="dxa" w:w="3504"/>
+            <w:shd w:fill="F0F6F8"/>
             <w:tcMar>
               <w:top w:w="25" w:type="dxa"/>
               <w:bottom w:w="25" w:type="dxa"/>
@@ -7705,6 +8014,7 @@
         <w:tc>
           <w:tcPr>
             <w:tcW w:type="dxa" w:w="3504"/>
+            <w:shd w:fill="F0F6F8"/>
             <w:tcMar>
               <w:top w:w="25" w:type="dxa"/>
               <w:bottom w:w="25" w:type="dxa"/>
@@ -7725,6 +8035,7 @@
         <w:tc>
           <w:tcPr>
             <w:tcW w:type="dxa" w:w="3504"/>
+            <w:shd w:fill="F0F6F8"/>
             <w:tcMar>
               <w:top w:w="25" w:type="dxa"/>
               <w:bottom w:w="25" w:type="dxa"/>
@@ -7747,6 +8058,7 @@
         <w:tc>
           <w:tcPr>
             <w:tcW w:type="dxa" w:w="3504"/>
+            <w:shd w:fill="F0F6F8"/>
             <w:tcMar>
               <w:top w:w="25" w:type="dxa"/>
               <w:bottom w:w="25" w:type="dxa"/>
@@ -7767,6 +8079,7 @@
         <w:tc>
           <w:tcPr>
             <w:tcW w:type="dxa" w:w="3504"/>
+            <w:shd w:fill="F0F6F8"/>
             <w:tcMar>
               <w:top w:w="25" w:type="dxa"/>
               <w:bottom w:w="25" w:type="dxa"/>
@@ -7781,6 +8094,7 @@
         <w:tc>
           <w:tcPr>
             <w:tcW w:type="dxa" w:w="3504"/>
+            <w:shd w:fill="F0F6F8"/>
             <w:tcMar>
               <w:top w:w="25" w:type="dxa"/>
               <w:bottom w:w="25" w:type="dxa"/>
@@ -7822,6 +8136,7 @@
         <w:tc>
           <w:tcPr>
             <w:tcW w:type="dxa" w:w="3504"/>
+            <w:shd w:fill="F0F6F8"/>
             <w:tcMar>
               <w:top w:w="25" w:type="dxa"/>
               <w:bottom w:w="25" w:type="dxa"/>
@@ -7842,6 +8157,7 @@
         <w:tc>
           <w:tcPr>
             <w:tcW w:type="dxa" w:w="3504"/>
+            <w:shd w:fill="F0F6F8"/>
             <w:tcMar>
               <w:top w:w="25" w:type="dxa"/>
               <w:bottom w:w="25" w:type="dxa"/>
@@ -7862,6 +8178,7 @@
         <w:tc>
           <w:tcPr>
             <w:tcW w:type="dxa" w:w="3504"/>
+            <w:shd w:fill="F0F6F8"/>
             <w:tcMar>
               <w:top w:w="25" w:type="dxa"/>
               <w:bottom w:w="25" w:type="dxa"/>
@@ -7884,6 +8201,7 @@
         <w:tc>
           <w:tcPr>
             <w:tcW w:type="dxa" w:w="3504"/>
+            <w:shd w:fill="F0F6F8"/>
             <w:tcMar>
               <w:top w:w="25" w:type="dxa"/>
               <w:bottom w:w="25" w:type="dxa"/>
@@ -7904,6 +8222,7 @@
         <w:tc>
           <w:tcPr>
             <w:tcW w:type="dxa" w:w="3504"/>
+            <w:shd w:fill="F0F6F8"/>
             <w:tcMar>
               <w:top w:w="25" w:type="dxa"/>
               <w:bottom w:w="25" w:type="dxa"/>
@@ -7918,6 +8237,7 @@
         <w:tc>
           <w:tcPr>
             <w:tcW w:type="dxa" w:w="3504"/>
+            <w:shd w:fill="F0F6F8"/>
             <w:tcMar>
               <w:top w:w="25" w:type="dxa"/>
               <w:bottom w:w="25" w:type="dxa"/>
@@ -7958,6 +8278,7 @@
         <w:tc>
           <w:tcPr>
             <w:tcW w:type="dxa" w:w="5256"/>
+            <w:shd w:fill="F0F6F8"/>
             <w:tcMar>
               <w:top w:w="25" w:type="dxa"/>
               <w:bottom w:w="25" w:type="dxa"/>
@@ -7978,6 +8299,7 @@
         <w:tc>
           <w:tcPr>
             <w:tcW w:type="dxa" w:w="5256"/>
+            <w:shd w:fill="F0F6F8"/>
             <w:tcMar>
               <w:top w:w="25" w:type="dxa"/>
               <w:bottom w:w="25" w:type="dxa"/>
@@ -8000,6 +8322,7 @@
         <w:tc>
           <w:tcPr>
             <w:tcW w:type="dxa" w:w="5256"/>
+            <w:shd w:fill="F0F6F8"/>
             <w:tcMar>
               <w:top w:w="25" w:type="dxa"/>
               <w:bottom w:w="25" w:type="dxa"/>
@@ -8020,6 +8343,7 @@
         <w:tc>
           <w:tcPr>
             <w:tcW w:type="dxa" w:w="5256"/>
+            <w:shd w:fill="F0F6F8"/>
             <w:tcMar>
               <w:top w:w="25" w:type="dxa"/>
               <w:bottom w:w="25" w:type="dxa"/>
@@ -8042,6 +8366,7 @@
         <w:tc>
           <w:tcPr>
             <w:tcW w:type="dxa" w:w="5256"/>
+            <w:shd w:fill="F0F6F8"/>
             <w:tcMar>
               <w:top w:w="25" w:type="dxa"/>
               <w:bottom w:w="25" w:type="dxa"/>
@@ -8062,6 +8387,7 @@
         <w:tc>
           <w:tcPr>
             <w:tcW w:type="dxa" w:w="5256"/>
+            <w:shd w:fill="F0F6F8"/>
             <w:tcMar>
               <w:top w:w="25" w:type="dxa"/>
               <w:bottom w:w="25" w:type="dxa"/>
@@ -8084,6 +8410,7 @@
         <w:tc>
           <w:tcPr>
             <w:tcW w:type="dxa" w:w="5256"/>
+            <w:shd w:fill="F0F6F8"/>
             <w:tcMar>
               <w:top w:w="25" w:type="dxa"/>
               <w:bottom w:w="25" w:type="dxa"/>
@@ -8104,6 +8431,7 @@
         <w:tc>
           <w:tcPr>
             <w:tcW w:type="dxa" w:w="5256"/>
+            <w:shd w:fill="F0F6F8"/>
             <w:tcMar>
               <w:top w:w="25" w:type="dxa"/>
               <w:bottom w:w="25" w:type="dxa"/>
@@ -8126,6 +8454,7 @@
         <w:tc>
           <w:tcPr>
             <w:tcW w:type="dxa" w:w="5256"/>
+            <w:shd w:fill="F0F6F8"/>
             <w:tcMar>
               <w:top w:w="25" w:type="dxa"/>
               <w:bottom w:w="25" w:type="dxa"/>
@@ -8146,6 +8475,7 @@
         <w:tc>
           <w:tcPr>
             <w:tcW w:type="dxa" w:w="5256"/>
+            <w:shd w:fill="F0F6F8"/>
             <w:tcMar>
               <w:top w:w="25" w:type="dxa"/>
               <w:bottom w:w="25" w:type="dxa"/>
@@ -8168,6 +8498,7 @@
         <w:tc>
           <w:tcPr>
             <w:tcW w:type="dxa" w:w="5256"/>
+            <w:shd w:fill="F0F6F8"/>
             <w:tcMar>
               <w:top w:w="25" w:type="dxa"/>
               <w:bottom w:w="25" w:type="dxa"/>
@@ -8188,6 +8519,7 @@
         <w:tc>
           <w:tcPr>
             <w:tcW w:type="dxa" w:w="5256"/>
+            <w:shd w:fill="F0F6F8"/>
             <w:tcMar>
               <w:top w:w="25" w:type="dxa"/>
               <w:bottom w:w="25" w:type="dxa"/>
@@ -8210,6 +8542,7 @@
         <w:tc>
           <w:tcPr>
             <w:tcW w:type="dxa" w:w="5256"/>
+            <w:shd w:fill="F0F6F8"/>
             <w:tcMar>
               <w:top w:w="25" w:type="dxa"/>
               <w:bottom w:w="25" w:type="dxa"/>
@@ -8230,6 +8563,7 @@
         <w:tc>
           <w:tcPr>
             <w:tcW w:type="dxa" w:w="5256"/>
+            <w:shd w:fill="F0F6F8"/>
             <w:tcMar>
               <w:top w:w="25" w:type="dxa"/>
               <w:bottom w:w="25" w:type="dxa"/>
@@ -8287,6 +8621,7 @@
         <w:tc>
           <w:tcPr>
             <w:tcW w:type="dxa" w:w="5256"/>
+            <w:shd w:fill="F0F6F8"/>
             <w:tcMar>
               <w:top w:w="25" w:type="dxa"/>
               <w:bottom w:w="25" w:type="dxa"/>
@@ -8307,6 +8642,7 @@
         <w:tc>
           <w:tcPr>
             <w:tcW w:type="dxa" w:w="5256"/>
+            <w:shd w:fill="F0F6F8"/>
             <w:tcMar>
               <w:top w:w="25" w:type="dxa"/>
               <w:bottom w:w="25" w:type="dxa"/>
@@ -8329,6 +8665,7 @@
         <w:tc>
           <w:tcPr>
             <w:tcW w:type="dxa" w:w="5256"/>
+            <w:shd w:fill="F0F6F8"/>
             <w:tcMar>
               <w:top w:w="25" w:type="dxa"/>
               <w:bottom w:w="25" w:type="dxa"/>
@@ -8349,6 +8686,7 @@
         <w:tc>
           <w:tcPr>
             <w:tcW w:type="dxa" w:w="5256"/>
+            <w:shd w:fill="F0F6F8"/>
             <w:tcMar>
               <w:top w:w="25" w:type="dxa"/>
               <w:bottom w:w="25" w:type="dxa"/>
@@ -8371,6 +8709,7 @@
         <w:tc>
           <w:tcPr>
             <w:tcW w:type="dxa" w:w="5256"/>
+            <w:shd w:fill="F0F6F8"/>
             <w:tcMar>
               <w:top w:w="25" w:type="dxa"/>
               <w:bottom w:w="25" w:type="dxa"/>
@@ -8391,6 +8730,7 @@
         <w:tc>
           <w:tcPr>
             <w:tcW w:type="dxa" w:w="5256"/>
+            <w:shd w:fill="F0F6F8"/>
             <w:tcMar>
               <w:top w:w="25" w:type="dxa"/>
               <w:bottom w:w="25" w:type="dxa"/>
@@ -8432,6 +8772,7 @@
         <w:tc>
           <w:tcPr>
             <w:tcW w:type="dxa" w:w="3504"/>
+            <w:shd w:fill="F0F6F8"/>
             <w:tcMar>
               <w:top w:w="25" w:type="dxa"/>
               <w:bottom w:w="25" w:type="dxa"/>
@@ -8452,6 +8793,7 @@
         <w:tc>
           <w:tcPr>
             <w:tcW w:type="dxa" w:w="3504"/>
+            <w:shd w:fill="F0F6F8"/>
             <w:tcMar>
               <w:top w:w="25" w:type="dxa"/>
               <w:bottom w:w="25" w:type="dxa"/>
@@ -8472,6 +8814,7 @@
         <w:tc>
           <w:tcPr>
             <w:tcW w:type="dxa" w:w="3504"/>
+            <w:shd w:fill="F0F6F8"/>
             <w:tcMar>
               <w:top w:w="25" w:type="dxa"/>
               <w:bottom w:w="25" w:type="dxa"/>
@@ -8494,6 +8837,7 @@
         <w:tc>
           <w:tcPr>
             <w:tcW w:type="dxa" w:w="3504"/>
+            <w:shd w:fill="F0F6F8"/>
             <w:tcMar>
               <w:top w:w="25" w:type="dxa"/>
               <w:bottom w:w="25" w:type="dxa"/>
@@ -8514,6 +8858,7 @@
         <w:tc>
           <w:tcPr>
             <w:tcW w:type="dxa" w:w="3504"/>
+            <w:shd w:fill="F0F6F8"/>
             <w:tcMar>
               <w:top w:w="25" w:type="dxa"/>
               <w:bottom w:w="25" w:type="dxa"/>
@@ -8534,6 +8879,7 @@
         <w:tc>
           <w:tcPr>
             <w:tcW w:type="dxa" w:w="3504"/>
+            <w:shd w:fill="F0F6F8"/>
             <w:tcMar>
               <w:top w:w="25" w:type="dxa"/>
               <w:bottom w:w="25" w:type="dxa"/>
@@ -8556,6 +8902,7 @@
         <w:tc>
           <w:tcPr>
             <w:tcW w:type="dxa" w:w="3504"/>
+            <w:shd w:fill="F0F6F8"/>
             <w:tcMar>
               <w:top w:w="25" w:type="dxa"/>
               <w:bottom w:w="25" w:type="dxa"/>
@@ -8576,6 +8923,7 @@
         <w:tc>
           <w:tcPr>
             <w:tcW w:type="dxa" w:w="3504"/>
+            <w:shd w:fill="F0F6F8"/>
             <w:tcMar>
               <w:top w:w="25" w:type="dxa"/>
               <w:bottom w:w="25" w:type="dxa"/>
@@ -8590,6 +8938,7 @@
         <w:tc>
           <w:tcPr>
             <w:tcW w:type="dxa" w:w="3504"/>
+            <w:shd w:fill="F0F6F8"/>
             <w:tcMar>
               <w:top w:w="25" w:type="dxa"/>
               <w:bottom w:w="25" w:type="dxa"/>
@@ -9003,7 +9352,7 @@
       <w:footerReference w:type="default" r:id="rId9"/>
       <w:headerReference w:type="default" r:id="rId10"/>
       <w:pgSz w:w="12240" w:h="15840"/>
-      <w:pgMar w:top="648" w:right="864" w:bottom="648" w:left="864" w:header="216" w:footer="216" w:gutter="0"/>
+      <w:pgMar w:top="1440" w:right="864" w:bottom="648" w:left="864" w:header="144" w:footer="216" w:gutter="0"/>
       <w:cols w:space="720"/>
       <w:docGrid w:linePitch="360"/>
     </w:sectPr>
@@ -9029,53 +9378,82 @@
   <w:p>
     <w:pPr>
       <w:pStyle w:val="Header"/>
+      <w:spacing w:after="0" w:before="0" w:line="20" w:lineRule="exact"/>
     </w:pPr>
-    <w:r>
-      <w:t>KIMBIRI  |  ENCUESTA URBANA Y RURAL  |  CUI 2627896</w:t>
-    </w:r>
-    <w:r>
-      <w:drawing>
-        <wp:anchor distT="0" distB="0" distL="0" distR="0" simplePos="0" relativeHeight="0" behindDoc="1" locked="0" layoutInCell="1" allowOverlap="1">
-          <wp:simplePos x="0" y="0"/>
-          <wp:positionH relativeFrom="page">
-            <wp:align>center</wp:align>
-          </wp:positionH>
-          <wp:positionV relativeFrom="page">
-            <wp:align>center</wp:align>
-          </wp:positionV>
-          <wp:extent cx="5907024" cy="3609848"/>
-          <wp:wrapNone/>
-          <wp:docPr id="1" name="Picture 1"/>
-          <wp:cNvGraphicFramePr xmlns:a="http://schemas.openxmlformats.org/drawingml/2006/main">
-            <a:graphicFrameLocks noChangeAspect="1"/>
-          </wp:cNvGraphicFramePr>
-          <a:graphic xmlns:a="http://schemas.openxmlformats.org/drawingml/2006/main" xmlns:pic="http://schemas.openxmlformats.org/drawingml/2006/picture">
-            <a:graphicData uri="http://schemas.openxmlformats.org/drawingml/2006/picture">
-              <pic:pic>
-                <pic:nvPicPr>
-                  <pic:cNvPr id="0" name="Marca_agua_Yanet.png"/>
-                  <pic:cNvPicPr/>
-                </pic:nvPicPr>
-                <pic:blipFill>
-                  <a:blip r:embed="rId1"/>
-                  <a:stretch>
-                    <a:fillRect/>
-                  </a:stretch>
-                </pic:blipFill>
-                <pic:spPr>
-                  <a:xfrm>
-                    <a:off x="0" y="0"/>
-                    <a:ext cx="5907024" cy="3609848"/>
-                  </a:xfrm>
-                  <a:prstGeom prst="rect"/>
-                </pic:spPr>
-              </pic:pic>
-            </a:graphicData>
-          </a:graphic>
-        </wp:anchor>
-      </w:drawing>
-    </w:r>
   </w:p>
+  <w:tbl>
+    <w:tblPr>
+      <w:tblW w:type="auto" w:w="0"/>
+      <w:tblLook w:firstColumn="1" w:firstRow="1" w:lastColumn="0" w:lastRow="0" w:noHBand="0" w:noVBand="1" w:val="04A0"/>
+    </w:tblPr>
+    <w:tblGrid>
+      <w:gridCol w:w="6768"/>
+      <w:gridCol w:w="3312"/>
+    </w:tblGrid>
+    <w:tr>
+      <w:tc>
+        <w:tcPr>
+          <w:tcW w:type="dxa" w:w="5040"/>
+        </w:tcPr>
+        <w:p>
+          <w:r>
+            <w:rPr>
+              <w:b/>
+              <w:sz w:val="16"/>
+            </w:rPr>
+            <w:t>KIMBIRI · CUI 2627896</w:t>
+            <w:br/>
+            <w:t>ENCUESTA URBANA Y RURAL</w:t>
+          </w:r>
+        </w:p>
+      </w:tc>
+      <w:tc>
+        <w:tcPr>
+          <w:tcW w:type="dxa" w:w="5040"/>
+        </w:tcPr>
+        <w:p>
+          <w:pPr>
+            <w:spacing w:after="0" w:before="0"/>
+            <w:jc w:val="right"/>
+          </w:pPr>
+          <w:r>
+            <w:drawing>
+              <wp:inline xmlns:a="http://schemas.openxmlformats.org/drawingml/2006/main" xmlns:pic="http://schemas.openxmlformats.org/drawingml/2006/picture">
+                <wp:extent cx="1920240" cy="713205"/>
+                <wp:docPr id="1" name="Picture 1"/>
+                <wp:cNvGraphicFramePr>
+                  <a:graphicFrameLocks noChangeAspect="1"/>
+                </wp:cNvGraphicFramePr>
+                <a:graphic>
+                  <a:graphicData uri="http://schemas.openxmlformats.org/drawingml/2006/picture">
+                    <pic:pic>
+                      <pic:nvPicPr>
+                        <pic:cNvPr id="0" name="Logo_Yanet_Borda.png"/>
+                        <pic:cNvPicPr/>
+                      </pic:nvPicPr>
+                      <pic:blipFill>
+                        <a:blip r:embed="rId1"/>
+                        <a:stretch>
+                          <a:fillRect/>
+                        </a:stretch>
+                      </pic:blipFill>
+                      <pic:spPr>
+                        <a:xfrm>
+                          <a:off x="0" y="0"/>
+                          <a:ext cx="1920240" cy="713205"/>
+                        </a:xfrm>
+                        <a:prstGeom prst="rect"/>
+                      </pic:spPr>
+                    </pic:pic>
+                  </a:graphicData>
+                </a:graphic>
+              </wp:inline>
+            </w:drawing>
+          </w:r>
+        </w:p>
+      </w:tc>
+    </w:tr>
+  </w:tbl>
 </w:hdr>
 </file>
 

</xml_diff>